<commit_message>
docs(lab2): expand architecture deliverables
</commit_message>
<xml_diff>
--- a/实验二_软件架构设计与微服务拆分/D2-1_质量属性场景与效用树.docx
+++ b/实验二_软件架构设计与微服务拆分/D2-1_质量属性场景与效用树.docx
@@ -4,7 +4,7 @@
   <w:body>
     <w:p>
       <w:pPr>
-        <w:spacing w:before="800" w:after="160"/>
+        <w:spacing w:before="800" w:after="80" w:line="276" w:lineRule="auto"/>
         <w:jc w:val="center"/>
       </w:pPr>
       <w:r>
@@ -19,7 +19,7 @@
     </w:p>
     <w:p>
       <w:pPr>
-        <w:spacing w:after="80"/>
+        <w:spacing w:after="80" w:line="276" w:lineRule="auto"/>
         <w:jc w:val="center"/>
       </w:pPr>
       <w:r>
@@ -34,7 +34,7 @@
     </w:p>
     <w:p>
       <w:pPr>
-        <w:spacing w:after="80"/>
+        <w:spacing w:after="80" w:line="276" w:lineRule="auto"/>
         <w:jc w:val="center"/>
       </w:pPr>
       <w:r>
@@ -49,7 +49,7 @@
     </w:p>
     <w:p>
       <w:pPr>
-        <w:spacing w:after="80"/>
+        <w:spacing w:after="80" w:line="276" w:lineRule="auto"/>
         <w:jc w:val="center"/>
       </w:pPr>
       <w:r>
@@ -64,7 +64,7 @@
     </w:p>
     <w:p>
       <w:pPr>
-        <w:spacing w:after="160"/>
+        <w:spacing w:after="80" w:line="276" w:lineRule="auto"/>
         <w:jc w:val="center"/>
       </w:pPr>
       <w:r>
@@ -77,7 +77,11 @@
         <w:t>—— 案例：NekoCafé 猫咪主题餐饮预约平台 ——</w:t>
       </w:r>
     </w:p>
-    <w:p/>
+    <w:p>
+      <w:pPr>
+        <w:spacing w:after="80" w:line="276" w:lineRule="auto"/>
+      </w:pPr>
+    </w:p>
     <w:tbl>
       <w:tblPr>
         <w:tblW w:type="auto" w:w="0"/>
@@ -92,7 +96,7 @@
         <w:tc>
           <w:tcPr>
             <w:tcW w:type="dxa" w:w="1984"/>
-            <w:shd w:val="clear" w:color="auto" w:fill="EAF4EC"/>
+            <w:shd w:val="clear" w:color="auto" w:fill="F3FAF6"/>
             <w:tcBorders>
               <w:top w:val="single" w:sz="4" w:space="0" w:color="B8D8C2"/>
               <w:left w:val="single" w:sz="4" w:space="0" w:color="B8D8C2"/>
@@ -103,7 +107,7 @@
           </w:tcPr>
           <w:p>
             <w:pPr>
-              <w:spacing w:after="40"/>
+              <w:spacing w:after="40" w:line="269" w:lineRule="auto"/>
               <w:jc w:val="center"/>
             </w:pPr>
             <w:r>
@@ -120,7 +124,7 @@
         <w:tc>
           <w:tcPr>
             <w:tcW w:type="dxa" w:w="7087"/>
-            <w:shd w:val="clear" w:color="auto" w:fill="FFFFFF"/>
+            <w:shd w:val="clear" w:color="auto" w:fill="EAF6EF"/>
             <w:tcBorders>
               <w:top w:val="single" w:sz="4" w:space="0" w:color="D0D7D0"/>
               <w:left w:val="single" w:sz="4" w:space="0" w:color="D0D7D0"/>
@@ -131,12 +135,12 @@
           </w:tcPr>
           <w:p>
             <w:pPr>
-              <w:spacing w:after="40"/>
+              <w:spacing w:after="40" w:line="269" w:lineRule="auto"/>
             </w:pPr>
             <w:r>
               <w:rPr>
                 <w:rFonts w:ascii="Microsoft YaHei" w:hAnsi="Microsoft YaHei" w:eastAsia="Microsoft YaHei"/>
-                <w:b w:val="0"/>
+                <w:b/>
                 <w:color w:val="2B2B2B"/>
                 <w:sz w:val="21"/>
               </w:rPr>
@@ -149,7 +153,7 @@
         <w:tc>
           <w:tcPr>
             <w:tcW w:type="dxa" w:w="1984"/>
-            <w:shd w:val="clear" w:color="auto" w:fill="EAF4EC"/>
+            <w:shd w:val="clear" w:color="auto" w:fill="F3FAF6"/>
             <w:tcBorders>
               <w:top w:val="single" w:sz="4" w:space="0" w:color="B8D8C2"/>
               <w:left w:val="single" w:sz="4" w:space="0" w:color="B8D8C2"/>
@@ -160,7 +164,7 @@
           </w:tcPr>
           <w:p>
             <w:pPr>
-              <w:spacing w:after="40"/>
+              <w:spacing w:after="40" w:line="269" w:lineRule="auto"/>
               <w:jc w:val="center"/>
             </w:pPr>
             <w:r>
@@ -188,7 +192,7 @@
           </w:tcPr>
           <w:p>
             <w:pPr>
-              <w:spacing w:after="40"/>
+              <w:spacing w:after="40" w:line="269" w:lineRule="auto"/>
             </w:pPr>
             <w:r>
               <w:rPr>
@@ -206,7 +210,7 @@
         <w:tc>
           <w:tcPr>
             <w:tcW w:type="dxa" w:w="1984"/>
-            <w:shd w:val="clear" w:color="auto" w:fill="EAF4EC"/>
+            <w:shd w:val="clear" w:color="auto" w:fill="F3FAF6"/>
             <w:tcBorders>
               <w:top w:val="single" w:sz="4" w:space="0" w:color="B8D8C2"/>
               <w:left w:val="single" w:sz="4" w:space="0" w:color="B8D8C2"/>
@@ -217,7 +221,7 @@
           </w:tcPr>
           <w:p>
             <w:pPr>
-              <w:spacing w:after="40"/>
+              <w:spacing w:after="40" w:line="269" w:lineRule="auto"/>
               <w:jc w:val="center"/>
             </w:pPr>
             <w:r>
@@ -245,7 +249,7 @@
           </w:tcPr>
           <w:p>
             <w:pPr>
-              <w:spacing w:after="40"/>
+              <w:spacing w:after="40" w:line="269" w:lineRule="auto"/>
             </w:pPr>
             <w:r>
               <w:rPr>
@@ -263,7 +267,7 @@
         <w:tc>
           <w:tcPr>
             <w:tcW w:type="dxa" w:w="1984"/>
-            <w:shd w:val="clear" w:color="auto" w:fill="EAF4EC"/>
+            <w:shd w:val="clear" w:color="auto" w:fill="F3FAF6"/>
             <w:tcBorders>
               <w:top w:val="single" w:sz="4" w:space="0" w:color="B8D8C2"/>
               <w:left w:val="single" w:sz="4" w:space="0" w:color="B8D8C2"/>
@@ -274,7 +278,7 @@
           </w:tcPr>
           <w:p>
             <w:pPr>
-              <w:spacing w:after="40"/>
+              <w:spacing w:after="40" w:line="269" w:lineRule="auto"/>
               <w:jc w:val="center"/>
             </w:pPr>
             <w:r>
@@ -302,7 +306,7 @@
           </w:tcPr>
           <w:p>
             <w:pPr>
-              <w:spacing w:after="40"/>
+              <w:spacing w:after="40" w:line="269" w:lineRule="auto"/>
             </w:pPr>
             <w:r>
               <w:rPr>
@@ -320,7 +324,7 @@
         <w:tc>
           <w:tcPr>
             <w:tcW w:type="dxa" w:w="1984"/>
-            <w:shd w:val="clear" w:color="auto" w:fill="EAF4EC"/>
+            <w:shd w:val="clear" w:color="auto" w:fill="F3FAF6"/>
             <w:tcBorders>
               <w:top w:val="single" w:sz="4" w:space="0" w:color="B8D8C2"/>
               <w:left w:val="single" w:sz="4" w:space="0" w:color="B8D8C2"/>
@@ -331,7 +335,7 @@
           </w:tcPr>
           <w:p>
             <w:pPr>
-              <w:spacing w:after="40"/>
+              <w:spacing w:after="40" w:line="269" w:lineRule="auto"/>
               <w:jc w:val="center"/>
             </w:pPr>
             <w:r>
@@ -359,7 +363,7 @@
           </w:tcPr>
           <w:p>
             <w:pPr>
-              <w:spacing w:after="40"/>
+              <w:spacing w:after="40" w:line="269" w:lineRule="auto"/>
             </w:pPr>
             <w:r>
               <w:rPr>
@@ -377,7 +381,7 @@
         <w:tc>
           <w:tcPr>
             <w:tcW w:type="dxa" w:w="1984"/>
-            <w:shd w:val="clear" w:color="auto" w:fill="EAF4EC"/>
+            <w:shd w:val="clear" w:color="auto" w:fill="F3FAF6"/>
             <w:tcBorders>
               <w:top w:val="single" w:sz="4" w:space="0" w:color="B8D8C2"/>
               <w:left w:val="single" w:sz="4" w:space="0" w:color="B8D8C2"/>
@@ -388,7 +392,7 @@
           </w:tcPr>
           <w:p>
             <w:pPr>
-              <w:spacing w:after="40"/>
+              <w:spacing w:after="40" w:line="269" w:lineRule="auto"/>
               <w:jc w:val="center"/>
             </w:pPr>
             <w:r>
@@ -415,7 +419,14 @@
             <w:vAlign w:val="center"/>
           </w:tcPr>
           <w:p>
+            <w:pPr>
+              <w:spacing w:line="269" w:lineRule="auto" w:after="40"/>
+            </w:pPr>
             <w:r>
+              <w:rPr>
+                <w:rFonts w:ascii="Microsoft YaHei" w:hAnsi="Microsoft YaHei" w:eastAsia="Microsoft YaHei"/>
+                <w:sz w:val="18"/>
+              </w:rPr>
               <w:t>计算机23-2 / 231002703 / 戴正宇</w:t>
             </w:r>
           </w:p>
@@ -425,7 +436,7 @@
         <w:tc>
           <w:tcPr>
             <w:tcW w:type="dxa" w:w="1984"/>
-            <w:shd w:val="clear" w:color="auto" w:fill="EAF4EC"/>
+            <w:shd w:val="clear" w:color="auto" w:fill="F3FAF6"/>
             <w:tcBorders>
               <w:top w:val="single" w:sz="4" w:space="0" w:color="B8D8C2"/>
               <w:left w:val="single" w:sz="4" w:space="0" w:color="B8D8C2"/>
@@ -436,7 +447,7 @@
           </w:tcPr>
           <w:p>
             <w:pPr>
-              <w:spacing w:after="40"/>
+              <w:spacing w:after="40" w:line="269" w:lineRule="auto"/>
               <w:jc w:val="center"/>
             </w:pPr>
             <w:r>
@@ -463,23 +474,41 @@
             <w:vAlign w:val="center"/>
           </w:tcPr>
           <w:p>
+            <w:pPr>
+              <w:spacing w:line="269" w:lineRule="auto" w:after="40"/>
+            </w:pPr>
             <w:r>
+              <w:rPr>
+                <w:rFonts w:ascii="Microsoft YaHei" w:hAnsi="Microsoft YaHei" w:eastAsia="Microsoft YaHei"/>
+                <w:sz w:val="18"/>
+              </w:rPr>
               <w:t>2026-05-14</w:t>
             </w:r>
           </w:p>
         </w:tc>
       </w:tr>
     </w:tbl>
-    <w:p/>
     <w:p>
+      <w:pPr>
+        <w:spacing w:after="80" w:line="276" w:lineRule="auto"/>
+      </w:pPr>
+    </w:p>
+    <w:p>
+      <w:pPr>
+        <w:spacing w:after="80" w:line="276" w:lineRule="auto"/>
+      </w:pPr>
       <w:r>
+        <w:rPr>
+          <w:rFonts w:ascii="Microsoft YaHei" w:hAnsi="Microsoft YaHei" w:eastAsia="Microsoft YaHei"/>
+          <w:sz w:val="21"/>
+        </w:rPr>
         <w:br w:type="page"/>
       </w:r>
     </w:p>
     <w:p>
       <w:pPr>
         <w:keepNext/>
-        <w:spacing w:before="280" w:after="120"/>
+        <w:spacing w:before="280" w:after="80" w:line="276" w:lineRule="auto"/>
         <w:pBdr>
           <w:bottom w:val="single" w:sz="8" w:space="4" w:color="1A7A3D"/>
         </w:pBdr>
@@ -488,7 +517,6 @@
         <w:rPr>
           <w:rFonts w:ascii="Microsoft YaHei" w:hAnsi="Microsoft YaHei" w:eastAsia="Microsoft YaHei"/>
           <w:b/>
-          <w:color w:val="1A7A3D"/>
           <w:sz w:val="36"/>
         </w:rPr>
         <w:t>使用说明</w:t>
@@ -496,7 +524,7 @@
     </w:p>
     <w:p>
       <w:pPr>
-        <w:spacing w:after="80" w:before="0" w:line="336" w:lineRule="auto"/>
+        <w:spacing w:after="80" w:before="0" w:line="276" w:lineRule="auto"/>
         <w:ind w:firstLine="340"/>
         <w:jc w:val="left"/>
       </w:pPr>
@@ -533,7 +561,7 @@
           </w:tcPr>
           <w:p>
             <w:pPr>
-              <w:spacing w:after="40"/>
+              <w:spacing w:after="40" w:line="269" w:lineRule="auto"/>
             </w:pPr>
             <w:r>
               <w:rPr>
@@ -547,7 +575,7 @@
           </w:p>
           <w:p>
             <w:pPr>
-              <w:spacing w:after="40" w:line="336" w:lineRule="auto"/>
+              <w:spacing w:after="40" w:line="269" w:lineRule="auto"/>
             </w:pPr>
             <w:r>
               <w:rPr>
@@ -562,11 +590,15 @@
         </w:tc>
       </w:tr>
     </w:tbl>
-    <w:p/>
+    <w:p>
+      <w:pPr>
+        <w:spacing w:after="80" w:line="276" w:lineRule="auto"/>
+      </w:pPr>
+    </w:p>
     <w:p>
       <w:pPr>
         <w:keepNext/>
-        <w:spacing w:before="280" w:after="120"/>
+        <w:spacing w:before="280" w:after="80" w:line="276" w:lineRule="auto"/>
         <w:pBdr>
           <w:bottom w:val="single" w:sz="8" w:space="4" w:color="1A7A3D"/>
         </w:pBdr>
@@ -575,7 +607,6 @@
         <w:rPr>
           <w:rFonts w:ascii="Microsoft YaHei" w:hAnsi="Microsoft YaHei" w:eastAsia="Microsoft YaHei"/>
           <w:b/>
-          <w:color w:val="1A7A3D"/>
           <w:sz w:val="36"/>
         </w:rPr>
         <w:t>1  非功能需求回顾（来自实验一）</w:t>
@@ -604,18 +635,41 @@
             <w:vAlign w:val="top"/>
           </w:tcPr>
           <w:p>
+            <w:pPr>
+              <w:spacing w:line="269" w:lineRule="auto" w:after="40"/>
+            </w:pPr>
             <w:r>
-              <w:t>实验一基线中提炼的关键非功能需求：NFR-001 核心预约链路 SLA ≥ 99.9%；NFR-002 预约创建接口 P95 ≤ 350ms；NFR-003 高峰支持 5000 QPS；NFR-004 新门店上线零停机；NFR-005 传输加密 TLS 1.2+；NFR-006 预约/订单/支付状态差异率 ≤ 0.1%；NFR-007 普通顾客 3 分钟内完成预约；NFR-009 核心接口 100% 有文档、错误码和 traceId；NFR-010 关键链路可观测覆盖率 ≥ 95%；NFR-011 个人信息授权撤回和删除请求 ≤ 15 个工作日响应。</w:t>
+              <w:rPr>
+                <w:rFonts w:ascii="Microsoft YaHei" w:hAnsi="Microsoft YaHei" w:eastAsia="Microsoft YaHei"/>
+                <w:sz w:val="18"/>
+              </w:rPr>
+              <w:t>实验一需求基线中提炼出的关键非功能需求如下：</w:t>
+              <w:br/>
+              <w:t>1. NFR-001 核心预约链路月度 SLA ≥ 99.9%，预约、支付、通知三个环节均需可观测。</w:t>
+              <w:br/>
+              <w:t>2. NFR-002 预约创建接口在常态负载下 P95 ≤ 350ms，高峰期允许降级但必须返回明确状态。</w:t>
+              <w:br/>
+              <w:t>3. NFR-003 支付失败、库存锁超时、通知失败必须支持自动补偿与人工接管。</w:t>
+              <w:br/>
+              <w:t>4. NFR-004 会员手机号、偏好、备注等个人信息最小化采集、脱敏展示、加密传输。</w:t>
+              <w:br/>
+              <w:t>5. NFR-005 新门店上线不得中断现有门店预约，门店配置应支持灰度发布与回滚。</w:t>
+              <w:br/>
+              <w:t>6. NFR-006 关键业务指标、异常告警与日志链路必须可追踪到 traceId。</w:t>
             </w:r>
           </w:p>
         </w:tc>
       </w:tr>
     </w:tbl>
-    <w:p/>
+    <w:p>
+      <w:pPr>
+        <w:spacing w:after="80" w:line="276" w:lineRule="auto"/>
+      </w:pPr>
+    </w:p>
     <w:p>
       <w:pPr>
         <w:keepNext/>
-        <w:spacing w:before="280" w:after="120"/>
+        <w:spacing w:before="280" w:after="80" w:line="276" w:lineRule="auto"/>
         <w:pBdr>
           <w:bottom w:val="single" w:sz="8" w:space="4" w:color="1A7A3D"/>
         </w:pBdr>
@@ -624,7 +678,6 @@
         <w:rPr>
           <w:rFonts w:ascii="Microsoft YaHei" w:hAnsi="Microsoft YaHei" w:eastAsia="Microsoft YaHei"/>
           <w:b/>
-          <w:color w:val="1A7A3D"/>
           <w:sz w:val="36"/>
         </w:rPr>
         <w:t>2  效用树构建</w:t>
@@ -633,7 +686,7 @@
     <w:p>
       <w:pPr>
         <w:keepNext/>
-        <w:spacing w:before="200" w:after="120"/>
+        <w:spacing w:before="200" w:after="80" w:line="276" w:lineRule="auto"/>
         <w:pBdr>
           <w:bottom w:val="single" w:sz="4" w:space="4" w:color="4DB872"/>
         </w:pBdr>
@@ -642,7 +695,6 @@
         <w:rPr>
           <w:rFonts w:ascii="Microsoft YaHei" w:hAnsi="Microsoft YaHei" w:eastAsia="Microsoft YaHei"/>
           <w:b/>
-          <w:color w:val="1A7A3D"/>
           <w:sz w:val="30"/>
         </w:rPr>
         <w:t>2.1  根：业务效用最大化</w:t>
@@ -671,18 +723,29 @@
             <w:vAlign w:val="top"/>
           </w:tcPr>
           <w:p>
+            <w:pPr>
+              <w:spacing w:line="269" w:lineRule="auto" w:after="40"/>
+            </w:pPr>
             <w:r>
-              <w:t>根节点定义为“在高峰、跨门店扩张和合规约束下最大化业务效用”。效用不只等于功能数量，而是核心预约链路稳定、顾客体验可控、运营数据可信、团队能持续演进。</w:t>
+              <w:rPr>
+                <w:rFonts w:ascii="Microsoft YaHei" w:hAnsi="Microsoft YaHei" w:eastAsia="Microsoft YaHei"/>
+                <w:sz w:val="18"/>
+              </w:rPr>
+              <w:t>根节点定义为“在高峰预约、门店扩张和隐私合规约束下最大化业务效用”。本实验将业务效用拆成性能、可用性、安全性、可维护性、可观测性五个一级质量属性。每个叶子节点都要求能映射到一个可测试场景或验收指标，避免只写“快、稳、安全”等不可评审表述。</w:t>
             </w:r>
           </w:p>
         </w:tc>
       </w:tr>
     </w:tbl>
-    <w:p/>
+    <w:p>
+      <w:pPr>
+        <w:spacing w:after="80" w:line="276" w:lineRule="auto"/>
+      </w:pPr>
+    </w:p>
     <w:p>
       <w:pPr>
         <w:keepNext/>
-        <w:spacing w:before="200" w:after="120"/>
+        <w:spacing w:before="200" w:after="80" w:line="276" w:lineRule="auto"/>
         <w:pBdr>
           <w:bottom w:val="single" w:sz="4" w:space="4" w:color="4DB872"/>
         </w:pBdr>
@@ -691,7 +754,6 @@
         <w:rPr>
           <w:rFonts w:ascii="Microsoft YaHei" w:hAnsi="Microsoft YaHei" w:eastAsia="Microsoft YaHei"/>
           <w:b/>
-          <w:color w:val="1A7A3D"/>
           <w:sz w:val="30"/>
         </w:rPr>
         <w:t>2.2  二级维度</w:t>
@@ -720,20 +782,38 @@
             <w:vAlign w:val="top"/>
           </w:tcPr>
           <w:p>
+            <w:pPr>
+              <w:spacing w:line="269" w:lineRule="auto" w:after="40"/>
+            </w:pPr>
             <w:r>
-              <w:t>二级维度：性能、可用性、安全与合规、数据一致性、可维护性、可演进性、成本。性能和可用性是 CTO 追问的第一优先级；安全合规是上线门槛；可维护性和可演进性决定后续微服务拆分是否值得。</w:t>
+              <w:rPr>
+                <w:rFonts w:ascii="Microsoft YaHei" w:hAnsi="Microsoft YaHei" w:eastAsia="Microsoft YaHei"/>
+                <w:sz w:val="18"/>
+              </w:rPr>
+              <w:t>二级维度采用“质量属性 → 场景 → 响应度量”的组织方式：性能关注预约提交、并发响应和页面加载；可用性关注支付失败重试、服务故障恢复与 SLA；安全性关注身份认证、脱敏展示与支付信息加密；可维护性关注模块职责、接口规范和文档；可观测性关注业务指标、异常告警和链路日志。</w:t>
             </w:r>
           </w:p>
           <w:p>
             <w:pPr>
-              <w:spacing w:before="0" w:after="0"/>
+              <w:spacing w:before="0" w:after="40" w:line="269" w:lineRule="auto"/>
             </w:pPr>
+            <w:r>
+              <w:rPr>
+                <w:rFonts w:ascii="Microsoft YaHei" w:hAnsi="Microsoft YaHei" w:eastAsia="Microsoft YaHei"/>
+                <w:sz w:val="18"/>
+              </w:rPr>
+            </w:r>
           </w:p>
           <w:p>
             <w:pPr>
+              <w:spacing w:line="269" w:lineRule="auto" w:after="40"/>
               <w:jc w:val="center"/>
             </w:pPr>
             <w:r>
+              <w:rPr>
+                <w:rFonts w:ascii="Microsoft YaHei" w:hAnsi="Microsoft YaHei" w:eastAsia="Microsoft YaHei"/>
+                <w:sz w:val="18"/>
+              </w:rPr>
               <w:drawing>
                 <wp:inline xmlns:a="http://schemas.openxmlformats.org/drawingml/2006/main" xmlns:pic="http://schemas.openxmlformats.org/drawingml/2006/picture">
                   <wp:extent cx="4983480" cy="2958941"/>
@@ -770,20 +850,28 @@
           </w:p>
           <w:p>
             <w:pPr>
+              <w:spacing w:line="269" w:lineRule="auto" w:after="40"/>
               <w:jc w:val="center"/>
             </w:pPr>
             <w:r>
-              <w:t>图2-1 质量属性效用树</w:t>
+              <w:rPr>
+                <w:rFonts w:ascii="Microsoft YaHei" w:hAnsi="Microsoft YaHei" w:eastAsia="Microsoft YaHei"/>
+                <w:sz w:val="18"/>
+              </w:rPr>
             </w:r>
           </w:p>
         </w:tc>
       </w:tr>
     </w:tbl>
-    <w:p/>
+    <w:p>
+      <w:pPr>
+        <w:spacing w:after="80" w:line="276" w:lineRule="auto"/>
+      </w:pPr>
+    </w:p>
     <w:p>
       <w:pPr>
         <w:keepNext/>
-        <w:spacing w:before="200" w:after="120"/>
+        <w:spacing w:before="200" w:after="80" w:line="276" w:lineRule="auto"/>
         <w:pBdr>
           <w:bottom w:val="single" w:sz="4" w:space="4" w:color="4DB872"/>
         </w:pBdr>
@@ -792,7 +880,6 @@
         <w:rPr>
           <w:rFonts w:ascii="Microsoft YaHei" w:hAnsi="Microsoft YaHei" w:eastAsia="Microsoft YaHei"/>
           <w:b/>
-          <w:color w:val="1A7A3D"/>
           <w:sz w:val="30"/>
         </w:rPr>
         <w:t>2.3  叶节点（H/M/L 评级）</w:t>
@@ -821,49 +908,37 @@
             <w:vAlign w:val="top"/>
           </w:tcPr>
           <w:p>
+            <w:pPr>
+              <w:spacing w:line="269" w:lineRule="auto" w:after="40"/>
+            </w:pPr>
             <w:r>
-              <w:t>效用树：</w:t>
-            </w:r>
-          </w:p>
-          <w:p>
-            <w:r>
+              <w:rPr>
+                <w:rFonts w:ascii="Microsoft YaHei" w:hAnsi="Microsoft YaHei" w:eastAsia="Microsoft YaHei"/>
+                <w:sz w:val="18"/>
+              </w:rPr>
+              <w:t>效用树文字版：</w:t>
+              <w:br/>
               <w:t>业务效用最大化</w:t>
-            </w:r>
-          </w:p>
-          <w:p>
-            <w:r>
-              <w:t>├─ 性能：预约提交 P95≤350ms(H,H)；高峰 5000QPS(H,H)；看板 5s 内返回(M,M)</w:t>
-            </w:r>
-          </w:p>
-          <w:p>
-            <w:r>
-              <w:t>├─ 可用性：预约链路 SLA≥99.9%(H,H)；单 AZ 故障 RTO≤5min(H,M)</w:t>
-            </w:r>
-          </w:p>
-          <w:p>
-            <w:r>
-              <w:t>├─ 安全合规：TLS 全链路(H,L)；个人信息删除≤15工作日(H,M)</w:t>
-            </w:r>
-          </w:p>
-          <w:p>
-            <w:r>
-              <w:t>├─ 数据一致性：预约-订单-支付差异率≤0.1%(H,H)</w:t>
-            </w:r>
-          </w:p>
-          <w:p>
-            <w:r>
-              <w:t>├─ 可维护性：核心 API 文档覆盖 100%(M,M)；traceId 覆盖 95%(M,L)</w:t>
-            </w:r>
-          </w:p>
-          <w:p>
-            <w:r>
-              <w:t>└─ 可演进性：新增门店零停机(H,M)；服务边界可独立扩展(M,M)</w:t>
+              <w:br/>
+              <w:t>├─ 性能：预约提交 P95≤350ms(H,H)；1000 并发响应正常(H,H)；页面加载≤2s(M,M)</w:t>
+              <w:br/>
+              <w:t>├─ 可用性：支付失败可重试(H,H)；服务可用性≥99.9%(H,H)；系统故障自动恢复(M,H)</w:t>
+              <w:br/>
+              <w:t>├─ 安全性：手机号脱敏存储与展示(H,H)；接口调用需身份认证(H,H)；支付信息加密传输(H,H)</w:t>
+              <w:br/>
+              <w:t>├─ 可维护性：模块职责清晰低耦合(M,H)；接口规范统一易扩展(M,M)；文档齐全便于维护(M,M)</w:t>
+              <w:br/>
+              <w:t>└─ 可观测性：关键业务指标可监控(H,M)；异常告警及时准确(H,H)；日志链路可追踪(H,H)</w:t>
             </w:r>
           </w:p>
         </w:tc>
       </w:tr>
     </w:tbl>
-    <w:p/>
+    <w:p>
+      <w:pPr>
+        <w:spacing w:after="80" w:line="276" w:lineRule="auto"/>
+      </w:pPr>
+    </w:p>
     <w:tbl>
       <w:tblPr>
         <w:tblW w:type="auto" w:w="0"/>
@@ -887,18 +962,29 @@
             <w:vAlign w:val="top"/>
           </w:tcPr>
           <w:p>
+            <w:pPr>
+              <w:spacing w:line="269" w:lineRule="auto" w:after="40"/>
+            </w:pPr>
             <w:r>
-              <w:t>Top-10 QAS 从实验一需求基线、CTO 追问和实验二任务书中抽取。每个 QAS 都明确刺激源、运行环境、响应和度量，并直接驱动 D2-3 ATAM、D2-4 C4 与 D2-7 ADR。</w:t>
+              <w:rPr>
+                <w:rFonts w:ascii="Microsoft YaHei" w:hAnsi="Microsoft YaHei" w:eastAsia="Microsoft YaHei"/>
+                <w:sz w:val="18"/>
+              </w:rPr>
+              <w:t>Top-10 QAS 从实验一需求基线、CTO 三个追问和实验二任务书抽取。排序原则为：先保证核心预约交易链路，再保证支付一致性、隐私合规和门店扩展，最后覆盖运营分析与维护效率。每条 QAS 均包含刺激源、刺激、制品、环境、响应和响应度量，可直接转化为后续测试用例。</w:t>
             </w:r>
           </w:p>
         </w:tc>
       </w:tr>
     </w:tbl>
-    <w:p/>
+    <w:p>
+      <w:pPr>
+        <w:spacing w:after="80" w:line="276" w:lineRule="auto"/>
+      </w:pPr>
+    </w:p>
     <w:p>
       <w:pPr>
         <w:keepNext/>
-        <w:spacing w:before="280" w:after="120"/>
+        <w:spacing w:before="280" w:after="80" w:line="276" w:lineRule="auto"/>
         <w:pBdr>
           <w:bottom w:val="single" w:sz="8" w:space="4" w:color="1A7A3D"/>
         </w:pBdr>
@@ -907,7 +993,6 @@
         <w:rPr>
           <w:rFonts w:ascii="Microsoft YaHei" w:hAnsi="Microsoft YaHei" w:eastAsia="Microsoft YaHei"/>
           <w:b/>
-          <w:color w:val="1A7A3D"/>
           <w:sz w:val="36"/>
         </w:rPr>
         <w:t>3  Top-10 QAS 详表</w:t>
@@ -934,7 +1019,7 @@
         <w:tc>
           <w:tcPr>
             <w:tcW w:type="dxa" w:w="794"/>
-            <w:shd w:val="clear" w:color="auto" w:fill="1A7A3D"/>
+            <w:shd w:val="clear" w:color="auto" w:fill="EAF6EF"/>
             <w:tcBorders>
               <w:top w:val="single" w:sz="4" w:space="0" w:color="1A7A3D"/>
               <w:left w:val="single" w:sz="4" w:space="0" w:color="1A7A3D"/>
@@ -945,7 +1030,7 @@
           </w:tcPr>
           <w:p>
             <w:pPr>
-              <w:spacing w:after="40" w:before="40"/>
+              <w:spacing w:after="40" w:before="40" w:line="269" w:lineRule="auto"/>
               <w:jc w:val="center"/>
             </w:pPr>
             <w:r>
@@ -962,7 +1047,7 @@
         <w:tc>
           <w:tcPr>
             <w:tcW w:type="dxa" w:w="907"/>
-            <w:shd w:val="clear" w:color="auto" w:fill="1A7A3D"/>
+            <w:shd w:val="clear" w:color="auto" w:fill="EAF6EF"/>
             <w:tcBorders>
               <w:top w:val="single" w:sz="4" w:space="0" w:color="1A7A3D"/>
               <w:left w:val="single" w:sz="4" w:space="0" w:color="1A7A3D"/>
@@ -973,7 +1058,7 @@
           </w:tcPr>
           <w:p>
             <w:pPr>
-              <w:spacing w:after="40" w:before="40"/>
+              <w:spacing w:after="40" w:before="40" w:line="269" w:lineRule="auto"/>
               <w:jc w:val="center"/>
             </w:pPr>
             <w:r>
@@ -990,7 +1075,7 @@
         <w:tc>
           <w:tcPr>
             <w:tcW w:type="dxa" w:w="1701"/>
-            <w:shd w:val="clear" w:color="auto" w:fill="1A7A3D"/>
+            <w:shd w:val="clear" w:color="auto" w:fill="EAF6EF"/>
             <w:tcBorders>
               <w:top w:val="single" w:sz="4" w:space="0" w:color="1A7A3D"/>
               <w:left w:val="single" w:sz="4" w:space="0" w:color="1A7A3D"/>
@@ -1001,7 +1086,7 @@
           </w:tcPr>
           <w:p>
             <w:pPr>
-              <w:spacing w:after="40" w:before="40"/>
+              <w:spacing w:after="40" w:before="40" w:line="269" w:lineRule="auto"/>
               <w:jc w:val="center"/>
             </w:pPr>
             <w:r>
@@ -1018,7 +1103,7 @@
         <w:tc>
           <w:tcPr>
             <w:tcW w:type="dxa" w:w="907"/>
-            <w:shd w:val="clear" w:color="auto" w:fill="1A7A3D"/>
+            <w:shd w:val="clear" w:color="auto" w:fill="EAF6EF"/>
             <w:tcBorders>
               <w:top w:val="single" w:sz="4" w:space="0" w:color="1A7A3D"/>
               <w:left w:val="single" w:sz="4" w:space="0" w:color="1A7A3D"/>
@@ -1029,7 +1114,7 @@
           </w:tcPr>
           <w:p>
             <w:pPr>
-              <w:spacing w:after="40" w:before="40"/>
+              <w:spacing w:after="40" w:before="40" w:line="269" w:lineRule="auto"/>
               <w:jc w:val="center"/>
             </w:pPr>
             <w:r>
@@ -1046,7 +1131,7 @@
         <w:tc>
           <w:tcPr>
             <w:tcW w:type="dxa" w:w="1134"/>
-            <w:shd w:val="clear" w:color="auto" w:fill="1A7A3D"/>
+            <w:shd w:val="clear" w:color="auto" w:fill="EAF6EF"/>
             <w:tcBorders>
               <w:top w:val="single" w:sz="4" w:space="0" w:color="1A7A3D"/>
               <w:left w:val="single" w:sz="4" w:space="0" w:color="1A7A3D"/>
@@ -1057,7 +1142,7 @@
           </w:tcPr>
           <w:p>
             <w:pPr>
-              <w:spacing w:after="40" w:before="40"/>
+              <w:spacing w:after="40" w:before="40" w:line="269" w:lineRule="auto"/>
               <w:jc w:val="center"/>
             </w:pPr>
             <w:r>
@@ -1074,7 +1159,7 @@
         <w:tc>
           <w:tcPr>
             <w:tcW w:type="dxa" w:w="907"/>
-            <w:shd w:val="clear" w:color="auto" w:fill="1A7A3D"/>
+            <w:shd w:val="clear" w:color="auto" w:fill="EAF6EF"/>
             <w:tcBorders>
               <w:top w:val="single" w:sz="4" w:space="0" w:color="1A7A3D"/>
               <w:left w:val="single" w:sz="4" w:space="0" w:color="1A7A3D"/>
@@ -1085,7 +1170,7 @@
           </w:tcPr>
           <w:p>
             <w:pPr>
-              <w:spacing w:after="40" w:before="40"/>
+              <w:spacing w:after="40" w:before="40" w:line="269" w:lineRule="auto"/>
               <w:jc w:val="center"/>
             </w:pPr>
             <w:r>
@@ -1102,7 +1187,7 @@
         <w:tc>
           <w:tcPr>
             <w:tcW w:type="dxa" w:w="907"/>
-            <w:shd w:val="clear" w:color="auto" w:fill="1A7A3D"/>
+            <w:shd w:val="clear" w:color="auto" w:fill="EAF6EF"/>
             <w:tcBorders>
               <w:top w:val="single" w:sz="4" w:space="0" w:color="1A7A3D"/>
               <w:left w:val="single" w:sz="4" w:space="0" w:color="1A7A3D"/>
@@ -1113,7 +1198,7 @@
           </w:tcPr>
           <w:p>
             <w:pPr>
-              <w:spacing w:after="40" w:before="40"/>
+              <w:spacing w:after="40" w:before="40" w:line="269" w:lineRule="auto"/>
               <w:jc w:val="center"/>
             </w:pPr>
             <w:r>
@@ -1130,7 +1215,7 @@
         <w:tc>
           <w:tcPr>
             <w:tcW w:type="dxa" w:w="1361"/>
-            <w:shd w:val="clear" w:color="auto" w:fill="1A7A3D"/>
+            <w:shd w:val="clear" w:color="auto" w:fill="EAF6EF"/>
             <w:tcBorders>
               <w:top w:val="single" w:sz="4" w:space="0" w:color="1A7A3D"/>
               <w:left w:val="single" w:sz="4" w:space="0" w:color="1A7A3D"/>
@@ -1141,7 +1226,7 @@
           </w:tcPr>
           <w:p>
             <w:pPr>
-              <w:spacing w:after="40" w:before="40"/>
+              <w:spacing w:after="40" w:before="40" w:line="269" w:lineRule="auto"/>
               <w:jc w:val="center"/>
             </w:pPr>
             <w:r>
@@ -1158,7 +1243,7 @@
         <w:tc>
           <w:tcPr>
             <w:tcW w:type="dxa" w:w="1134"/>
-            <w:shd w:val="clear" w:color="auto" w:fill="1A7A3D"/>
+            <w:shd w:val="clear" w:color="auto" w:fill="EAF6EF"/>
             <w:tcBorders>
               <w:top w:val="single" w:sz="4" w:space="0" w:color="1A7A3D"/>
               <w:left w:val="single" w:sz="4" w:space="0" w:color="1A7A3D"/>
@@ -1169,7 +1254,7 @@
           </w:tcPr>
           <w:p>
             <w:pPr>
-              <w:spacing w:after="40" w:before="40"/>
+              <w:spacing w:after="40" w:before="40" w:line="269" w:lineRule="auto"/>
               <w:jc w:val="center"/>
             </w:pPr>
             <w:r>
@@ -1190,7 +1275,14 @@
             <w:tcW w:type="dxa" w:w="1083"/>
           </w:tcPr>
           <w:p>
+            <w:pPr>
+              <w:spacing w:line="269" w:lineRule="auto" w:after="40"/>
+            </w:pPr>
             <w:r>
+              <w:rPr>
+                <w:rFonts w:ascii="Microsoft YaHei" w:hAnsi="Microsoft YaHei" w:eastAsia="Microsoft YaHei"/>
+                <w:sz w:val="18"/>
+              </w:rPr>
               <w:t>QAS-01</w:t>
             </w:r>
           </w:p>
@@ -1200,7 +1292,14 @@
             <w:tcW w:type="dxa" w:w="1083"/>
           </w:tcPr>
           <w:p>
+            <w:pPr>
+              <w:spacing w:line="269" w:lineRule="auto" w:after="40"/>
+            </w:pPr>
             <w:r>
+              <w:rPr>
+                <w:rFonts w:ascii="Microsoft YaHei" w:hAnsi="Microsoft YaHei" w:eastAsia="Microsoft YaHei"/>
+                <w:sz w:val="18"/>
+              </w:rPr>
               <w:t>性能</w:t>
             </w:r>
           </w:p>
@@ -1210,8 +1309,15 @@
             <w:tcW w:type="dxa" w:w="1083"/>
           </w:tcPr>
           <w:p>
+            <w:pPr>
+              <w:spacing w:line="269" w:lineRule="auto" w:after="40"/>
+            </w:pPr>
             <w:r>
-              <w:t>节假日午晚餐创建预约</w:t>
+              <w:rPr>
+                <w:rFonts w:ascii="Microsoft YaHei" w:hAnsi="Microsoft YaHei" w:eastAsia="Microsoft YaHei"/>
+                <w:sz w:val="18"/>
+              </w:rPr>
+              <w:t>节假日午晚餐高峰创建预约</w:t>
             </w:r>
           </w:p>
         </w:tc>
@@ -1220,7 +1326,14 @@
             <w:tcW w:type="dxa" w:w="1083"/>
           </w:tcPr>
           <w:p>
+            <w:pPr>
+              <w:spacing w:line="269" w:lineRule="auto" w:after="40"/>
+            </w:pPr>
             <w:r>
+              <w:rPr>
+                <w:rFonts w:ascii="Microsoft YaHei" w:hAnsi="Microsoft YaHei" w:eastAsia="Microsoft YaHei"/>
+                <w:sz w:val="18"/>
+              </w:rPr>
               <w:t>顾客</w:t>
             </w:r>
           </w:p>
@@ -1230,7 +1343,14 @@
             <w:tcW w:type="dxa" w:w="1083"/>
           </w:tcPr>
           <w:p>
+            <w:pPr>
+              <w:spacing w:line="269" w:lineRule="auto" w:after="40"/>
+            </w:pPr>
             <w:r>
+              <w:rPr>
+                <w:rFonts w:ascii="Microsoft YaHei" w:hAnsi="Microsoft YaHei" w:eastAsia="Microsoft YaHei"/>
+                <w:sz w:val="18"/>
+              </w:rPr>
               <w:t>POST /reservations</w:t>
             </w:r>
           </w:p>
@@ -1240,8 +1360,15 @@
             <w:tcW w:type="dxa" w:w="1083"/>
           </w:tcPr>
           <w:p>
+            <w:pPr>
+              <w:spacing w:line="269" w:lineRule="auto" w:after="40"/>
+            </w:pPr>
             <w:r>
-              <w:t>预约服务</w:t>
+              <w:rPr>
+                <w:rFonts w:ascii="Microsoft YaHei" w:hAnsi="Microsoft YaHei" w:eastAsia="Microsoft YaHei"/>
+                <w:sz w:val="18"/>
+              </w:rPr>
+              <w:t>预约服务/API网关</w:t>
             </w:r>
           </w:p>
         </w:tc>
@@ -1250,8 +1377,15 @@
             <w:tcW w:type="dxa" w:w="1083"/>
           </w:tcPr>
           <w:p>
+            <w:pPr>
+              <w:spacing w:line="269" w:lineRule="auto" w:after="40"/>
+            </w:pPr>
             <w:r>
-              <w:t>5000 QPS 峰值</w:t>
+              <w:rPr>
+                <w:rFonts w:ascii="Microsoft YaHei" w:hAnsi="Microsoft YaHei" w:eastAsia="Microsoft YaHei"/>
+                <w:sz w:val="18"/>
+              </w:rPr>
+              <w:t>1000 并发、38 家门店在线</w:t>
             </w:r>
           </w:p>
         </w:tc>
@@ -1260,8 +1394,15 @@
             <w:tcW w:type="dxa" w:w="1083"/>
           </w:tcPr>
           <w:p>
+            <w:pPr>
+              <w:spacing w:line="269" w:lineRule="auto" w:after="40"/>
+            </w:pPr>
             <w:r>
-              <w:t>返回预约号或明确失败原因</w:t>
+              <w:rPr>
+                <w:rFonts w:ascii="Microsoft YaHei" w:hAnsi="Microsoft YaHei" w:eastAsia="Microsoft YaHei"/>
+                <w:sz w:val="18"/>
+              </w:rPr>
+              <w:t>返回预约号、候补建议或明确失败原因</w:t>
             </w:r>
           </w:p>
         </w:tc>
@@ -1270,7 +1411,14 @@
             <w:tcW w:type="dxa" w:w="1083"/>
           </w:tcPr>
           <w:p>
+            <w:pPr>
+              <w:spacing w:line="269" w:lineRule="auto" w:after="40"/>
+            </w:pPr>
             <w:r>
+              <w:rPr>
+                <w:rFonts w:ascii="Microsoft YaHei" w:hAnsi="Microsoft YaHei" w:eastAsia="Microsoft YaHei"/>
+                <w:sz w:val="18"/>
+              </w:rPr>
               <w:t>P95≤350ms，错误率≤0.5%</w:t>
             </w:r>
           </w:p>
@@ -1282,7 +1430,14 @@
             <w:tcW w:type="dxa" w:w="1083"/>
           </w:tcPr>
           <w:p>
+            <w:pPr>
+              <w:spacing w:line="269" w:lineRule="auto" w:after="40"/>
+            </w:pPr>
             <w:r>
+              <w:rPr>
+                <w:rFonts w:ascii="Microsoft YaHei" w:hAnsi="Microsoft YaHei" w:eastAsia="Microsoft YaHei"/>
+                <w:sz w:val="18"/>
+              </w:rPr>
               <w:t>QAS-02</w:t>
             </w:r>
           </w:p>
@@ -1292,7 +1447,14 @@
             <w:tcW w:type="dxa" w:w="1083"/>
           </w:tcPr>
           <w:p>
+            <w:pPr>
+              <w:spacing w:line="269" w:lineRule="auto" w:after="40"/>
+            </w:pPr>
             <w:r>
+              <w:rPr>
+                <w:rFonts w:ascii="Microsoft YaHei" w:hAnsi="Microsoft YaHei" w:eastAsia="Microsoft YaHei"/>
+                <w:sz w:val="18"/>
+              </w:rPr>
               <w:t>可用性</w:t>
             </w:r>
           </w:p>
@@ -1302,7 +1464,14 @@
             <w:tcW w:type="dxa" w:w="1083"/>
           </w:tcPr>
           <w:p>
+            <w:pPr>
+              <w:spacing w:line="269" w:lineRule="auto" w:after="40"/>
+            </w:pPr>
             <w:r>
+              <w:rPr>
+                <w:rFonts w:ascii="Microsoft YaHei" w:hAnsi="Microsoft YaHei" w:eastAsia="Microsoft YaHei"/>
+                <w:sz w:val="18"/>
+              </w:rPr>
               <w:t>核心预约链路持续可用</w:t>
             </w:r>
           </w:p>
@@ -1312,7 +1481,14 @@
             <w:tcW w:type="dxa" w:w="1083"/>
           </w:tcPr>
           <w:p>
+            <w:pPr>
+              <w:spacing w:line="269" w:lineRule="auto" w:after="40"/>
+            </w:pPr>
             <w:r>
+              <w:rPr>
+                <w:rFonts w:ascii="Microsoft YaHei" w:hAnsi="Microsoft YaHei" w:eastAsia="Microsoft YaHei"/>
+                <w:sz w:val="18"/>
+              </w:rPr>
               <w:t>基础设施</w:t>
             </w:r>
           </w:p>
@@ -1322,8 +1498,15 @@
             <w:tcW w:type="dxa" w:w="1083"/>
           </w:tcPr>
           <w:p>
+            <w:pPr>
+              <w:spacing w:line="269" w:lineRule="auto" w:after="40"/>
+            </w:pPr>
             <w:r>
-              <w:t>单实例故障</w:t>
+              <w:rPr>
+                <w:rFonts w:ascii="Microsoft YaHei" w:hAnsi="Microsoft YaHei" w:eastAsia="Microsoft YaHei"/>
+                <w:sz w:val="18"/>
+              </w:rPr>
+              <w:t>单实例故障或滚动发布</w:t>
             </w:r>
           </w:p>
         </w:tc>
@@ -1332,8 +1515,15 @@
             <w:tcW w:type="dxa" w:w="1083"/>
           </w:tcPr>
           <w:p>
+            <w:pPr>
+              <w:spacing w:line="269" w:lineRule="auto" w:after="40"/>
+            </w:pPr>
             <w:r>
-              <w:t>预约服务/API网关</w:t>
+              <w:rPr>
+                <w:rFonts w:ascii="Microsoft YaHei" w:hAnsi="Microsoft YaHei" w:eastAsia="Microsoft YaHei"/>
+                <w:sz w:val="18"/>
+              </w:rPr>
+              <w:t>预约/会员/门店服务</w:t>
             </w:r>
           </w:p>
         </w:tc>
@@ -1342,8 +1532,15 @@
             <w:tcW w:type="dxa" w:w="1083"/>
           </w:tcPr>
           <w:p>
+            <w:pPr>
+              <w:spacing w:line="269" w:lineRule="auto" w:after="40"/>
+            </w:pPr>
             <w:r>
-              <w:t>生产环境</w:t>
+              <w:rPr>
+                <w:rFonts w:ascii="Microsoft YaHei" w:hAnsi="Microsoft YaHei" w:eastAsia="Microsoft YaHei"/>
+                <w:sz w:val="18"/>
+              </w:rPr>
+              <w:t>生产环境、营业中</w:t>
             </w:r>
           </w:p>
         </w:tc>
@@ -1352,8 +1549,15 @@
             <w:tcW w:type="dxa" w:w="1083"/>
           </w:tcPr>
           <w:p>
+            <w:pPr>
+              <w:spacing w:line="269" w:lineRule="auto" w:after="40"/>
+            </w:pPr>
             <w:r>
-              <w:t>自动摘除故障实例</w:t>
+              <w:rPr>
+                <w:rFonts w:ascii="Microsoft YaHei" w:hAnsi="Microsoft YaHei" w:eastAsia="Microsoft YaHei"/>
+                <w:sz w:val="18"/>
+              </w:rPr>
+              <w:t>自动摘除故障实例并保持可用</w:t>
             </w:r>
           </w:p>
         </w:tc>
@@ -1362,8 +1566,15 @@
             <w:tcW w:type="dxa" w:w="1083"/>
           </w:tcPr>
           <w:p>
+            <w:pPr>
+              <w:spacing w:line="269" w:lineRule="auto" w:after="40"/>
+            </w:pPr>
             <w:r>
-              <w:t>月 SLA≥99.9%</w:t>
+              <w:rPr>
+                <w:rFonts w:ascii="Microsoft YaHei" w:hAnsi="Microsoft YaHei" w:eastAsia="Microsoft YaHei"/>
+                <w:sz w:val="18"/>
+              </w:rPr>
+              <w:t>月 SLA≥99.9%，RTO≤5min</w:t>
             </w:r>
           </w:p>
         </w:tc>
@@ -1374,7 +1585,14 @@
             <w:tcW w:type="dxa" w:w="1083"/>
           </w:tcPr>
           <w:p>
+            <w:pPr>
+              <w:spacing w:line="269" w:lineRule="auto" w:after="40"/>
+            </w:pPr>
             <w:r>
+              <w:rPr>
+                <w:rFonts w:ascii="Microsoft YaHei" w:hAnsi="Microsoft YaHei" w:eastAsia="Microsoft YaHei"/>
+                <w:sz w:val="18"/>
+              </w:rPr>
               <w:t>QAS-03</w:t>
             </w:r>
           </w:p>
@@ -1384,8 +1602,15 @@
             <w:tcW w:type="dxa" w:w="1083"/>
           </w:tcPr>
           <w:p>
+            <w:pPr>
+              <w:spacing w:line="269" w:lineRule="auto" w:after="40"/>
+            </w:pPr>
             <w:r>
-              <w:t>可扩展</w:t>
+              <w:rPr>
+                <w:rFonts w:ascii="Microsoft YaHei" w:hAnsi="Microsoft YaHei" w:eastAsia="Microsoft YaHei"/>
+                <w:sz w:val="18"/>
+              </w:rPr>
+              <w:t>可演进性</w:t>
             </w:r>
           </w:p>
         </w:tc>
@@ -1394,7 +1619,14 @@
             <w:tcW w:type="dxa" w:w="1083"/>
           </w:tcPr>
           <w:p>
+            <w:pPr>
+              <w:spacing w:line="269" w:lineRule="auto" w:after="40"/>
+            </w:pPr>
             <w:r>
+              <w:rPr>
+                <w:rFonts w:ascii="Microsoft YaHei" w:hAnsi="Microsoft YaHei" w:eastAsia="Microsoft YaHei"/>
+                <w:sz w:val="18"/>
+              </w:rPr>
               <w:t>新增门店上线</w:t>
             </w:r>
           </w:p>
@@ -1404,8 +1636,15 @@
             <w:tcW w:type="dxa" w:w="1083"/>
           </w:tcPr>
           <w:p>
+            <w:pPr>
+              <w:spacing w:line="269" w:lineRule="auto" w:after="40"/>
+            </w:pPr>
             <w:r>
-              <w:t>运营</w:t>
+              <w:rPr>
+                <w:rFonts w:ascii="Microsoft YaHei" w:hAnsi="Microsoft YaHei" w:eastAsia="Microsoft YaHei"/>
+                <w:sz w:val="18"/>
+              </w:rPr>
+              <w:t>运营人员</w:t>
             </w:r>
           </w:p>
         </w:tc>
@@ -1414,8 +1653,15 @@
             <w:tcW w:type="dxa" w:w="1083"/>
           </w:tcPr>
           <w:p>
+            <w:pPr>
+              <w:spacing w:line="269" w:lineRule="auto" w:after="40"/>
+            </w:pPr>
             <w:r>
-              <w:t>发布门店配置</w:t>
+              <w:rPr>
+                <w:rFonts w:ascii="Microsoft YaHei" w:hAnsi="Microsoft YaHei" w:eastAsia="Microsoft YaHei"/>
+                <w:sz w:val="18"/>
+              </w:rPr>
+              <w:t>发布门店、桌位、营业规则配置</w:t>
             </w:r>
           </w:p>
         </w:tc>
@@ -1424,7 +1670,14 @@
             <w:tcW w:type="dxa" w:w="1083"/>
           </w:tcPr>
           <w:p>
+            <w:pPr>
+              <w:spacing w:line="269" w:lineRule="auto" w:after="40"/>
+            </w:pPr>
             <w:r>
+              <w:rPr>
+                <w:rFonts w:ascii="Microsoft YaHei" w:hAnsi="Microsoft YaHei" w:eastAsia="Microsoft YaHei"/>
+                <w:sz w:val="18"/>
+              </w:rPr>
               <w:t>门店/预约/菜单服务</w:t>
             </w:r>
           </w:p>
@@ -1434,8 +1687,15 @@
             <w:tcW w:type="dxa" w:w="1083"/>
           </w:tcPr>
           <w:p>
+            <w:pPr>
+              <w:spacing w:line="269" w:lineRule="auto" w:after="40"/>
+            </w:pPr>
             <w:r>
-              <w:t>营业中</w:t>
+              <w:rPr>
+                <w:rFonts w:ascii="Microsoft YaHei" w:hAnsi="Microsoft YaHei" w:eastAsia="Microsoft YaHei"/>
+                <w:sz w:val="18"/>
+              </w:rPr>
+              <w:t>营业中、无需停机</w:t>
             </w:r>
           </w:p>
         </w:tc>
@@ -1444,8 +1704,15 @@
             <w:tcW w:type="dxa" w:w="1083"/>
           </w:tcPr>
           <w:p>
+            <w:pPr>
+              <w:spacing w:line="269" w:lineRule="auto" w:after="40"/>
+            </w:pPr>
             <w:r>
-              <w:t>无需停机即可被搜索和预约</w:t>
+              <w:rPr>
+                <w:rFonts w:ascii="Microsoft YaHei" w:hAnsi="Microsoft YaHei" w:eastAsia="Microsoft YaHei"/>
+                <w:sz w:val="18"/>
+              </w:rPr>
+              <w:t>新门店可被搜索、预约和核销</w:t>
             </w:r>
           </w:p>
         </w:tc>
@@ -1454,8 +1721,15 @@
             <w:tcW w:type="dxa" w:w="1083"/>
           </w:tcPr>
           <w:p>
+            <w:pPr>
+              <w:spacing w:line="269" w:lineRule="auto" w:after="40"/>
+            </w:pPr>
             <w:r>
-              <w:t>停机时间=0</w:t>
+              <w:rPr>
+                <w:rFonts w:ascii="Microsoft YaHei" w:hAnsi="Microsoft YaHei" w:eastAsia="Microsoft YaHei"/>
+                <w:sz w:val="18"/>
+              </w:rPr>
+              <w:t>停机时间=0，配置回滚≤10min</w:t>
             </w:r>
           </w:p>
         </w:tc>
@@ -1466,7 +1740,14 @@
             <w:tcW w:type="dxa" w:w="1083"/>
           </w:tcPr>
           <w:p>
+            <w:pPr>
+              <w:spacing w:line="269" w:lineRule="auto" w:after="40"/>
+            </w:pPr>
             <w:r>
+              <w:rPr>
+                <w:rFonts w:ascii="Microsoft YaHei" w:hAnsi="Microsoft YaHei" w:eastAsia="Microsoft YaHei"/>
+                <w:sz w:val="18"/>
+              </w:rPr>
               <w:t>QAS-04</w:t>
             </w:r>
           </w:p>
@@ -1476,7 +1757,14 @@
             <w:tcW w:type="dxa" w:w="1083"/>
           </w:tcPr>
           <w:p>
+            <w:pPr>
+              <w:spacing w:line="269" w:lineRule="auto" w:after="40"/>
+            </w:pPr>
             <w:r>
+              <w:rPr>
+                <w:rFonts w:ascii="Microsoft YaHei" w:hAnsi="Microsoft YaHei" w:eastAsia="Microsoft YaHei"/>
+                <w:sz w:val="18"/>
+              </w:rPr>
               <w:t>一致性</w:t>
             </w:r>
           </w:p>
@@ -1486,8 +1774,15 @@
             <w:tcW w:type="dxa" w:w="1083"/>
           </w:tcPr>
           <w:p>
+            <w:pPr>
+              <w:spacing w:line="269" w:lineRule="auto" w:after="40"/>
+            </w:pPr>
             <w:r>
-              <w:t>支付成功后订单与预约同步</w:t>
+              <w:rPr>
+                <w:rFonts w:ascii="Microsoft YaHei" w:hAnsi="Microsoft YaHei" w:eastAsia="Microsoft YaHei"/>
+                <w:sz w:val="18"/>
+              </w:rPr>
+              <w:t>支付成功后预约状态同步</w:t>
             </w:r>
           </w:p>
         </w:tc>
@@ -1496,7 +1791,14 @@
             <w:tcW w:type="dxa" w:w="1083"/>
           </w:tcPr>
           <w:p>
+            <w:pPr>
+              <w:spacing w:line="269" w:lineRule="auto" w:after="40"/>
+            </w:pPr>
             <w:r>
+              <w:rPr>
+                <w:rFonts w:ascii="Microsoft YaHei" w:hAnsi="Microsoft YaHei" w:eastAsia="Microsoft YaHei"/>
+                <w:sz w:val="18"/>
+              </w:rPr>
               <w:t>支付平台</w:t>
             </w:r>
           </w:p>
@@ -1506,8 +1808,15 @@
             <w:tcW w:type="dxa" w:w="1083"/>
           </w:tcPr>
           <w:p>
+            <w:pPr>
+              <w:spacing w:line="269" w:lineRule="auto" w:after="40"/>
+            </w:pPr>
             <w:r>
-              <w:t>支付回调</w:t>
+              <w:rPr>
+                <w:rFonts w:ascii="Microsoft YaHei" w:hAnsi="Microsoft YaHei" w:eastAsia="Microsoft YaHei"/>
+                <w:sz w:val="18"/>
+              </w:rPr>
+              <w:t>支付回调成功或重复回调</w:t>
             </w:r>
           </w:p>
         </w:tc>
@@ -1516,8 +1825,15 @@
             <w:tcW w:type="dxa" w:w="1083"/>
           </w:tcPr>
           <w:p>
+            <w:pPr>
+              <w:spacing w:line="269" w:lineRule="auto" w:after="40"/>
+            </w:pPr>
             <w:r>
-              <w:t>订单/预约服务</w:t>
+              <w:rPr>
+                <w:rFonts w:ascii="Microsoft YaHei" w:hAnsi="Microsoft YaHei" w:eastAsia="Microsoft YaHei"/>
+                <w:sz w:val="18"/>
+              </w:rPr>
+              <w:t>订单支付/预约服务</w:t>
             </w:r>
           </w:p>
         </w:tc>
@@ -1526,8 +1842,15 @@
             <w:tcW w:type="dxa" w:w="1083"/>
           </w:tcPr>
           <w:p>
+            <w:pPr>
+              <w:spacing w:line="269" w:lineRule="auto" w:after="40"/>
+            </w:pPr>
             <w:r>
-              <w:t>网络抖动</w:t>
+              <w:rPr>
+                <w:rFonts w:ascii="Microsoft YaHei" w:hAnsi="Microsoft YaHei" w:eastAsia="Microsoft YaHei"/>
+                <w:sz w:val="18"/>
+              </w:rPr>
+              <w:t>网络抖动、回调重试</w:t>
             </w:r>
           </w:p>
         </w:tc>
@@ -1536,8 +1859,15 @@
             <w:tcW w:type="dxa" w:w="1083"/>
           </w:tcPr>
           <w:p>
+            <w:pPr>
+              <w:spacing w:line="269" w:lineRule="auto" w:after="40"/>
+            </w:pPr>
             <w:r>
-              <w:t>最终一致并可对账</w:t>
+              <w:rPr>
+                <w:rFonts w:ascii="Microsoft YaHei" w:hAnsi="Microsoft YaHei" w:eastAsia="Microsoft YaHei"/>
+                <w:sz w:val="18"/>
+              </w:rPr>
+              <w:t>订单与预约最终一致且可对账</w:t>
             </w:r>
           </w:p>
         </w:tc>
@@ -1546,8 +1876,15 @@
             <w:tcW w:type="dxa" w:w="1083"/>
           </w:tcPr>
           <w:p>
+            <w:pPr>
+              <w:spacing w:line="269" w:lineRule="auto" w:after="40"/>
+            </w:pPr>
             <w:r>
-              <w:t>差异率≤0.1%</w:t>
+              <w:rPr>
+                <w:rFonts w:ascii="Microsoft YaHei" w:hAnsi="Microsoft YaHei" w:eastAsia="Microsoft YaHei"/>
+                <w:sz w:val="18"/>
+              </w:rPr>
+              <w:t>差异率≤0.1%，补偿≤10min</w:t>
             </w:r>
           </w:p>
         </w:tc>
@@ -1558,7 +1895,14 @@
             <w:tcW w:type="dxa" w:w="1083"/>
           </w:tcPr>
           <w:p>
+            <w:pPr>
+              <w:spacing w:line="269" w:lineRule="auto" w:after="40"/>
+            </w:pPr>
             <w:r>
+              <w:rPr>
+                <w:rFonts w:ascii="Microsoft YaHei" w:hAnsi="Microsoft YaHei" w:eastAsia="Microsoft YaHei"/>
+                <w:sz w:val="18"/>
+              </w:rPr>
               <w:t>QAS-05</w:t>
             </w:r>
           </w:p>
@@ -1568,8 +1912,15 @@
             <w:tcW w:type="dxa" w:w="1083"/>
           </w:tcPr>
           <w:p>
+            <w:pPr>
+              <w:spacing w:line="269" w:lineRule="auto" w:after="40"/>
+            </w:pPr>
             <w:r>
-              <w:t>安全</w:t>
+              <w:rPr>
+                <w:rFonts w:ascii="Microsoft YaHei" w:hAnsi="Microsoft YaHei" w:eastAsia="Microsoft YaHei"/>
+                <w:sz w:val="18"/>
+              </w:rPr>
+              <w:t>安全性</w:t>
             </w:r>
           </w:p>
         </w:tc>
@@ -1578,8 +1929,15 @@
             <w:tcW w:type="dxa" w:w="1083"/>
           </w:tcPr>
           <w:p>
+            <w:pPr>
+              <w:spacing w:line="269" w:lineRule="auto" w:after="40"/>
+            </w:pPr>
             <w:r>
-              <w:t>顾客访问会员资料</w:t>
+              <w:rPr>
+                <w:rFonts w:ascii="Microsoft YaHei" w:hAnsi="Microsoft YaHei" w:eastAsia="Microsoft YaHei"/>
+                <w:sz w:val="18"/>
+              </w:rPr>
+              <w:t>访问会员资料与偏好</w:t>
             </w:r>
           </w:p>
         </w:tc>
@@ -1588,7 +1946,14 @@
             <w:tcW w:type="dxa" w:w="1083"/>
           </w:tcPr>
           <w:p>
+            <w:pPr>
+              <w:spacing w:line="269" w:lineRule="auto" w:after="40"/>
+            </w:pPr>
             <w:r>
+              <w:rPr>
+                <w:rFonts w:ascii="Microsoft YaHei" w:hAnsi="Microsoft YaHei" w:eastAsia="Microsoft YaHei"/>
+                <w:sz w:val="18"/>
+              </w:rPr>
               <w:t>顾客/攻击者</w:t>
             </w:r>
           </w:p>
@@ -1598,8 +1963,15 @@
             <w:tcW w:type="dxa" w:w="1083"/>
           </w:tcPr>
           <w:p>
+            <w:pPr>
+              <w:spacing w:line="269" w:lineRule="auto" w:after="40"/>
+            </w:pPr>
             <w:r>
-              <w:t>越权请求</w:t>
+              <w:rPr>
+                <w:rFonts w:ascii="Microsoft YaHei" w:hAnsi="Microsoft YaHei" w:eastAsia="Microsoft YaHei"/>
+                <w:sz w:val="18"/>
+              </w:rPr>
+              <w:t>越权查询或篡改请求</w:t>
             </w:r>
           </w:p>
         </w:tc>
@@ -1608,8 +1980,15 @@
             <w:tcW w:type="dxa" w:w="1083"/>
           </w:tcPr>
           <w:p>
+            <w:pPr>
+              <w:spacing w:line="269" w:lineRule="auto" w:after="40"/>
+            </w:pPr>
             <w:r>
-              <w:t>会员服务</w:t>
+              <w:rPr>
+                <w:rFonts w:ascii="Microsoft YaHei" w:hAnsi="Microsoft YaHei" w:eastAsia="Microsoft YaHei"/>
+                <w:sz w:val="18"/>
+              </w:rPr>
+              <w:t>会员服务/API网关</w:t>
             </w:r>
           </w:p>
         </w:tc>
@@ -1618,7 +1997,14 @@
             <w:tcW w:type="dxa" w:w="1083"/>
           </w:tcPr>
           <w:p>
+            <w:pPr>
+              <w:spacing w:line="269" w:lineRule="auto" w:after="40"/>
+            </w:pPr>
             <w:r>
+              <w:rPr>
+                <w:rFonts w:ascii="Microsoft YaHei" w:hAnsi="Microsoft YaHei" w:eastAsia="Microsoft YaHei"/>
+                <w:sz w:val="18"/>
+              </w:rPr>
               <w:t>生产环境</w:t>
             </w:r>
           </w:p>
@@ -1628,8 +2014,15 @@
             <w:tcW w:type="dxa" w:w="1083"/>
           </w:tcPr>
           <w:p>
+            <w:pPr>
+              <w:spacing w:line="269" w:lineRule="auto" w:after="40"/>
+            </w:pPr>
             <w:r>
-              <w:t>拒绝越权并记录审计</w:t>
+              <w:rPr>
+                <w:rFonts w:ascii="Microsoft YaHei" w:hAnsi="Microsoft YaHei" w:eastAsia="Microsoft YaHei"/>
+                <w:sz w:val="18"/>
+              </w:rPr>
+              <w:t>拒绝越权并写入审计日志</w:t>
             </w:r>
           </w:p>
         </w:tc>
@@ -1638,8 +2031,15 @@
             <w:tcW w:type="dxa" w:w="1083"/>
           </w:tcPr>
           <w:p>
+            <w:pPr>
+              <w:spacing w:line="269" w:lineRule="auto" w:after="40"/>
+            </w:pPr>
             <w:r>
-              <w:t>越权成功=0</w:t>
+              <w:rPr>
+                <w:rFonts w:ascii="Microsoft YaHei" w:hAnsi="Microsoft YaHei" w:eastAsia="Microsoft YaHei"/>
+                <w:sz w:val="18"/>
+              </w:rPr>
+              <w:t>越权成功=0，审计覆盖=100%</w:t>
             </w:r>
           </w:p>
         </w:tc>
@@ -1650,7 +2050,14 @@
             <w:tcW w:type="dxa" w:w="1083"/>
           </w:tcPr>
           <w:p>
+            <w:pPr>
+              <w:spacing w:line="269" w:lineRule="auto" w:after="40"/>
+            </w:pPr>
             <w:r>
+              <w:rPr>
+                <w:rFonts w:ascii="Microsoft YaHei" w:hAnsi="Microsoft YaHei" w:eastAsia="Microsoft YaHei"/>
+                <w:sz w:val="18"/>
+              </w:rPr>
               <w:t>QAS-06</w:t>
             </w:r>
           </w:p>
@@ -1660,8 +2067,15 @@
             <w:tcW w:type="dxa" w:w="1083"/>
           </w:tcPr>
           <w:p>
+            <w:pPr>
+              <w:spacing w:line="269" w:lineRule="auto" w:after="40"/>
+            </w:pPr>
             <w:r>
-              <w:t>隐私</w:t>
+              <w:rPr>
+                <w:rFonts w:ascii="Microsoft YaHei" w:hAnsi="Microsoft YaHei" w:eastAsia="Microsoft YaHei"/>
+                <w:sz w:val="18"/>
+              </w:rPr>
+              <w:t>隐私合规</w:t>
             </w:r>
           </w:p>
         </w:tc>
@@ -1670,7 +2084,14 @@
             <w:tcW w:type="dxa" w:w="1083"/>
           </w:tcPr>
           <w:p>
+            <w:pPr>
+              <w:spacing w:line="269" w:lineRule="auto" w:after="40"/>
+            </w:pPr>
             <w:r>
+              <w:rPr>
+                <w:rFonts w:ascii="Microsoft YaHei" w:hAnsi="Microsoft YaHei" w:eastAsia="Microsoft YaHei"/>
+                <w:sz w:val="18"/>
+              </w:rPr>
               <w:t>会员撤回营销授权</w:t>
             </w:r>
           </w:p>
@@ -1680,7 +2101,14 @@
             <w:tcW w:type="dxa" w:w="1083"/>
           </w:tcPr>
           <w:p>
+            <w:pPr>
+              <w:spacing w:line="269" w:lineRule="auto" w:after="40"/>
+            </w:pPr>
             <w:r>
+              <w:rPr>
+                <w:rFonts w:ascii="Microsoft YaHei" w:hAnsi="Microsoft YaHei" w:eastAsia="Microsoft YaHei"/>
+                <w:sz w:val="18"/>
+              </w:rPr>
               <w:t>会员</w:t>
             </w:r>
           </w:p>
@@ -1690,8 +2118,15 @@
             <w:tcW w:type="dxa" w:w="1083"/>
           </w:tcPr>
           <w:p>
+            <w:pPr>
+              <w:spacing w:line="269" w:lineRule="auto" w:after="40"/>
+            </w:pPr>
             <w:r>
-              <w:t>关闭授权</w:t>
+              <w:rPr>
+                <w:rFonts w:ascii="Microsoft YaHei" w:hAnsi="Microsoft YaHei" w:eastAsia="Microsoft YaHei"/>
+                <w:sz w:val="18"/>
+              </w:rPr>
+              <w:t>关闭营销或推荐授权</w:t>
             </w:r>
           </w:p>
         </w:tc>
@@ -1700,8 +2135,15 @@
             <w:tcW w:type="dxa" w:w="1083"/>
           </w:tcPr>
           <w:p>
+            <w:pPr>
+              <w:spacing w:line="269" w:lineRule="auto" w:after="40"/>
+            </w:pPr>
             <w:r>
-              <w:t>会员/营销服务</w:t>
+              <w:rPr>
+                <w:rFonts w:ascii="Microsoft YaHei" w:hAnsi="Microsoft YaHei" w:eastAsia="Microsoft YaHei"/>
+                <w:sz w:val="18"/>
+              </w:rPr>
+              <w:t>会员/通知/推荐服务</w:t>
             </w:r>
           </w:p>
         </w:tc>
@@ -1710,8 +2152,15 @@
             <w:tcW w:type="dxa" w:w="1083"/>
           </w:tcPr>
           <w:p>
+            <w:pPr>
+              <w:spacing w:line="269" w:lineRule="auto" w:after="40"/>
+            </w:pPr>
             <w:r>
-              <w:t>正常负载</w:t>
+              <w:rPr>
+                <w:rFonts w:ascii="Microsoft YaHei" w:hAnsi="Microsoft YaHei" w:eastAsia="Microsoft YaHei"/>
+                <w:sz w:val="18"/>
+              </w:rPr>
+              <w:t>任意客户端</w:t>
             </w:r>
           </w:p>
         </w:tc>
@@ -1720,8 +2169,15 @@
             <w:tcW w:type="dxa" w:w="1083"/>
           </w:tcPr>
           <w:p>
+            <w:pPr>
+              <w:spacing w:line="269" w:lineRule="auto" w:after="40"/>
+            </w:pPr>
             <w:r>
-              <w:t>停止营销通知</w:t>
+              <w:rPr>
+                <w:rFonts w:ascii="Microsoft YaHei" w:hAnsi="Microsoft YaHei" w:eastAsia="Microsoft YaHei"/>
+                <w:sz w:val="18"/>
+              </w:rPr>
+              <w:t>立即停止非必要推送并同步事件</w:t>
             </w:r>
           </w:p>
         </w:tc>
@@ -1730,8 +2186,15 @@
             <w:tcW w:type="dxa" w:w="1083"/>
           </w:tcPr>
           <w:p>
+            <w:pPr>
+              <w:spacing w:line="269" w:lineRule="auto" w:after="40"/>
+            </w:pPr>
             <w:r>
-              <w:t>≤1分钟生效</w:t>
+              <w:rPr>
+                <w:rFonts w:ascii="Microsoft YaHei" w:hAnsi="Microsoft YaHei" w:eastAsia="Microsoft YaHei"/>
+                <w:sz w:val="18"/>
+              </w:rPr>
+              <w:t>1min 内生效，保留撤回记录</w:t>
             </w:r>
           </w:p>
         </w:tc>
@@ -1742,7 +2205,14 @@
             <w:tcW w:type="dxa" w:w="1083"/>
           </w:tcPr>
           <w:p>
+            <w:pPr>
+              <w:spacing w:line="269" w:lineRule="auto" w:after="40"/>
+            </w:pPr>
             <w:r>
+              <w:rPr>
+                <w:rFonts w:ascii="Microsoft YaHei" w:hAnsi="Microsoft YaHei" w:eastAsia="Microsoft YaHei"/>
+                <w:sz w:val="18"/>
+              </w:rPr>
               <w:t>QAS-07</w:t>
             </w:r>
           </w:p>
@@ -1752,8 +2222,15 @@
             <w:tcW w:type="dxa" w:w="1083"/>
           </w:tcPr>
           <w:p>
+            <w:pPr>
+              <w:spacing w:line="269" w:lineRule="auto" w:after="40"/>
+            </w:pPr>
             <w:r>
-              <w:t>可观测</w:t>
+              <w:rPr>
+                <w:rFonts w:ascii="Microsoft YaHei" w:hAnsi="Microsoft YaHei" w:eastAsia="Microsoft YaHei"/>
+                <w:sz w:val="18"/>
+              </w:rPr>
+              <w:t>可靠性</w:t>
             </w:r>
           </w:p>
         </w:tc>
@@ -1762,8 +2239,15 @@
             <w:tcW w:type="dxa" w:w="1083"/>
           </w:tcPr>
           <w:p>
+            <w:pPr>
+              <w:spacing w:line="269" w:lineRule="auto" w:after="40"/>
+            </w:pPr>
             <w:r>
-              <w:t>预约失败率异常升高</w:t>
+              <w:rPr>
+                <w:rFonts w:ascii="Microsoft YaHei" w:hAnsi="Microsoft YaHei" w:eastAsia="Microsoft YaHei"/>
+                <w:sz w:val="18"/>
+              </w:rPr>
+              <w:t>通知服务短暂不可用</w:t>
             </w:r>
           </w:p>
         </w:tc>
@@ -1772,8 +2256,15 @@
             <w:tcW w:type="dxa" w:w="1083"/>
           </w:tcPr>
           <w:p>
+            <w:pPr>
+              <w:spacing w:line="269" w:lineRule="auto" w:after="40"/>
+            </w:pPr>
             <w:r>
-              <w:t>监控系统</w:t>
+              <w:rPr>
+                <w:rFonts w:ascii="Microsoft YaHei" w:hAnsi="Microsoft YaHei" w:eastAsia="Microsoft YaHei"/>
+                <w:sz w:val="18"/>
+              </w:rPr>
+              <w:t>短信/站内信通道</w:t>
             </w:r>
           </w:p>
         </w:tc>
@@ -1782,8 +2273,15 @@
             <w:tcW w:type="dxa" w:w="1083"/>
           </w:tcPr>
           <w:p>
+            <w:pPr>
+              <w:spacing w:line="269" w:lineRule="auto" w:after="40"/>
+            </w:pPr>
             <w:r>
-              <w:t>失败率&gt;2%</w:t>
+              <w:rPr>
+                <w:rFonts w:ascii="Microsoft YaHei" w:hAnsi="Microsoft YaHei" w:eastAsia="Microsoft YaHei"/>
+                <w:sz w:val="18"/>
+              </w:rPr>
+              <w:t>发送失败或限流</w:t>
             </w:r>
           </w:p>
         </w:tc>
@@ -1792,8 +2290,15 @@
             <w:tcW w:type="dxa" w:w="1083"/>
           </w:tcPr>
           <w:p>
+            <w:pPr>
+              <w:spacing w:line="269" w:lineRule="auto" w:after="40"/>
+            </w:pPr>
             <w:r>
-              <w:t>全链路</w:t>
+              <w:rPr>
+                <w:rFonts w:ascii="Microsoft YaHei" w:hAnsi="Microsoft YaHei" w:eastAsia="Microsoft YaHei"/>
+                <w:sz w:val="18"/>
+              </w:rPr>
+              <w:t>通知服务/消息队列</w:t>
             </w:r>
           </w:p>
         </w:tc>
@@ -1802,8 +2307,15 @@
             <w:tcW w:type="dxa" w:w="1083"/>
           </w:tcPr>
           <w:p>
+            <w:pPr>
+              <w:spacing w:line="269" w:lineRule="auto" w:after="40"/>
+            </w:pPr>
             <w:r>
-              <w:t>高峰期</w:t>
+              <w:rPr>
+                <w:rFonts w:ascii="Microsoft YaHei" w:hAnsi="Microsoft YaHei" w:eastAsia="Microsoft YaHei"/>
+                <w:sz w:val="18"/>
+              </w:rPr>
+              <w:t>支付成功后</w:t>
             </w:r>
           </w:p>
         </w:tc>
@@ -1812,8 +2324,15 @@
             <w:tcW w:type="dxa" w:w="1083"/>
           </w:tcPr>
           <w:p>
+            <w:pPr>
+              <w:spacing w:line="269" w:lineRule="auto" w:after="40"/>
+            </w:pPr>
             <w:r>
-              <w:t>触发告警并定位 trace</w:t>
+              <w:rPr>
+                <w:rFonts w:ascii="Microsoft YaHei" w:hAnsi="Microsoft YaHei" w:eastAsia="Microsoft YaHei"/>
+                <w:sz w:val="18"/>
+              </w:rPr>
+              <w:t>进入重试队列并可人工补发</w:t>
             </w:r>
           </w:p>
         </w:tc>
@@ -1822,8 +2341,15 @@
             <w:tcW w:type="dxa" w:w="1083"/>
           </w:tcPr>
           <w:p>
+            <w:pPr>
+              <w:spacing w:line="269" w:lineRule="auto" w:after="40"/>
+            </w:pPr>
             <w:r>
-              <w:t>5分钟内告警</w:t>
+              <w:rPr>
+                <w:rFonts w:ascii="Microsoft YaHei" w:hAnsi="Microsoft YaHei" w:eastAsia="Microsoft YaHei"/>
+                <w:sz w:val="18"/>
+              </w:rPr>
+              <w:t>重试成功率≥99%，死信可追踪</w:t>
             </w:r>
           </w:p>
         </w:tc>
@@ -1834,7 +2360,14 @@
             <w:tcW w:type="dxa" w:w="1083"/>
           </w:tcPr>
           <w:p>
+            <w:pPr>
+              <w:spacing w:line="269" w:lineRule="auto" w:after="40"/>
+            </w:pPr>
             <w:r>
+              <w:rPr>
+                <w:rFonts w:ascii="Microsoft YaHei" w:hAnsi="Microsoft YaHei" w:eastAsia="Microsoft YaHei"/>
+                <w:sz w:val="18"/>
+              </w:rPr>
               <w:t>QAS-08</w:t>
             </w:r>
           </w:p>
@@ -1844,8 +2377,15 @@
             <w:tcW w:type="dxa" w:w="1083"/>
           </w:tcPr>
           <w:p>
+            <w:pPr>
+              <w:spacing w:line="269" w:lineRule="auto" w:after="40"/>
+            </w:pPr>
             <w:r>
-              <w:t>易用性</w:t>
+              <w:rPr>
+                <w:rFonts w:ascii="Microsoft YaHei" w:hAnsi="Microsoft YaHei" w:eastAsia="Microsoft YaHei"/>
+                <w:sz w:val="18"/>
+              </w:rPr>
+              <w:t>可维护性</w:t>
             </w:r>
           </w:p>
         </w:tc>
@@ -1854,8 +2394,15 @@
             <w:tcW w:type="dxa" w:w="1083"/>
           </w:tcPr>
           <w:p>
+            <w:pPr>
+              <w:spacing w:line="269" w:lineRule="auto" w:after="40"/>
+            </w:pPr>
             <w:r>
-              <w:t>普通顾客完成预约</w:t>
+              <w:rPr>
+                <w:rFonts w:ascii="Microsoft YaHei" w:hAnsi="Microsoft YaHei" w:eastAsia="Microsoft YaHei"/>
+                <w:sz w:val="18"/>
+              </w:rPr>
+              <w:t>修改预约取消规则</w:t>
             </w:r>
           </w:p>
         </w:tc>
@@ -1864,8 +2411,15 @@
             <w:tcW w:type="dxa" w:w="1083"/>
           </w:tcPr>
           <w:p>
+            <w:pPr>
+              <w:spacing w:line="269" w:lineRule="auto" w:after="40"/>
+            </w:pPr>
             <w:r>
-              <w:t>顾客</w:t>
+              <w:rPr>
+                <w:rFonts w:ascii="Microsoft YaHei" w:hAnsi="Microsoft YaHei" w:eastAsia="Microsoft YaHei"/>
+                <w:sz w:val="18"/>
+              </w:rPr>
+              <w:t>开发者</w:t>
             </w:r>
           </w:p>
         </w:tc>
@@ -1874,8 +2428,15 @@
             <w:tcW w:type="dxa" w:w="1083"/>
           </w:tcPr>
           <w:p>
+            <w:pPr>
+              <w:spacing w:line="269" w:lineRule="auto" w:after="40"/>
+            </w:pPr>
             <w:r>
-              <w:t>首次使用</w:t>
+              <w:rPr>
+                <w:rFonts w:ascii="Microsoft YaHei" w:hAnsi="Microsoft YaHei" w:eastAsia="Microsoft YaHei"/>
+                <w:sz w:val="18"/>
+              </w:rPr>
+              <w:t>规则变更上线</w:t>
             </w:r>
           </w:p>
         </w:tc>
@@ -1884,8 +2445,15 @@
             <w:tcW w:type="dxa" w:w="1083"/>
           </w:tcPr>
           <w:p>
+            <w:pPr>
+              <w:spacing w:line="269" w:lineRule="auto" w:after="40"/>
+            </w:pPr>
             <w:r>
-              <w:t>顾客端</w:t>
+              <w:rPr>
+                <w:rFonts w:ascii="Microsoft YaHei" w:hAnsi="Microsoft YaHei" w:eastAsia="Microsoft YaHei"/>
+                <w:sz w:val="18"/>
+              </w:rPr>
+              <w:t>预约策略组件</w:t>
             </w:r>
           </w:p>
         </w:tc>
@@ -1894,8 +2462,15 @@
             <w:tcW w:type="dxa" w:w="1083"/>
           </w:tcPr>
           <w:p>
+            <w:pPr>
+              <w:spacing w:line="269" w:lineRule="auto" w:after="40"/>
+            </w:pPr>
             <w:r>
-              <w:t>正常网络</w:t>
+              <w:rPr>
+                <w:rFonts w:ascii="Microsoft YaHei" w:hAnsi="Microsoft YaHei" w:eastAsia="Microsoft YaHei"/>
+                <w:sz w:val="18"/>
+              </w:rPr>
+              <w:t>迭代发布</w:t>
             </w:r>
           </w:p>
         </w:tc>
@@ -1904,8 +2479,15 @@
             <w:tcW w:type="dxa" w:w="1083"/>
           </w:tcPr>
           <w:p>
+            <w:pPr>
+              <w:spacing w:line="269" w:lineRule="auto" w:after="40"/>
+            </w:pPr>
             <w:r>
-              <w:t>完成预约并收到通知</w:t>
+              <w:rPr>
+                <w:rFonts w:ascii="Microsoft YaHei" w:hAnsi="Microsoft YaHei" w:eastAsia="Microsoft YaHei"/>
+                <w:sz w:val="18"/>
+              </w:rPr>
+              <w:t>仅修改策略模块和契约测试</w:t>
             </w:r>
           </w:p>
         </w:tc>
@@ -1914,8 +2496,15 @@
             <w:tcW w:type="dxa" w:w="1083"/>
           </w:tcPr>
           <w:p>
+            <w:pPr>
+              <w:spacing w:line="269" w:lineRule="auto" w:after="40"/>
+            </w:pPr>
             <w:r>
-              <w:t>≤3分钟</w:t>
+              <w:rPr>
+                <w:rFonts w:ascii="Microsoft YaHei" w:hAnsi="Microsoft YaHei" w:eastAsia="Microsoft YaHei"/>
+                <w:sz w:val="18"/>
+              </w:rPr>
+              <w:t>影响模块≤2 个，回归用例全通过</w:t>
             </w:r>
           </w:p>
         </w:tc>
@@ -1926,7 +2515,14 @@
             <w:tcW w:type="dxa" w:w="1083"/>
           </w:tcPr>
           <w:p>
+            <w:pPr>
+              <w:spacing w:line="269" w:lineRule="auto" w:after="40"/>
+            </w:pPr>
             <w:r>
+              <w:rPr>
+                <w:rFonts w:ascii="Microsoft YaHei" w:hAnsi="Microsoft YaHei" w:eastAsia="Microsoft YaHei"/>
+                <w:sz w:val="18"/>
+              </w:rPr>
               <w:t>QAS-09</w:t>
             </w:r>
           </w:p>
@@ -1936,8 +2532,15 @@
             <w:tcW w:type="dxa" w:w="1083"/>
           </w:tcPr>
           <w:p>
+            <w:pPr>
+              <w:spacing w:line="269" w:lineRule="auto" w:after="40"/>
+            </w:pPr>
             <w:r>
-              <w:t>可维护</w:t>
+              <w:rPr>
+                <w:rFonts w:ascii="Microsoft YaHei" w:hAnsi="Microsoft YaHei" w:eastAsia="Microsoft YaHei"/>
+                <w:sz w:val="18"/>
+              </w:rPr>
+              <w:t>可观测性</w:t>
             </w:r>
           </w:p>
         </w:tc>
@@ -1946,8 +2549,15 @@
             <w:tcW w:type="dxa" w:w="1083"/>
           </w:tcPr>
           <w:p>
+            <w:pPr>
+              <w:spacing w:line="269" w:lineRule="auto" w:after="40"/>
+            </w:pPr>
             <w:r>
-              <w:t>接口变更</w:t>
+              <w:rPr>
+                <w:rFonts w:ascii="Microsoft YaHei" w:hAnsi="Microsoft YaHei" w:eastAsia="Microsoft YaHei"/>
+                <w:sz w:val="18"/>
+              </w:rPr>
+              <w:t>预约失败率异常升高</w:t>
             </w:r>
           </w:p>
         </w:tc>
@@ -1956,8 +2566,15 @@
             <w:tcW w:type="dxa" w:w="1083"/>
           </w:tcPr>
           <w:p>
+            <w:pPr>
+              <w:spacing w:line="269" w:lineRule="auto" w:after="40"/>
+            </w:pPr>
             <w:r>
-              <w:t>开发团队</w:t>
+              <w:rPr>
+                <w:rFonts w:ascii="Microsoft YaHei" w:hAnsi="Microsoft YaHei" w:eastAsia="Microsoft YaHei"/>
+                <w:sz w:val="18"/>
+              </w:rPr>
+              <w:t>监控系统</w:t>
             </w:r>
           </w:p>
         </w:tc>
@@ -1966,8 +2583,15 @@
             <w:tcW w:type="dxa" w:w="1083"/>
           </w:tcPr>
           <w:p>
+            <w:pPr>
+              <w:spacing w:line="269" w:lineRule="auto" w:after="40"/>
+            </w:pPr>
             <w:r>
-              <w:t>新增字段</w:t>
+              <w:rPr>
+                <w:rFonts w:ascii="Microsoft YaHei" w:hAnsi="Microsoft YaHei" w:eastAsia="Microsoft YaHei"/>
+                <w:sz w:val="18"/>
+              </w:rPr>
+              <w:t>失败率超过阈值</w:t>
             </w:r>
           </w:p>
         </w:tc>
@@ -1976,8 +2600,15 @@
             <w:tcW w:type="dxa" w:w="1083"/>
           </w:tcPr>
           <w:p>
+            <w:pPr>
+              <w:spacing w:line="269" w:lineRule="auto" w:after="40"/>
+            </w:pPr>
             <w:r>
-              <w:t>API契约</w:t>
+              <w:rPr>
+                <w:rFonts w:ascii="Microsoft YaHei" w:hAnsi="Microsoft YaHei" w:eastAsia="Microsoft YaHei"/>
+                <w:sz w:val="18"/>
+              </w:rPr>
+              <w:t>网关/预约/支付/通知链路</w:t>
             </w:r>
           </w:p>
         </w:tc>
@@ -1986,8 +2617,15 @@
             <w:tcW w:type="dxa" w:w="1083"/>
           </w:tcPr>
           <w:p>
+            <w:pPr>
+              <w:spacing w:line="269" w:lineRule="auto" w:after="40"/>
+            </w:pPr>
             <w:r>
-              <w:t>迭代期</w:t>
+              <w:rPr>
+                <w:rFonts w:ascii="Microsoft YaHei" w:hAnsi="Microsoft YaHei" w:eastAsia="Microsoft YaHei"/>
+                <w:sz w:val="18"/>
+              </w:rPr>
+              <w:t>生产高峰</w:t>
             </w:r>
           </w:p>
         </w:tc>
@@ -1996,8 +2634,15 @@
             <w:tcW w:type="dxa" w:w="1083"/>
           </w:tcPr>
           <w:p>
+            <w:pPr>
+              <w:spacing w:line="269" w:lineRule="auto" w:after="40"/>
+            </w:pPr>
             <w:r>
-              <w:t>兼容旧客户端</w:t>
+              <w:rPr>
+                <w:rFonts w:ascii="Microsoft YaHei" w:hAnsi="Microsoft YaHei" w:eastAsia="Microsoft YaHei"/>
+                <w:sz w:val="18"/>
+              </w:rPr>
+              <w:t>触发告警并定位 traceId</w:t>
             </w:r>
           </w:p>
         </w:tc>
@@ -2006,8 +2651,15 @@
             <w:tcW w:type="dxa" w:w="1083"/>
           </w:tcPr>
           <w:p>
+            <w:pPr>
+              <w:spacing w:line="269" w:lineRule="auto" w:after="40"/>
+            </w:pPr>
             <w:r>
-              <w:t>无破坏性变更</w:t>
+              <w:rPr>
+                <w:rFonts w:ascii="Microsoft YaHei" w:hAnsi="Microsoft YaHei" w:eastAsia="Microsoft YaHei"/>
+                <w:sz w:val="18"/>
+              </w:rPr>
+              <w:t>5min 内告警，链路完整率≥95%</w:t>
             </w:r>
           </w:p>
         </w:tc>
@@ -2018,7 +2670,14 @@
             <w:tcW w:type="dxa" w:w="1083"/>
           </w:tcPr>
           <w:p>
+            <w:pPr>
+              <w:spacing w:line="269" w:lineRule="auto" w:after="40"/>
+            </w:pPr>
             <w:r>
+              <w:rPr>
+                <w:rFonts w:ascii="Microsoft YaHei" w:hAnsi="Microsoft YaHei" w:eastAsia="Microsoft YaHei"/>
+                <w:sz w:val="18"/>
+              </w:rPr>
               <w:t>QAS-10</w:t>
             </w:r>
           </w:p>
@@ -2028,8 +2687,15 @@
             <w:tcW w:type="dxa" w:w="1083"/>
           </w:tcPr>
           <w:p>
+            <w:pPr>
+              <w:spacing w:line="269" w:lineRule="auto" w:after="40"/>
+            </w:pPr>
             <w:r>
-              <w:t>成本</w:t>
+              <w:rPr>
+                <w:rFonts w:ascii="Microsoft YaHei" w:hAnsi="Microsoft YaHei" w:eastAsia="Microsoft YaHei"/>
+                <w:sz w:val="18"/>
+              </w:rPr>
+              <w:t>容量弹性</w:t>
             </w:r>
           </w:p>
         </w:tc>
@@ -2038,8 +2704,15 @@
             <w:tcW w:type="dxa" w:w="1083"/>
           </w:tcPr>
           <w:p>
+            <w:pPr>
+              <w:spacing w:line="269" w:lineRule="auto" w:after="40"/>
+            </w:pPr>
             <w:r>
-              <w:t>运营看板查询大促数据</w:t>
+              <w:rPr>
+                <w:rFonts w:ascii="Microsoft YaHei" w:hAnsi="Microsoft YaHei" w:eastAsia="Microsoft YaHei"/>
+                <w:sz w:val="18"/>
+              </w:rPr>
+              <w:t>运营活动带来流量突增</w:t>
             </w:r>
           </w:p>
         </w:tc>
@@ -2048,8 +2721,15 @@
             <w:tcW w:type="dxa" w:w="1083"/>
           </w:tcPr>
           <w:p>
+            <w:pPr>
+              <w:spacing w:line="269" w:lineRule="auto" w:after="40"/>
+            </w:pPr>
             <w:r>
-              <w:t>运营</w:t>
+              <w:rPr>
+                <w:rFonts w:ascii="Microsoft YaHei" w:hAnsi="Microsoft YaHei" w:eastAsia="Microsoft YaHei"/>
+                <w:sz w:val="18"/>
+              </w:rPr>
+              <w:t>市场活动</w:t>
             </w:r>
           </w:p>
         </w:tc>
@@ -2058,8 +2738,15 @@
             <w:tcW w:type="dxa" w:w="1083"/>
           </w:tcPr>
           <w:p>
+            <w:pPr>
+              <w:spacing w:line="269" w:lineRule="auto" w:after="40"/>
+            </w:pPr>
             <w:r>
-              <w:t>跨门店查询</w:t>
+              <w:rPr>
+                <w:rFonts w:ascii="Microsoft YaHei" w:hAnsi="Microsoft YaHei" w:eastAsia="Microsoft YaHei"/>
+                <w:sz w:val="18"/>
+              </w:rPr>
+              <w:t>流量升至平时 3 倍</w:t>
             </w:r>
           </w:p>
         </w:tc>
@@ -2068,8 +2755,15 @@
             <w:tcW w:type="dxa" w:w="1083"/>
           </w:tcPr>
           <w:p>
+            <w:pPr>
+              <w:spacing w:line="269" w:lineRule="auto" w:after="40"/>
+            </w:pPr>
             <w:r>
-              <w:t>分析读模型</w:t>
+              <w:rPr>
+                <w:rFonts w:ascii="Microsoft YaHei" w:hAnsi="Microsoft YaHei" w:eastAsia="Microsoft YaHei"/>
+                <w:sz w:val="18"/>
+              </w:rPr>
+              <w:t>网关/预约/缓存</w:t>
             </w:r>
           </w:p>
         </w:tc>
@@ -2078,8 +2772,15 @@
             <w:tcW w:type="dxa" w:w="1083"/>
           </w:tcPr>
           <w:p>
+            <w:pPr>
+              <w:spacing w:line="269" w:lineRule="auto" w:after="40"/>
+            </w:pPr>
             <w:r>
-              <w:t>活动后</w:t>
+              <w:rPr>
+                <w:rFonts w:ascii="Microsoft YaHei" w:hAnsi="Microsoft YaHei" w:eastAsia="Microsoft YaHei"/>
+                <w:sz w:val="18"/>
+              </w:rPr>
+              <w:t>活动期间</w:t>
             </w:r>
           </w:p>
         </w:tc>
@@ -2088,8 +2789,15 @@
             <w:tcW w:type="dxa" w:w="1083"/>
           </w:tcPr>
           <w:p>
+            <w:pPr>
+              <w:spacing w:line="269" w:lineRule="auto" w:after="40"/>
+            </w:pPr>
             <w:r>
-              <w:t>返回汇总指标</w:t>
+              <w:rPr>
+                <w:rFonts w:ascii="Microsoft YaHei" w:hAnsi="Microsoft YaHei" w:eastAsia="Microsoft YaHei"/>
+                <w:sz w:val="18"/>
+              </w:rPr>
+              <w:t>限流、缓存和扩容保护核心链路</w:t>
             </w:r>
           </w:p>
         </w:tc>
@@ -2098,14 +2806,25 @@
             <w:tcW w:type="dxa" w:w="1083"/>
           </w:tcPr>
           <w:p>
+            <w:pPr>
+              <w:spacing w:line="269" w:lineRule="auto" w:after="40"/>
+            </w:pPr>
             <w:r>
-              <w:t>≤5秒</w:t>
+              <w:rPr>
+                <w:rFonts w:ascii="Microsoft YaHei" w:hAnsi="Microsoft YaHei" w:eastAsia="Microsoft YaHei"/>
+                <w:sz w:val="18"/>
+              </w:rPr>
+              <w:t>核心链路可用，非核心可降级</w:t>
             </w:r>
           </w:p>
         </w:tc>
       </w:tr>
     </w:tbl>
-    <w:p/>
+    <w:p>
+      <w:pPr>
+        <w:spacing w:after="80" w:line="276" w:lineRule="auto"/>
+      </w:pPr>
+    </w:p>
     <w:tbl>
       <w:tblPr>
         <w:tblW w:type="auto" w:w="0"/>
@@ -2129,18 +2848,39 @@
             <w:vAlign w:val="top"/>
           </w:tcPr>
           <w:p>
+            <w:pPr>
+              <w:spacing w:line="269" w:lineRule="auto" w:after="40"/>
+            </w:pPr>
             <w:r>
-              <w:t>架构关注点清单：预约写入热点、库存/桌位并发控制、支付回调幂等、跨服务 traceId、会员隐私授权、运营读模型延迟、门店配置灰度、消息积压和失败重试。</w:t>
+              <w:rPr>
+                <w:rFonts w:ascii="Microsoft YaHei" w:hAnsi="Microsoft YaHei" w:eastAsia="Microsoft YaHei"/>
+                <w:sz w:val="18"/>
+              </w:rPr>
+              <w:t>架构关注点清单：</w:t>
+              <w:br/>
+              <w:t>1. 预约写入热点：需用容量锁、幂等键和候补策略避免同一桌位超卖。</w:t>
+              <w:br/>
+              <w:t>2. 支付回调幂等：订单、预约、押金状态必须可补偿、可对账。</w:t>
+              <w:br/>
+              <w:t>3. 会员隐私边界：手机号、偏好、备注等只在会员上下文拥有，其他服务通过脱敏视图访问。</w:t>
+              <w:br/>
+              <w:t>4. 新门店上线：门店规则、桌位与菜单配置需要灰度、校验与快速回滚。</w:t>
+              <w:br/>
+              <w:t>5. 可观测性：网关、服务、消息队列和数据库需要统一 traceId 与指标口径。</w:t>
             </w:r>
           </w:p>
         </w:tc>
       </w:tr>
     </w:tbl>
-    <w:p/>
+    <w:p>
+      <w:pPr>
+        <w:spacing w:after="80" w:line="276" w:lineRule="auto"/>
+      </w:pPr>
+    </w:p>
     <w:p>
       <w:pPr>
         <w:keepNext/>
-        <w:spacing w:before="280" w:after="120"/>
+        <w:spacing w:before="280" w:after="80" w:line="276" w:lineRule="auto"/>
         <w:pBdr>
           <w:bottom w:val="single" w:sz="8" w:space="4" w:color="1A7A3D"/>
         </w:pBdr>
@@ -2149,7 +2889,6 @@
         <w:rPr>
           <w:rFonts w:ascii="Microsoft YaHei" w:hAnsi="Microsoft YaHei" w:eastAsia="Microsoft YaHei"/>
           <w:b/>
-          <w:color w:val="1A7A3D"/>
           <w:sz w:val="36"/>
         </w:rPr>
         <w:t>4  优先级裁决与签字栏</w:t>
@@ -2178,14 +2917,30 @@
             <w:vAlign w:val="top"/>
           </w:tcPr>
           <w:p>
+            <w:pPr>
+              <w:spacing w:line="269" w:lineRule="auto" w:after="40"/>
+            </w:pPr>
             <w:r>
-              <w:t>评审参与人：戴正宇（架构设计/记录）、AI 模拟 CTO（反向质询）、AI 模拟测试负责人（可测试性评审）。裁决日期：2026-05-14。负责人签字：戴正宇。</w:t>
+              <w:rPr>
+                <w:rFonts w:ascii="Microsoft YaHei" w:hAnsi="Microsoft YaHei" w:eastAsia="Microsoft YaHei"/>
+                <w:sz w:val="18"/>
+              </w:rPr>
+              <w:t>优先级裁决：本次架构设计优先满足 QAS-01、QAS-02、QAS-04、QAS-05、QAS-09。低优先级场景允许通过运营流程或人工补偿短期兜底，但必须在 ADR 中记录取舍理由。</w:t>
+              <w:br/>
+              <w:br/>
+              <w:t>评审参与人：戴正宇（架构设计/记录）、AI 模拟 CTO（反向质询）、AI 模拟测试负责人（可测试性检查）。</w:t>
+              <w:br/>
+              <w:t>评审结论：通过。后续 D2-3 使用上述 QAS 作为 ATAM 场景输入。</w:t>
             </w:r>
           </w:p>
         </w:tc>
       </w:tr>
     </w:tbl>
-    <w:p/>
+    <w:p>
+      <w:pPr>
+        <w:spacing w:after="80" w:line="276" w:lineRule="auto"/>
+      </w:pPr>
+    </w:p>
     <w:sectPr>
       <w:pgSz w:w="12240" w:h="15840"/>
       <w:pgMar w:top="1134" w:right="1247" w:bottom="1134" w:left="1247" w:header="720" w:footer="720" w:gutter="0"/>

</xml_diff>

<commit_message>
docs(lab2): use provided architecture figures
</commit_message>
<xml_diff>
--- a/实验二_软件架构设计与微服务拆分/D2-1_质量属性场景与效用树.docx
+++ b/实验二_软件架构设计与微服务拆分/D2-1_质量属性场景与效用树.docx
@@ -816,7 +816,7 @@
               </w:rPr>
               <w:drawing>
                 <wp:inline xmlns:a="http://schemas.openxmlformats.org/drawingml/2006/main" xmlns:pic="http://schemas.openxmlformats.org/drawingml/2006/picture">
-                  <wp:extent cx="4983480" cy="2958941"/>
+                  <wp:extent cx="5897880" cy="3934481"/>
                   <wp:docPr id="1" name="Picture 1"/>
                   <wp:cNvGraphicFramePr>
                     <a:graphicFrameLocks noChangeAspect="1"/>
@@ -837,7 +837,7 @@
                         <pic:spPr>
                           <a:xfrm>
                             <a:off x="0" y="0"/>
-                            <a:ext cx="4983480" cy="2958941"/>
+                            <a:ext cx="5897880" cy="3934481"/>
                           </a:xfrm>
                           <a:prstGeom prst="rect"/>
                         </pic:spPr>

</xml_diff>

<commit_message>
docs(lab2): expand architecture explanations
</commit_message>
<xml_diff>
--- a/实验二_软件架构设计与微服务拆分/D2-1_质量属性场景与效用树.docx
+++ b/实验二_软件架构设计与微服务拆分/D2-1_质量属性场景与效用树.docx
@@ -4,7 +4,7 @@
   <w:body>
     <w:p>
       <w:pPr>
-        <w:spacing w:before="800" w:after="80" w:line="276" w:lineRule="auto"/>
+        <w:spacing w:before="800" w:after="60" w:line="269" w:lineRule="auto"/>
         <w:jc w:val="center"/>
       </w:pPr>
       <w:r>
@@ -19,7 +19,7 @@
     </w:p>
     <w:p>
       <w:pPr>
-        <w:spacing w:after="80" w:line="276" w:lineRule="auto"/>
+        <w:spacing w:after="60" w:line="269" w:lineRule="auto"/>
         <w:jc w:val="center"/>
       </w:pPr>
       <w:r>
@@ -34,7 +34,7 @@
     </w:p>
     <w:p>
       <w:pPr>
-        <w:spacing w:after="80" w:line="276" w:lineRule="auto"/>
+        <w:spacing w:after="60" w:line="269" w:lineRule="auto"/>
         <w:jc w:val="center"/>
       </w:pPr>
       <w:r>
@@ -49,7 +49,7 @@
     </w:p>
     <w:p>
       <w:pPr>
-        <w:spacing w:after="80" w:line="276" w:lineRule="auto"/>
+        <w:spacing w:after="60" w:line="269" w:lineRule="auto"/>
         <w:jc w:val="center"/>
       </w:pPr>
       <w:r>
@@ -64,7 +64,7 @@
     </w:p>
     <w:p>
       <w:pPr>
-        <w:spacing w:after="80" w:line="276" w:lineRule="auto"/>
+        <w:spacing w:after="60" w:line="269" w:lineRule="auto"/>
         <w:jc w:val="center"/>
       </w:pPr>
       <w:r>
@@ -79,7 +79,7 @@
     </w:p>
     <w:p>
       <w:pPr>
-        <w:spacing w:after="80" w:line="276" w:lineRule="auto"/>
+        <w:spacing w:after="60" w:line="269" w:lineRule="auto"/>
       </w:pPr>
     </w:p>
     <w:tbl>
@@ -93,6 +93,9 @@
         <w:gridCol w:w="4873"/>
       </w:tblGrid>
       <w:tr>
+        <w:trPr>
+          <w:tblHeader w:val="true"/>
+        </w:trPr>
         <w:tc>
           <w:tcPr>
             <w:tcW w:type="dxa" w:w="1984"/>
@@ -107,7 +110,7 @@
           </w:tcPr>
           <w:p>
             <w:pPr>
-              <w:spacing w:after="40" w:line="269" w:lineRule="auto"/>
+              <w:spacing w:after="20" w:line="259" w:lineRule="auto"/>
               <w:jc w:val="center"/>
             </w:pPr>
             <w:r>
@@ -135,7 +138,7 @@
           </w:tcPr>
           <w:p>
             <w:pPr>
-              <w:spacing w:after="40" w:line="269" w:lineRule="auto"/>
+              <w:spacing w:after="20" w:line="259" w:lineRule="auto"/>
             </w:pPr>
             <w:r>
               <w:rPr>
@@ -164,7 +167,7 @@
           </w:tcPr>
           <w:p>
             <w:pPr>
-              <w:spacing w:after="40" w:line="269" w:lineRule="auto"/>
+              <w:spacing w:after="20" w:line="259" w:lineRule="auto"/>
               <w:jc w:val="center"/>
             </w:pPr>
             <w:r>
@@ -192,7 +195,7 @@
           </w:tcPr>
           <w:p>
             <w:pPr>
-              <w:spacing w:after="40" w:line="269" w:lineRule="auto"/>
+              <w:spacing w:after="20" w:line="259" w:lineRule="auto"/>
             </w:pPr>
             <w:r>
               <w:rPr>
@@ -221,7 +224,7 @@
           </w:tcPr>
           <w:p>
             <w:pPr>
-              <w:spacing w:after="40" w:line="269" w:lineRule="auto"/>
+              <w:spacing w:after="20" w:line="259" w:lineRule="auto"/>
               <w:jc w:val="center"/>
             </w:pPr>
             <w:r>
@@ -249,7 +252,7 @@
           </w:tcPr>
           <w:p>
             <w:pPr>
-              <w:spacing w:after="40" w:line="269" w:lineRule="auto"/>
+              <w:spacing w:after="20" w:line="259" w:lineRule="auto"/>
             </w:pPr>
             <w:r>
               <w:rPr>
@@ -278,7 +281,7 @@
           </w:tcPr>
           <w:p>
             <w:pPr>
-              <w:spacing w:after="40" w:line="269" w:lineRule="auto"/>
+              <w:spacing w:after="20" w:line="259" w:lineRule="auto"/>
               <w:jc w:val="center"/>
             </w:pPr>
             <w:r>
@@ -306,7 +309,7 @@
           </w:tcPr>
           <w:p>
             <w:pPr>
-              <w:spacing w:after="40" w:line="269" w:lineRule="auto"/>
+              <w:spacing w:after="20" w:line="259" w:lineRule="auto"/>
             </w:pPr>
             <w:r>
               <w:rPr>
@@ -335,7 +338,7 @@
           </w:tcPr>
           <w:p>
             <w:pPr>
-              <w:spacing w:after="40" w:line="269" w:lineRule="auto"/>
+              <w:spacing w:after="20" w:line="259" w:lineRule="auto"/>
               <w:jc w:val="center"/>
             </w:pPr>
             <w:r>
@@ -363,7 +366,7 @@
           </w:tcPr>
           <w:p>
             <w:pPr>
-              <w:spacing w:after="40" w:line="269" w:lineRule="auto"/>
+              <w:spacing w:after="20" w:line="259" w:lineRule="auto"/>
             </w:pPr>
             <w:r>
               <w:rPr>
@@ -392,7 +395,7 @@
           </w:tcPr>
           <w:p>
             <w:pPr>
-              <w:spacing w:after="40" w:line="269" w:lineRule="auto"/>
+              <w:spacing w:after="20" w:line="259" w:lineRule="auto"/>
               <w:jc w:val="center"/>
             </w:pPr>
             <w:r>
@@ -420,11 +423,12 @@
           </w:tcPr>
           <w:p>
             <w:pPr>
-              <w:spacing w:line="269" w:lineRule="auto" w:after="40"/>
+              <w:spacing w:line="259" w:lineRule="auto" w:after="20"/>
             </w:pPr>
             <w:r>
               <w:rPr>
                 <w:rFonts w:ascii="Microsoft YaHei" w:hAnsi="Microsoft YaHei" w:eastAsia="Microsoft YaHei"/>
+                <w:b w:val="0"/>
                 <w:sz w:val="18"/>
               </w:rPr>
               <w:t>计算机23-2 / 231002703 / 戴正宇</w:t>
@@ -447,7 +451,7 @@
           </w:tcPr>
           <w:p>
             <w:pPr>
-              <w:spacing w:after="40" w:line="269" w:lineRule="auto"/>
+              <w:spacing w:after="20" w:line="259" w:lineRule="auto"/>
               <w:jc w:val="center"/>
             </w:pPr>
             <w:r>
@@ -475,11 +479,12 @@
           </w:tcPr>
           <w:p>
             <w:pPr>
-              <w:spacing w:line="269" w:lineRule="auto" w:after="40"/>
+              <w:spacing w:line="259" w:lineRule="auto" w:after="20"/>
             </w:pPr>
             <w:r>
               <w:rPr>
                 <w:rFonts w:ascii="Microsoft YaHei" w:hAnsi="Microsoft YaHei" w:eastAsia="Microsoft YaHei"/>
+                <w:b w:val="0"/>
                 <w:sz w:val="18"/>
               </w:rPr>
               <w:t>2026-05-14</w:t>
@@ -490,16 +495,17 @@
     </w:tbl>
     <w:p>
       <w:pPr>
-        <w:spacing w:after="80" w:line="276" w:lineRule="auto"/>
+        <w:spacing w:after="60" w:line="269" w:lineRule="auto"/>
       </w:pPr>
     </w:p>
     <w:p>
       <w:pPr>
-        <w:spacing w:after="80" w:line="276" w:lineRule="auto"/>
+        <w:spacing w:after="60" w:line="269" w:lineRule="auto"/>
       </w:pPr>
       <w:r>
         <w:rPr>
           <w:rFonts w:ascii="Microsoft YaHei" w:hAnsi="Microsoft YaHei" w:eastAsia="Microsoft YaHei"/>
+          <w:b w:val="0"/>
           <w:sz w:val="21"/>
         </w:rPr>
         <w:br w:type="page"/>
@@ -508,7 +514,7 @@
     <w:p>
       <w:pPr>
         <w:keepNext/>
-        <w:spacing w:before="280" w:after="80" w:line="276" w:lineRule="auto"/>
+        <w:spacing w:before="280" w:after="60" w:line="269" w:lineRule="auto"/>
         <w:pBdr>
           <w:bottom w:val="single" w:sz="8" w:space="4" w:color="1A7A3D"/>
         </w:pBdr>
@@ -524,7 +530,7 @@
     </w:p>
     <w:p>
       <w:pPr>
-        <w:spacing w:after="80" w:before="0" w:line="276" w:lineRule="auto"/>
+        <w:spacing w:after="60" w:before="0" w:line="269" w:lineRule="auto"/>
         <w:ind w:firstLine="340"/>
         <w:jc w:val="left"/>
       </w:pPr>
@@ -548,43 +554,59 @@
         <w:gridCol w:w="9746"/>
       </w:tblGrid>
       <w:tr>
+        <w:trPr>
+          <w:tblHeader w:val="true"/>
+        </w:trPr>
         <w:tc>
           <w:tcPr>
             <w:tcW w:type="dxa" w:w="9746"/>
-            <w:shd w:val="clear" w:color="auto" w:fill="EAF4EC"/>
+            <w:shd w:val="clear" w:color="auto" w:fill="EAF6EF"/>
             <w:tcBorders>
               <w:top w:val="single" w:sz="8" w:space="0" w:color="B8D8C2"/>
               <w:left w:val="single" w:sz="8" w:space="0" w:color="B8D8C2"/>
               <w:bottom w:val="single" w:sz="8" w:space="0" w:color="B8D8C2"/>
               <w:right w:val="single" w:sz="8" w:space="0" w:color="B8D8C2"/>
             </w:tcBorders>
+            <w:vAlign w:val="center"/>
           </w:tcPr>
           <w:p>
             <w:pPr>
-              <w:spacing w:after="40" w:line="269" w:lineRule="auto"/>
-            </w:pPr>
-            <w:r>
-              <w:rPr>
-                <w:rFonts w:ascii="Microsoft YaHei" w:hAnsi="Microsoft YaHei" w:eastAsia="Microsoft YaHei"/>
-                <w:b/>
-                <w:color w:val="1A7A3D"/>
-                <w:sz w:val="21"/>
-              </w:rPr>
-              <w:t xml:space="preserve">📌 填写指引 </w:t>
-            </w:r>
-          </w:p>
-          <w:p>
-            <w:pPr>
-              <w:spacing w:after="40" w:line="269" w:lineRule="auto"/>
+              <w:spacing w:line="259" w:lineRule="auto" w:after="20"/>
             </w:pPr>
             <w:r>
               <w:rPr>
                 <w:rFonts w:ascii="Microsoft YaHei" w:hAnsi="Microsoft YaHei" w:eastAsia="Microsoft YaHei"/>
                 <w:b w:val="0"/>
-                <w:color w:val="2B2B2B"/>
-                <w:sz w:val="20"/>
+                <w:sz w:val="19"/>
               </w:rPr>
-              <w:t>本模板按章节结构预设了每节的标题与提示。请在每个 "（请在此处填写……）" 区域中替换为正式内容；不允许删除章节标题；如某节确实不适用，请保留标题并标注「N/A 及理由」。</w:t>
+            </w:r>
+            <w:r>
+              <w:rPr>
+                <w:rFonts w:ascii="Microsoft YaHei" w:hAnsi="Microsoft YaHei" w:eastAsia="Microsoft YaHei"/>
+                <w:b w:val="0"/>
+                <w:sz w:val="19"/>
+              </w:rPr>
+              <w:t>文档说明</w:t>
+            </w:r>
+          </w:p>
+          <w:p>
+            <w:pPr>
+              <w:spacing w:line="259" w:lineRule="auto" w:after="20"/>
+            </w:pPr>
+            <w:r>
+              <w:rPr>
+                <w:rFonts w:ascii="Microsoft YaHei" w:hAnsi="Microsoft YaHei" w:eastAsia="Microsoft YaHei"/>
+                <w:b w:val="0"/>
+                <w:sz w:val="19"/>
+              </w:rPr>
+            </w:r>
+            <w:r>
+              <w:rPr>
+                <w:rFonts w:ascii="Microsoft YaHei" w:hAnsi="Microsoft YaHei" w:eastAsia="Microsoft YaHei"/>
+                <w:b w:val="0"/>
+                <w:sz w:val="19"/>
+              </w:rPr>
+              <w:t>本文件已完成质量属性场景、效用树、Top-10 QAS 与架构影响说明。阅读顺序建议为：先看实验一非功能需求基线，再看效用树分解，最后用 QAS 表格核对每个质量目标是否具备刺激、响应、度量和验收方式。</w:t>
             </w:r>
           </w:p>
         </w:tc>
@@ -592,13 +614,13 @@
     </w:tbl>
     <w:p>
       <w:pPr>
-        <w:spacing w:after="80" w:line="276" w:lineRule="auto"/>
+        <w:spacing w:after="60" w:line="269" w:lineRule="auto"/>
       </w:pPr>
     </w:p>
     <w:p>
       <w:pPr>
         <w:keepNext/>
-        <w:spacing w:before="280" w:after="80" w:line="276" w:lineRule="auto"/>
+        <w:spacing w:before="280" w:after="60" w:line="269" w:lineRule="auto"/>
         <w:pBdr>
           <w:bottom w:val="single" w:sz="8" w:space="4" w:color="1A7A3D"/>
         </w:pBdr>
@@ -622,6 +644,9 @@
         <w:gridCol w:w="9746"/>
       </w:tblGrid>
       <w:tr>
+        <w:trPr>
+          <w:tblHeader w:val="true"/>
+        </w:trPr>
         <w:tc>
           <w:tcPr>
             <w:tcW w:type="dxa" w:w="9746"/>
@@ -632,15 +657,16 @@
               <w:bottom w:val="single" w:sz="4" w:space="0" w:color="B8D8C2"/>
               <w:right w:val="single" w:sz="4" w:space="0" w:color="B8D8C2"/>
             </w:tcBorders>
-            <w:vAlign w:val="top"/>
+            <w:vAlign w:val="center"/>
           </w:tcPr>
           <w:p>
             <w:pPr>
-              <w:spacing w:line="269" w:lineRule="auto" w:after="40"/>
+              <w:spacing w:line="259" w:lineRule="auto" w:after="20"/>
             </w:pPr>
             <w:r>
               <w:rPr>
                 <w:rFonts w:ascii="Microsoft YaHei" w:hAnsi="Microsoft YaHei" w:eastAsia="Microsoft YaHei"/>
+                <w:b w:val="0"/>
                 <w:sz w:val="18"/>
               </w:rPr>
               <w:t>实验一需求基线中提炼出的关键非功能需求如下：</w:t>
@@ -663,13 +689,13 @@
     </w:tbl>
     <w:p>
       <w:pPr>
-        <w:spacing w:after="80" w:line="276" w:lineRule="auto"/>
+        <w:spacing w:after="60" w:line="269" w:lineRule="auto"/>
       </w:pPr>
     </w:p>
     <w:p>
       <w:pPr>
         <w:keepNext/>
-        <w:spacing w:before="280" w:after="80" w:line="276" w:lineRule="auto"/>
+        <w:spacing w:before="280" w:after="60" w:line="269" w:lineRule="auto"/>
         <w:pBdr>
           <w:bottom w:val="single" w:sz="8" w:space="4" w:color="1A7A3D"/>
         </w:pBdr>
@@ -686,7 +712,7 @@
     <w:p>
       <w:pPr>
         <w:keepNext/>
-        <w:spacing w:before="200" w:after="80" w:line="276" w:lineRule="auto"/>
+        <w:spacing w:before="200" w:after="60" w:line="269" w:lineRule="auto"/>
         <w:pBdr>
           <w:bottom w:val="single" w:sz="4" w:space="4" w:color="4DB872"/>
         </w:pBdr>
@@ -710,6 +736,9 @@
         <w:gridCol w:w="9746"/>
       </w:tblGrid>
       <w:tr>
+        <w:trPr>
+          <w:tblHeader w:val="true"/>
+        </w:trPr>
         <w:tc>
           <w:tcPr>
             <w:tcW w:type="dxa" w:w="9746"/>
@@ -720,15 +749,16 @@
               <w:bottom w:val="single" w:sz="4" w:space="0" w:color="B8D8C2"/>
               <w:right w:val="single" w:sz="4" w:space="0" w:color="B8D8C2"/>
             </w:tcBorders>
-            <w:vAlign w:val="top"/>
+            <w:vAlign w:val="center"/>
           </w:tcPr>
           <w:p>
             <w:pPr>
-              <w:spacing w:line="269" w:lineRule="auto" w:after="40"/>
+              <w:spacing w:line="259" w:lineRule="auto" w:after="20"/>
             </w:pPr>
             <w:r>
               <w:rPr>
                 <w:rFonts w:ascii="Microsoft YaHei" w:hAnsi="Microsoft YaHei" w:eastAsia="Microsoft YaHei"/>
+                <w:b w:val="0"/>
                 <w:sz w:val="18"/>
               </w:rPr>
               <w:t>根节点定义为“在高峰预约、门店扩张和隐私合规约束下最大化业务效用”。本实验将业务效用拆成性能、可用性、安全性、可维护性、可观测性五个一级质量属性。每个叶子节点都要求能映射到一个可测试场景或验收指标，避免只写“快、稳、安全”等不可评审表述。</w:t>
@@ -739,13 +769,13 @@
     </w:tbl>
     <w:p>
       <w:pPr>
-        <w:spacing w:after="80" w:line="276" w:lineRule="auto"/>
+        <w:spacing w:after="60" w:line="269" w:lineRule="auto"/>
       </w:pPr>
     </w:p>
     <w:p>
       <w:pPr>
         <w:keepNext/>
-        <w:spacing w:before="200" w:after="80" w:line="276" w:lineRule="auto"/>
+        <w:spacing w:before="200" w:after="60" w:line="269" w:lineRule="auto"/>
         <w:pBdr>
           <w:bottom w:val="single" w:sz="4" w:space="4" w:color="4DB872"/>
         </w:pBdr>
@@ -769,6 +799,9 @@
         <w:gridCol w:w="9746"/>
       </w:tblGrid>
       <w:tr>
+        <w:trPr>
+          <w:tblHeader w:val="true"/>
+        </w:trPr>
         <w:tc>
           <w:tcPr>
             <w:tcW w:type="dxa" w:w="9746"/>
@@ -779,15 +812,16 @@
               <w:bottom w:val="single" w:sz="4" w:space="0" w:color="B8D8C2"/>
               <w:right w:val="single" w:sz="4" w:space="0" w:color="B8D8C2"/>
             </w:tcBorders>
-            <w:vAlign w:val="top"/>
+            <w:vAlign w:val="center"/>
           </w:tcPr>
           <w:p>
             <w:pPr>
-              <w:spacing w:line="269" w:lineRule="auto" w:after="40"/>
+              <w:spacing w:line="259" w:lineRule="auto" w:after="20"/>
             </w:pPr>
             <w:r>
               <w:rPr>
                 <w:rFonts w:ascii="Microsoft YaHei" w:hAnsi="Microsoft YaHei" w:eastAsia="Microsoft YaHei"/>
+                <w:b w:val="0"/>
                 <w:sz w:val="18"/>
               </w:rPr>
               <w:t>二级维度采用“质量属性 → 场景 → 响应度量”的组织方式：性能关注预约提交、并发响应和页面加载；可用性关注支付失败重试、服务故障恢复与 SLA；安全性关注身份认证、脱敏展示与支付信息加密；可维护性关注模块职责、接口规范和文档；可观测性关注业务指标、异常告警和链路日志。</w:t>
@@ -795,23 +829,25 @@
           </w:p>
           <w:p>
             <w:pPr>
-              <w:spacing w:before="0" w:after="40" w:line="269" w:lineRule="auto"/>
+              <w:spacing w:before="0" w:after="20" w:line="259" w:lineRule="auto"/>
             </w:pPr>
             <w:r>
               <w:rPr>
                 <w:rFonts w:ascii="Microsoft YaHei" w:hAnsi="Microsoft YaHei" w:eastAsia="Microsoft YaHei"/>
+                <w:b w:val="0"/>
                 <w:sz w:val="18"/>
               </w:rPr>
             </w:r>
           </w:p>
           <w:p>
             <w:pPr>
-              <w:spacing w:line="269" w:lineRule="auto" w:after="40"/>
+              <w:spacing w:line="259" w:lineRule="auto" w:after="20"/>
               <w:jc w:val="center"/>
             </w:pPr>
             <w:r>
               <w:rPr>
                 <w:rFonts w:ascii="Microsoft YaHei" w:hAnsi="Microsoft YaHei" w:eastAsia="Microsoft YaHei"/>
+                <w:b w:val="0"/>
                 <w:sz w:val="18"/>
               </w:rPr>
               <w:drawing>
@@ -850,12 +886,13 @@
           </w:p>
           <w:p>
             <w:pPr>
-              <w:spacing w:line="269" w:lineRule="auto" w:after="40"/>
+              <w:spacing w:line="259" w:lineRule="auto" w:after="20"/>
               <w:jc w:val="center"/>
             </w:pPr>
             <w:r>
               <w:rPr>
                 <w:rFonts w:ascii="Microsoft YaHei" w:hAnsi="Microsoft YaHei" w:eastAsia="Microsoft YaHei"/>
+                <w:b w:val="0"/>
                 <w:sz w:val="18"/>
               </w:rPr>
             </w:r>
@@ -865,13 +902,13 @@
     </w:tbl>
     <w:p>
       <w:pPr>
-        <w:spacing w:after="80" w:line="276" w:lineRule="auto"/>
+        <w:spacing w:after="60" w:line="269" w:lineRule="auto"/>
       </w:pPr>
     </w:p>
     <w:p>
       <w:pPr>
         <w:keepNext/>
-        <w:spacing w:before="200" w:after="80" w:line="276" w:lineRule="auto"/>
+        <w:spacing w:before="200" w:after="60" w:line="269" w:lineRule="auto"/>
         <w:pBdr>
           <w:bottom w:val="single" w:sz="4" w:space="4" w:color="4DB872"/>
         </w:pBdr>
@@ -895,6 +932,9 @@
         <w:gridCol w:w="9746"/>
       </w:tblGrid>
       <w:tr>
+        <w:trPr>
+          <w:tblHeader w:val="true"/>
+        </w:trPr>
         <w:tc>
           <w:tcPr>
             <w:tcW w:type="dxa" w:w="9746"/>
@@ -905,15 +945,16 @@
               <w:bottom w:val="single" w:sz="4" w:space="0" w:color="B8D8C2"/>
               <w:right w:val="single" w:sz="4" w:space="0" w:color="B8D8C2"/>
             </w:tcBorders>
-            <w:vAlign w:val="top"/>
+            <w:vAlign w:val="center"/>
           </w:tcPr>
           <w:p>
             <w:pPr>
-              <w:spacing w:line="269" w:lineRule="auto" w:after="40"/>
+              <w:spacing w:line="259" w:lineRule="auto" w:after="20"/>
             </w:pPr>
             <w:r>
               <w:rPr>
                 <w:rFonts w:ascii="Microsoft YaHei" w:hAnsi="Microsoft YaHei" w:eastAsia="Microsoft YaHei"/>
+                <w:b w:val="0"/>
                 <w:sz w:val="18"/>
               </w:rPr>
               <w:t>效用树文字版：</w:t>
@@ -936,7 +977,7 @@
     </w:tbl>
     <w:p>
       <w:pPr>
-        <w:spacing w:after="80" w:line="276" w:lineRule="auto"/>
+        <w:spacing w:after="60" w:line="269" w:lineRule="auto"/>
       </w:pPr>
     </w:p>
     <w:tbl>
@@ -949,6 +990,9 @@
         <w:gridCol w:w="9746"/>
       </w:tblGrid>
       <w:tr>
+        <w:trPr>
+          <w:tblHeader w:val="true"/>
+        </w:trPr>
         <w:tc>
           <w:tcPr>
             <w:tcW w:type="dxa" w:w="9746"/>
@@ -959,15 +1003,16 @@
               <w:bottom w:val="single" w:sz="4" w:space="0" w:color="B8D8C2"/>
               <w:right w:val="single" w:sz="4" w:space="0" w:color="B8D8C2"/>
             </w:tcBorders>
-            <w:vAlign w:val="top"/>
+            <w:vAlign w:val="center"/>
           </w:tcPr>
           <w:p>
             <w:pPr>
-              <w:spacing w:line="269" w:lineRule="auto" w:after="40"/>
+              <w:spacing w:line="259" w:lineRule="auto" w:after="20"/>
             </w:pPr>
             <w:r>
               <w:rPr>
                 <w:rFonts w:ascii="Microsoft YaHei" w:hAnsi="Microsoft YaHei" w:eastAsia="Microsoft YaHei"/>
+                <w:b w:val="0"/>
                 <w:sz w:val="18"/>
               </w:rPr>
               <w:t>Top-10 QAS 从实验一需求基线、CTO 三个追问和实验二任务书抽取。排序原则为：先保证核心预约交易链路，再保证支付一致性、隐私合规和门店扩展，最后覆盖运营分析与维护效率。每条 QAS 均包含刺激源、刺激、制品、环境、响应和响应度量，可直接转化为后续测试用例。</w:t>
@@ -978,13 +1023,13 @@
     </w:tbl>
     <w:p>
       <w:pPr>
-        <w:spacing w:after="80" w:line="276" w:lineRule="auto"/>
+        <w:spacing w:after="60" w:line="269" w:lineRule="auto"/>
       </w:pPr>
     </w:p>
     <w:p>
       <w:pPr>
         <w:keepNext/>
-        <w:spacing w:before="280" w:after="80" w:line="276" w:lineRule="auto"/>
+        <w:spacing w:before="280" w:after="60" w:line="269" w:lineRule="auto"/>
         <w:pBdr>
           <w:bottom w:val="single" w:sz="8" w:space="4" w:color="1A7A3D"/>
         </w:pBdr>
@@ -1016,6 +1061,9 @@
         <w:gridCol w:w="1083"/>
       </w:tblGrid>
       <w:tr>
+        <w:trPr>
+          <w:tblHeader w:val="true"/>
+        </w:trPr>
         <w:tc>
           <w:tcPr>
             <w:tcW w:type="dxa" w:w="794"/>
@@ -1030,7 +1078,7 @@
           </w:tcPr>
           <w:p>
             <w:pPr>
-              <w:spacing w:after="40" w:before="40" w:line="269" w:lineRule="auto"/>
+              <w:spacing w:after="20" w:before="40" w:line="259" w:lineRule="auto"/>
               <w:jc w:val="center"/>
             </w:pPr>
             <w:r>
@@ -1058,7 +1106,7 @@
           </w:tcPr>
           <w:p>
             <w:pPr>
-              <w:spacing w:after="40" w:before="40" w:line="269" w:lineRule="auto"/>
+              <w:spacing w:after="20" w:before="40" w:line="259" w:lineRule="auto"/>
               <w:jc w:val="center"/>
             </w:pPr>
             <w:r>
@@ -1086,7 +1134,7 @@
           </w:tcPr>
           <w:p>
             <w:pPr>
-              <w:spacing w:after="40" w:before="40" w:line="269" w:lineRule="auto"/>
+              <w:spacing w:after="20" w:before="40" w:line="259" w:lineRule="auto"/>
               <w:jc w:val="center"/>
             </w:pPr>
             <w:r>
@@ -1114,7 +1162,7 @@
           </w:tcPr>
           <w:p>
             <w:pPr>
-              <w:spacing w:after="40" w:before="40" w:line="269" w:lineRule="auto"/>
+              <w:spacing w:after="20" w:before="40" w:line="259" w:lineRule="auto"/>
               <w:jc w:val="center"/>
             </w:pPr>
             <w:r>
@@ -1142,7 +1190,7 @@
           </w:tcPr>
           <w:p>
             <w:pPr>
-              <w:spacing w:after="40" w:before="40" w:line="269" w:lineRule="auto"/>
+              <w:spacing w:after="20" w:before="40" w:line="259" w:lineRule="auto"/>
               <w:jc w:val="center"/>
             </w:pPr>
             <w:r>
@@ -1170,7 +1218,7 @@
           </w:tcPr>
           <w:p>
             <w:pPr>
-              <w:spacing w:after="40" w:before="40" w:line="269" w:lineRule="auto"/>
+              <w:spacing w:after="20" w:before="40" w:line="259" w:lineRule="auto"/>
               <w:jc w:val="center"/>
             </w:pPr>
             <w:r>
@@ -1198,7 +1246,7 @@
           </w:tcPr>
           <w:p>
             <w:pPr>
-              <w:spacing w:after="40" w:before="40" w:line="269" w:lineRule="auto"/>
+              <w:spacing w:after="20" w:before="40" w:line="259" w:lineRule="auto"/>
               <w:jc w:val="center"/>
             </w:pPr>
             <w:r>
@@ -1226,7 +1274,7 @@
           </w:tcPr>
           <w:p>
             <w:pPr>
-              <w:spacing w:after="40" w:before="40" w:line="269" w:lineRule="auto"/>
+              <w:spacing w:after="20" w:before="40" w:line="259" w:lineRule="auto"/>
               <w:jc w:val="center"/>
             </w:pPr>
             <w:r>
@@ -1254,7 +1302,7 @@
           </w:tcPr>
           <w:p>
             <w:pPr>
-              <w:spacing w:after="40" w:before="40" w:line="269" w:lineRule="auto"/>
+              <w:spacing w:after="20" w:before="40" w:line="259" w:lineRule="auto"/>
               <w:jc w:val="center"/>
             </w:pPr>
             <w:r>
@@ -1273,14 +1321,16 @@
         <w:tc>
           <w:tcPr>
             <w:tcW w:type="dxa" w:w="1083"/>
+            <w:vAlign w:val="center"/>
           </w:tcPr>
           <w:p>
             <w:pPr>
-              <w:spacing w:line="269" w:lineRule="auto" w:after="40"/>
+              <w:spacing w:line="259" w:lineRule="auto" w:after="20"/>
             </w:pPr>
             <w:r>
               <w:rPr>
                 <w:rFonts w:ascii="Microsoft YaHei" w:hAnsi="Microsoft YaHei" w:eastAsia="Microsoft YaHei"/>
+                <w:b w:val="0"/>
                 <w:sz w:val="18"/>
               </w:rPr>
               <w:t>QAS-01</w:t>
@@ -1290,14 +1340,16 @@
         <w:tc>
           <w:tcPr>
             <w:tcW w:type="dxa" w:w="1083"/>
+            <w:vAlign w:val="center"/>
           </w:tcPr>
           <w:p>
             <w:pPr>
-              <w:spacing w:line="269" w:lineRule="auto" w:after="40"/>
+              <w:spacing w:line="259" w:lineRule="auto" w:after="20"/>
             </w:pPr>
             <w:r>
               <w:rPr>
                 <w:rFonts w:ascii="Microsoft YaHei" w:hAnsi="Microsoft YaHei" w:eastAsia="Microsoft YaHei"/>
+                <w:b w:val="0"/>
                 <w:sz w:val="18"/>
               </w:rPr>
               <w:t>性能</w:t>
@@ -1307,14 +1359,16 @@
         <w:tc>
           <w:tcPr>
             <w:tcW w:type="dxa" w:w="1083"/>
+            <w:vAlign w:val="center"/>
           </w:tcPr>
           <w:p>
             <w:pPr>
-              <w:spacing w:line="269" w:lineRule="auto" w:after="40"/>
+              <w:spacing w:line="259" w:lineRule="auto" w:after="20"/>
             </w:pPr>
             <w:r>
               <w:rPr>
                 <w:rFonts w:ascii="Microsoft YaHei" w:hAnsi="Microsoft YaHei" w:eastAsia="Microsoft YaHei"/>
+                <w:b w:val="0"/>
                 <w:sz w:val="18"/>
               </w:rPr>
               <w:t>节假日午晚餐高峰创建预约</w:t>
@@ -1324,14 +1378,16 @@
         <w:tc>
           <w:tcPr>
             <w:tcW w:type="dxa" w:w="1083"/>
+            <w:vAlign w:val="center"/>
           </w:tcPr>
           <w:p>
             <w:pPr>
-              <w:spacing w:line="269" w:lineRule="auto" w:after="40"/>
+              <w:spacing w:line="259" w:lineRule="auto" w:after="20"/>
             </w:pPr>
             <w:r>
               <w:rPr>
                 <w:rFonts w:ascii="Microsoft YaHei" w:hAnsi="Microsoft YaHei" w:eastAsia="Microsoft YaHei"/>
+                <w:b w:val="0"/>
                 <w:sz w:val="18"/>
               </w:rPr>
               <w:t>顾客</w:t>
@@ -1341,14 +1397,16 @@
         <w:tc>
           <w:tcPr>
             <w:tcW w:type="dxa" w:w="1083"/>
+            <w:vAlign w:val="center"/>
           </w:tcPr>
           <w:p>
             <w:pPr>
-              <w:spacing w:line="269" w:lineRule="auto" w:after="40"/>
+              <w:spacing w:line="259" w:lineRule="auto" w:after="20"/>
             </w:pPr>
             <w:r>
               <w:rPr>
                 <w:rFonts w:ascii="Microsoft YaHei" w:hAnsi="Microsoft YaHei" w:eastAsia="Microsoft YaHei"/>
+                <w:b w:val="0"/>
                 <w:sz w:val="18"/>
               </w:rPr>
               <w:t>POST /reservations</w:t>
@@ -1358,14 +1416,16 @@
         <w:tc>
           <w:tcPr>
             <w:tcW w:type="dxa" w:w="1083"/>
+            <w:vAlign w:val="center"/>
           </w:tcPr>
           <w:p>
             <w:pPr>
-              <w:spacing w:line="269" w:lineRule="auto" w:after="40"/>
+              <w:spacing w:line="259" w:lineRule="auto" w:after="20"/>
             </w:pPr>
             <w:r>
               <w:rPr>
                 <w:rFonts w:ascii="Microsoft YaHei" w:hAnsi="Microsoft YaHei" w:eastAsia="Microsoft YaHei"/>
+                <w:b w:val="0"/>
                 <w:sz w:val="18"/>
               </w:rPr>
               <w:t>预约服务/API网关</w:t>
@@ -1375,14 +1435,16 @@
         <w:tc>
           <w:tcPr>
             <w:tcW w:type="dxa" w:w="1083"/>
+            <w:vAlign w:val="center"/>
           </w:tcPr>
           <w:p>
             <w:pPr>
-              <w:spacing w:line="269" w:lineRule="auto" w:after="40"/>
+              <w:spacing w:line="259" w:lineRule="auto" w:after="20"/>
             </w:pPr>
             <w:r>
               <w:rPr>
                 <w:rFonts w:ascii="Microsoft YaHei" w:hAnsi="Microsoft YaHei" w:eastAsia="Microsoft YaHei"/>
+                <w:b w:val="0"/>
                 <w:sz w:val="18"/>
               </w:rPr>
               <w:t>1000 并发、38 家门店在线</w:t>
@@ -1392,14 +1454,16 @@
         <w:tc>
           <w:tcPr>
             <w:tcW w:type="dxa" w:w="1083"/>
+            <w:vAlign w:val="center"/>
           </w:tcPr>
           <w:p>
             <w:pPr>
-              <w:spacing w:line="269" w:lineRule="auto" w:after="40"/>
+              <w:spacing w:line="259" w:lineRule="auto" w:after="20"/>
             </w:pPr>
             <w:r>
               <w:rPr>
                 <w:rFonts w:ascii="Microsoft YaHei" w:hAnsi="Microsoft YaHei" w:eastAsia="Microsoft YaHei"/>
+                <w:b w:val="0"/>
                 <w:sz w:val="18"/>
               </w:rPr>
               <w:t>返回预约号、候补建议或明确失败原因</w:t>
@@ -1409,14 +1473,16 @@
         <w:tc>
           <w:tcPr>
             <w:tcW w:type="dxa" w:w="1083"/>
+            <w:vAlign w:val="center"/>
           </w:tcPr>
           <w:p>
             <w:pPr>
-              <w:spacing w:line="269" w:lineRule="auto" w:after="40"/>
+              <w:spacing w:line="259" w:lineRule="auto" w:after="20"/>
             </w:pPr>
             <w:r>
               <w:rPr>
                 <w:rFonts w:ascii="Microsoft YaHei" w:hAnsi="Microsoft YaHei" w:eastAsia="Microsoft YaHei"/>
+                <w:b w:val="0"/>
                 <w:sz w:val="18"/>
               </w:rPr>
               <w:t>P95≤350ms，错误率≤0.5%</w:t>
@@ -1428,14 +1494,16 @@
         <w:tc>
           <w:tcPr>
             <w:tcW w:type="dxa" w:w="1083"/>
+            <w:vAlign w:val="center"/>
           </w:tcPr>
           <w:p>
             <w:pPr>
-              <w:spacing w:line="269" w:lineRule="auto" w:after="40"/>
+              <w:spacing w:line="259" w:lineRule="auto" w:after="20"/>
             </w:pPr>
             <w:r>
               <w:rPr>
                 <w:rFonts w:ascii="Microsoft YaHei" w:hAnsi="Microsoft YaHei" w:eastAsia="Microsoft YaHei"/>
+                <w:b w:val="0"/>
                 <w:sz w:val="18"/>
               </w:rPr>
               <w:t>QAS-02</w:t>
@@ -1445,14 +1513,16 @@
         <w:tc>
           <w:tcPr>
             <w:tcW w:type="dxa" w:w="1083"/>
+            <w:vAlign w:val="center"/>
           </w:tcPr>
           <w:p>
             <w:pPr>
-              <w:spacing w:line="269" w:lineRule="auto" w:after="40"/>
+              <w:spacing w:line="259" w:lineRule="auto" w:after="20"/>
             </w:pPr>
             <w:r>
               <w:rPr>
                 <w:rFonts w:ascii="Microsoft YaHei" w:hAnsi="Microsoft YaHei" w:eastAsia="Microsoft YaHei"/>
+                <w:b w:val="0"/>
                 <w:sz w:val="18"/>
               </w:rPr>
               <w:t>可用性</w:t>
@@ -1462,14 +1532,16 @@
         <w:tc>
           <w:tcPr>
             <w:tcW w:type="dxa" w:w="1083"/>
+            <w:vAlign w:val="center"/>
           </w:tcPr>
           <w:p>
             <w:pPr>
-              <w:spacing w:line="269" w:lineRule="auto" w:after="40"/>
+              <w:spacing w:line="259" w:lineRule="auto" w:after="20"/>
             </w:pPr>
             <w:r>
               <w:rPr>
                 <w:rFonts w:ascii="Microsoft YaHei" w:hAnsi="Microsoft YaHei" w:eastAsia="Microsoft YaHei"/>
+                <w:b w:val="0"/>
                 <w:sz w:val="18"/>
               </w:rPr>
               <w:t>核心预约链路持续可用</w:t>
@@ -1479,14 +1551,16 @@
         <w:tc>
           <w:tcPr>
             <w:tcW w:type="dxa" w:w="1083"/>
+            <w:vAlign w:val="center"/>
           </w:tcPr>
           <w:p>
             <w:pPr>
-              <w:spacing w:line="269" w:lineRule="auto" w:after="40"/>
+              <w:spacing w:line="259" w:lineRule="auto" w:after="20"/>
             </w:pPr>
             <w:r>
               <w:rPr>
                 <w:rFonts w:ascii="Microsoft YaHei" w:hAnsi="Microsoft YaHei" w:eastAsia="Microsoft YaHei"/>
+                <w:b w:val="0"/>
                 <w:sz w:val="18"/>
               </w:rPr>
               <w:t>基础设施</w:t>
@@ -1496,14 +1570,16 @@
         <w:tc>
           <w:tcPr>
             <w:tcW w:type="dxa" w:w="1083"/>
+            <w:vAlign w:val="center"/>
           </w:tcPr>
           <w:p>
             <w:pPr>
-              <w:spacing w:line="269" w:lineRule="auto" w:after="40"/>
+              <w:spacing w:line="259" w:lineRule="auto" w:after="20"/>
             </w:pPr>
             <w:r>
               <w:rPr>
                 <w:rFonts w:ascii="Microsoft YaHei" w:hAnsi="Microsoft YaHei" w:eastAsia="Microsoft YaHei"/>
+                <w:b w:val="0"/>
                 <w:sz w:val="18"/>
               </w:rPr>
               <w:t>单实例故障或滚动发布</w:t>
@@ -1513,14 +1589,16 @@
         <w:tc>
           <w:tcPr>
             <w:tcW w:type="dxa" w:w="1083"/>
+            <w:vAlign w:val="center"/>
           </w:tcPr>
           <w:p>
             <w:pPr>
-              <w:spacing w:line="269" w:lineRule="auto" w:after="40"/>
+              <w:spacing w:line="259" w:lineRule="auto" w:after="20"/>
             </w:pPr>
             <w:r>
               <w:rPr>
                 <w:rFonts w:ascii="Microsoft YaHei" w:hAnsi="Microsoft YaHei" w:eastAsia="Microsoft YaHei"/>
+                <w:b w:val="0"/>
                 <w:sz w:val="18"/>
               </w:rPr>
               <w:t>预约/会员/门店服务</w:t>
@@ -1530,14 +1608,16 @@
         <w:tc>
           <w:tcPr>
             <w:tcW w:type="dxa" w:w="1083"/>
+            <w:vAlign w:val="center"/>
           </w:tcPr>
           <w:p>
             <w:pPr>
-              <w:spacing w:line="269" w:lineRule="auto" w:after="40"/>
+              <w:spacing w:line="259" w:lineRule="auto" w:after="20"/>
             </w:pPr>
             <w:r>
               <w:rPr>
                 <w:rFonts w:ascii="Microsoft YaHei" w:hAnsi="Microsoft YaHei" w:eastAsia="Microsoft YaHei"/>
+                <w:b w:val="0"/>
                 <w:sz w:val="18"/>
               </w:rPr>
               <w:t>生产环境、营业中</w:t>
@@ -1547,14 +1627,16 @@
         <w:tc>
           <w:tcPr>
             <w:tcW w:type="dxa" w:w="1083"/>
+            <w:vAlign w:val="center"/>
           </w:tcPr>
           <w:p>
             <w:pPr>
-              <w:spacing w:line="269" w:lineRule="auto" w:after="40"/>
+              <w:spacing w:line="259" w:lineRule="auto" w:after="20"/>
             </w:pPr>
             <w:r>
               <w:rPr>
                 <w:rFonts w:ascii="Microsoft YaHei" w:hAnsi="Microsoft YaHei" w:eastAsia="Microsoft YaHei"/>
+                <w:b w:val="0"/>
                 <w:sz w:val="18"/>
               </w:rPr>
               <w:t>自动摘除故障实例并保持可用</w:t>
@@ -1564,14 +1646,16 @@
         <w:tc>
           <w:tcPr>
             <w:tcW w:type="dxa" w:w="1083"/>
+            <w:vAlign w:val="center"/>
           </w:tcPr>
           <w:p>
             <w:pPr>
-              <w:spacing w:line="269" w:lineRule="auto" w:after="40"/>
+              <w:spacing w:line="259" w:lineRule="auto" w:after="20"/>
             </w:pPr>
             <w:r>
               <w:rPr>
                 <w:rFonts w:ascii="Microsoft YaHei" w:hAnsi="Microsoft YaHei" w:eastAsia="Microsoft YaHei"/>
+                <w:b w:val="0"/>
                 <w:sz w:val="18"/>
               </w:rPr>
               <w:t>月 SLA≥99.9%，RTO≤5min</w:t>
@@ -1583,14 +1667,16 @@
         <w:tc>
           <w:tcPr>
             <w:tcW w:type="dxa" w:w="1083"/>
+            <w:vAlign w:val="center"/>
           </w:tcPr>
           <w:p>
             <w:pPr>
-              <w:spacing w:line="269" w:lineRule="auto" w:after="40"/>
+              <w:spacing w:line="259" w:lineRule="auto" w:after="20"/>
             </w:pPr>
             <w:r>
               <w:rPr>
                 <w:rFonts w:ascii="Microsoft YaHei" w:hAnsi="Microsoft YaHei" w:eastAsia="Microsoft YaHei"/>
+                <w:b w:val="0"/>
                 <w:sz w:val="18"/>
               </w:rPr>
               <w:t>QAS-03</w:t>
@@ -1600,14 +1686,16 @@
         <w:tc>
           <w:tcPr>
             <w:tcW w:type="dxa" w:w="1083"/>
+            <w:vAlign w:val="center"/>
           </w:tcPr>
           <w:p>
             <w:pPr>
-              <w:spacing w:line="269" w:lineRule="auto" w:after="40"/>
+              <w:spacing w:line="259" w:lineRule="auto" w:after="20"/>
             </w:pPr>
             <w:r>
               <w:rPr>
                 <w:rFonts w:ascii="Microsoft YaHei" w:hAnsi="Microsoft YaHei" w:eastAsia="Microsoft YaHei"/>
+                <w:b w:val="0"/>
                 <w:sz w:val="18"/>
               </w:rPr>
               <w:t>可演进性</w:t>
@@ -1617,14 +1705,16 @@
         <w:tc>
           <w:tcPr>
             <w:tcW w:type="dxa" w:w="1083"/>
+            <w:vAlign w:val="center"/>
           </w:tcPr>
           <w:p>
             <w:pPr>
-              <w:spacing w:line="269" w:lineRule="auto" w:after="40"/>
+              <w:spacing w:line="259" w:lineRule="auto" w:after="20"/>
             </w:pPr>
             <w:r>
               <w:rPr>
                 <w:rFonts w:ascii="Microsoft YaHei" w:hAnsi="Microsoft YaHei" w:eastAsia="Microsoft YaHei"/>
+                <w:b w:val="0"/>
                 <w:sz w:val="18"/>
               </w:rPr>
               <w:t>新增门店上线</w:t>
@@ -1634,14 +1724,16 @@
         <w:tc>
           <w:tcPr>
             <w:tcW w:type="dxa" w:w="1083"/>
+            <w:vAlign w:val="center"/>
           </w:tcPr>
           <w:p>
             <w:pPr>
-              <w:spacing w:line="269" w:lineRule="auto" w:after="40"/>
+              <w:spacing w:line="259" w:lineRule="auto" w:after="20"/>
             </w:pPr>
             <w:r>
               <w:rPr>
                 <w:rFonts w:ascii="Microsoft YaHei" w:hAnsi="Microsoft YaHei" w:eastAsia="Microsoft YaHei"/>
+                <w:b w:val="0"/>
                 <w:sz w:val="18"/>
               </w:rPr>
               <w:t>运营人员</w:t>
@@ -1651,14 +1743,16 @@
         <w:tc>
           <w:tcPr>
             <w:tcW w:type="dxa" w:w="1083"/>
+            <w:vAlign w:val="center"/>
           </w:tcPr>
           <w:p>
             <w:pPr>
-              <w:spacing w:line="269" w:lineRule="auto" w:after="40"/>
+              <w:spacing w:line="259" w:lineRule="auto" w:after="20"/>
             </w:pPr>
             <w:r>
               <w:rPr>
                 <w:rFonts w:ascii="Microsoft YaHei" w:hAnsi="Microsoft YaHei" w:eastAsia="Microsoft YaHei"/>
+                <w:b w:val="0"/>
                 <w:sz w:val="18"/>
               </w:rPr>
               <w:t>发布门店、桌位、营业规则配置</w:t>
@@ -1668,14 +1762,16 @@
         <w:tc>
           <w:tcPr>
             <w:tcW w:type="dxa" w:w="1083"/>
+            <w:vAlign w:val="center"/>
           </w:tcPr>
           <w:p>
             <w:pPr>
-              <w:spacing w:line="269" w:lineRule="auto" w:after="40"/>
+              <w:spacing w:line="259" w:lineRule="auto" w:after="20"/>
             </w:pPr>
             <w:r>
               <w:rPr>
                 <w:rFonts w:ascii="Microsoft YaHei" w:hAnsi="Microsoft YaHei" w:eastAsia="Microsoft YaHei"/>
+                <w:b w:val="0"/>
                 <w:sz w:val="18"/>
               </w:rPr>
               <w:t>门店/预约/菜单服务</w:t>
@@ -1685,14 +1781,16 @@
         <w:tc>
           <w:tcPr>
             <w:tcW w:type="dxa" w:w="1083"/>
+            <w:vAlign w:val="center"/>
           </w:tcPr>
           <w:p>
             <w:pPr>
-              <w:spacing w:line="269" w:lineRule="auto" w:after="40"/>
+              <w:spacing w:line="259" w:lineRule="auto" w:after="20"/>
             </w:pPr>
             <w:r>
               <w:rPr>
                 <w:rFonts w:ascii="Microsoft YaHei" w:hAnsi="Microsoft YaHei" w:eastAsia="Microsoft YaHei"/>
+                <w:b w:val="0"/>
                 <w:sz w:val="18"/>
               </w:rPr>
               <w:t>营业中、无需停机</w:t>
@@ -1702,14 +1800,16 @@
         <w:tc>
           <w:tcPr>
             <w:tcW w:type="dxa" w:w="1083"/>
+            <w:vAlign w:val="center"/>
           </w:tcPr>
           <w:p>
             <w:pPr>
-              <w:spacing w:line="269" w:lineRule="auto" w:after="40"/>
+              <w:spacing w:line="259" w:lineRule="auto" w:after="20"/>
             </w:pPr>
             <w:r>
               <w:rPr>
                 <w:rFonts w:ascii="Microsoft YaHei" w:hAnsi="Microsoft YaHei" w:eastAsia="Microsoft YaHei"/>
+                <w:b w:val="0"/>
                 <w:sz w:val="18"/>
               </w:rPr>
               <w:t>新门店可被搜索、预约和核销</w:t>
@@ -1719,14 +1819,16 @@
         <w:tc>
           <w:tcPr>
             <w:tcW w:type="dxa" w:w="1083"/>
+            <w:vAlign w:val="center"/>
           </w:tcPr>
           <w:p>
             <w:pPr>
-              <w:spacing w:line="269" w:lineRule="auto" w:after="40"/>
+              <w:spacing w:line="259" w:lineRule="auto" w:after="20"/>
             </w:pPr>
             <w:r>
               <w:rPr>
                 <w:rFonts w:ascii="Microsoft YaHei" w:hAnsi="Microsoft YaHei" w:eastAsia="Microsoft YaHei"/>
+                <w:b w:val="0"/>
                 <w:sz w:val="18"/>
               </w:rPr>
               <w:t>停机时间=0，配置回滚≤10min</w:t>
@@ -1738,14 +1840,16 @@
         <w:tc>
           <w:tcPr>
             <w:tcW w:type="dxa" w:w="1083"/>
+            <w:vAlign w:val="center"/>
           </w:tcPr>
           <w:p>
             <w:pPr>
-              <w:spacing w:line="269" w:lineRule="auto" w:after="40"/>
+              <w:spacing w:line="259" w:lineRule="auto" w:after="20"/>
             </w:pPr>
             <w:r>
               <w:rPr>
                 <w:rFonts w:ascii="Microsoft YaHei" w:hAnsi="Microsoft YaHei" w:eastAsia="Microsoft YaHei"/>
+                <w:b w:val="0"/>
                 <w:sz w:val="18"/>
               </w:rPr>
               <w:t>QAS-04</w:t>
@@ -1755,14 +1859,16 @@
         <w:tc>
           <w:tcPr>
             <w:tcW w:type="dxa" w:w="1083"/>
+            <w:vAlign w:val="center"/>
           </w:tcPr>
           <w:p>
             <w:pPr>
-              <w:spacing w:line="269" w:lineRule="auto" w:after="40"/>
+              <w:spacing w:line="259" w:lineRule="auto" w:after="20"/>
             </w:pPr>
             <w:r>
               <w:rPr>
                 <w:rFonts w:ascii="Microsoft YaHei" w:hAnsi="Microsoft YaHei" w:eastAsia="Microsoft YaHei"/>
+                <w:b w:val="0"/>
                 <w:sz w:val="18"/>
               </w:rPr>
               <w:t>一致性</w:t>
@@ -1772,14 +1878,16 @@
         <w:tc>
           <w:tcPr>
             <w:tcW w:type="dxa" w:w="1083"/>
+            <w:vAlign w:val="center"/>
           </w:tcPr>
           <w:p>
             <w:pPr>
-              <w:spacing w:line="269" w:lineRule="auto" w:after="40"/>
+              <w:spacing w:line="259" w:lineRule="auto" w:after="20"/>
             </w:pPr>
             <w:r>
               <w:rPr>
                 <w:rFonts w:ascii="Microsoft YaHei" w:hAnsi="Microsoft YaHei" w:eastAsia="Microsoft YaHei"/>
+                <w:b w:val="0"/>
                 <w:sz w:val="18"/>
               </w:rPr>
               <w:t>支付成功后预约状态同步</w:t>
@@ -1789,14 +1897,16 @@
         <w:tc>
           <w:tcPr>
             <w:tcW w:type="dxa" w:w="1083"/>
+            <w:vAlign w:val="center"/>
           </w:tcPr>
           <w:p>
             <w:pPr>
-              <w:spacing w:line="269" w:lineRule="auto" w:after="40"/>
+              <w:spacing w:line="259" w:lineRule="auto" w:after="20"/>
             </w:pPr>
             <w:r>
               <w:rPr>
                 <w:rFonts w:ascii="Microsoft YaHei" w:hAnsi="Microsoft YaHei" w:eastAsia="Microsoft YaHei"/>
+                <w:b w:val="0"/>
                 <w:sz w:val="18"/>
               </w:rPr>
               <w:t>支付平台</w:t>
@@ -1806,14 +1916,16 @@
         <w:tc>
           <w:tcPr>
             <w:tcW w:type="dxa" w:w="1083"/>
+            <w:vAlign w:val="center"/>
           </w:tcPr>
           <w:p>
             <w:pPr>
-              <w:spacing w:line="269" w:lineRule="auto" w:after="40"/>
+              <w:spacing w:line="259" w:lineRule="auto" w:after="20"/>
             </w:pPr>
             <w:r>
               <w:rPr>
                 <w:rFonts w:ascii="Microsoft YaHei" w:hAnsi="Microsoft YaHei" w:eastAsia="Microsoft YaHei"/>
+                <w:b w:val="0"/>
                 <w:sz w:val="18"/>
               </w:rPr>
               <w:t>支付回调成功或重复回调</w:t>
@@ -1823,14 +1935,16 @@
         <w:tc>
           <w:tcPr>
             <w:tcW w:type="dxa" w:w="1083"/>
+            <w:vAlign w:val="center"/>
           </w:tcPr>
           <w:p>
             <w:pPr>
-              <w:spacing w:line="269" w:lineRule="auto" w:after="40"/>
+              <w:spacing w:line="259" w:lineRule="auto" w:after="20"/>
             </w:pPr>
             <w:r>
               <w:rPr>
                 <w:rFonts w:ascii="Microsoft YaHei" w:hAnsi="Microsoft YaHei" w:eastAsia="Microsoft YaHei"/>
+                <w:b w:val="0"/>
                 <w:sz w:val="18"/>
               </w:rPr>
               <w:t>订单支付/预约服务</w:t>
@@ -1840,14 +1954,16 @@
         <w:tc>
           <w:tcPr>
             <w:tcW w:type="dxa" w:w="1083"/>
+            <w:vAlign w:val="center"/>
           </w:tcPr>
           <w:p>
             <w:pPr>
-              <w:spacing w:line="269" w:lineRule="auto" w:after="40"/>
+              <w:spacing w:line="259" w:lineRule="auto" w:after="20"/>
             </w:pPr>
             <w:r>
               <w:rPr>
                 <w:rFonts w:ascii="Microsoft YaHei" w:hAnsi="Microsoft YaHei" w:eastAsia="Microsoft YaHei"/>
+                <w:b w:val="0"/>
                 <w:sz w:val="18"/>
               </w:rPr>
               <w:t>网络抖动、回调重试</w:t>
@@ -1857,14 +1973,16 @@
         <w:tc>
           <w:tcPr>
             <w:tcW w:type="dxa" w:w="1083"/>
+            <w:vAlign w:val="center"/>
           </w:tcPr>
           <w:p>
             <w:pPr>
-              <w:spacing w:line="269" w:lineRule="auto" w:after="40"/>
+              <w:spacing w:line="259" w:lineRule="auto" w:after="20"/>
             </w:pPr>
             <w:r>
               <w:rPr>
                 <w:rFonts w:ascii="Microsoft YaHei" w:hAnsi="Microsoft YaHei" w:eastAsia="Microsoft YaHei"/>
+                <w:b w:val="0"/>
                 <w:sz w:val="18"/>
               </w:rPr>
               <w:t>订单与预约最终一致且可对账</w:t>
@@ -1874,14 +1992,16 @@
         <w:tc>
           <w:tcPr>
             <w:tcW w:type="dxa" w:w="1083"/>
+            <w:vAlign w:val="center"/>
           </w:tcPr>
           <w:p>
             <w:pPr>
-              <w:spacing w:line="269" w:lineRule="auto" w:after="40"/>
+              <w:spacing w:line="259" w:lineRule="auto" w:after="20"/>
             </w:pPr>
             <w:r>
               <w:rPr>
                 <w:rFonts w:ascii="Microsoft YaHei" w:hAnsi="Microsoft YaHei" w:eastAsia="Microsoft YaHei"/>
+                <w:b w:val="0"/>
                 <w:sz w:val="18"/>
               </w:rPr>
               <w:t>差异率≤0.1%，补偿≤10min</w:t>
@@ -1893,14 +2013,16 @@
         <w:tc>
           <w:tcPr>
             <w:tcW w:type="dxa" w:w="1083"/>
+            <w:vAlign w:val="center"/>
           </w:tcPr>
           <w:p>
             <w:pPr>
-              <w:spacing w:line="269" w:lineRule="auto" w:after="40"/>
+              <w:spacing w:line="259" w:lineRule="auto" w:after="20"/>
             </w:pPr>
             <w:r>
               <w:rPr>
                 <w:rFonts w:ascii="Microsoft YaHei" w:hAnsi="Microsoft YaHei" w:eastAsia="Microsoft YaHei"/>
+                <w:b w:val="0"/>
                 <w:sz w:val="18"/>
               </w:rPr>
               <w:t>QAS-05</w:t>
@@ -1910,14 +2032,16 @@
         <w:tc>
           <w:tcPr>
             <w:tcW w:type="dxa" w:w="1083"/>
+            <w:vAlign w:val="center"/>
           </w:tcPr>
           <w:p>
             <w:pPr>
-              <w:spacing w:line="269" w:lineRule="auto" w:after="40"/>
+              <w:spacing w:line="259" w:lineRule="auto" w:after="20"/>
             </w:pPr>
             <w:r>
               <w:rPr>
                 <w:rFonts w:ascii="Microsoft YaHei" w:hAnsi="Microsoft YaHei" w:eastAsia="Microsoft YaHei"/>
+                <w:b w:val="0"/>
                 <w:sz w:val="18"/>
               </w:rPr>
               <w:t>安全性</w:t>
@@ -1927,14 +2051,16 @@
         <w:tc>
           <w:tcPr>
             <w:tcW w:type="dxa" w:w="1083"/>
+            <w:vAlign w:val="center"/>
           </w:tcPr>
           <w:p>
             <w:pPr>
-              <w:spacing w:line="269" w:lineRule="auto" w:after="40"/>
+              <w:spacing w:line="259" w:lineRule="auto" w:after="20"/>
             </w:pPr>
             <w:r>
               <w:rPr>
                 <w:rFonts w:ascii="Microsoft YaHei" w:hAnsi="Microsoft YaHei" w:eastAsia="Microsoft YaHei"/>
+                <w:b w:val="0"/>
                 <w:sz w:val="18"/>
               </w:rPr>
               <w:t>访问会员资料与偏好</w:t>
@@ -1944,14 +2070,16 @@
         <w:tc>
           <w:tcPr>
             <w:tcW w:type="dxa" w:w="1083"/>
+            <w:vAlign w:val="center"/>
           </w:tcPr>
           <w:p>
             <w:pPr>
-              <w:spacing w:line="269" w:lineRule="auto" w:after="40"/>
+              <w:spacing w:line="259" w:lineRule="auto" w:after="20"/>
             </w:pPr>
             <w:r>
               <w:rPr>
                 <w:rFonts w:ascii="Microsoft YaHei" w:hAnsi="Microsoft YaHei" w:eastAsia="Microsoft YaHei"/>
+                <w:b w:val="0"/>
                 <w:sz w:val="18"/>
               </w:rPr>
               <w:t>顾客/攻击者</w:t>
@@ -1961,14 +2089,16 @@
         <w:tc>
           <w:tcPr>
             <w:tcW w:type="dxa" w:w="1083"/>
+            <w:vAlign w:val="center"/>
           </w:tcPr>
           <w:p>
             <w:pPr>
-              <w:spacing w:line="269" w:lineRule="auto" w:after="40"/>
+              <w:spacing w:line="259" w:lineRule="auto" w:after="20"/>
             </w:pPr>
             <w:r>
               <w:rPr>
                 <w:rFonts w:ascii="Microsoft YaHei" w:hAnsi="Microsoft YaHei" w:eastAsia="Microsoft YaHei"/>
+                <w:b w:val="0"/>
                 <w:sz w:val="18"/>
               </w:rPr>
               <w:t>越权查询或篡改请求</w:t>
@@ -1978,14 +2108,16 @@
         <w:tc>
           <w:tcPr>
             <w:tcW w:type="dxa" w:w="1083"/>
+            <w:vAlign w:val="center"/>
           </w:tcPr>
           <w:p>
             <w:pPr>
-              <w:spacing w:line="269" w:lineRule="auto" w:after="40"/>
+              <w:spacing w:line="259" w:lineRule="auto" w:after="20"/>
             </w:pPr>
             <w:r>
               <w:rPr>
                 <w:rFonts w:ascii="Microsoft YaHei" w:hAnsi="Microsoft YaHei" w:eastAsia="Microsoft YaHei"/>
+                <w:b w:val="0"/>
                 <w:sz w:val="18"/>
               </w:rPr>
               <w:t>会员服务/API网关</w:t>
@@ -1995,14 +2127,16 @@
         <w:tc>
           <w:tcPr>
             <w:tcW w:type="dxa" w:w="1083"/>
+            <w:vAlign w:val="center"/>
           </w:tcPr>
           <w:p>
             <w:pPr>
-              <w:spacing w:line="269" w:lineRule="auto" w:after="40"/>
+              <w:spacing w:line="259" w:lineRule="auto" w:after="20"/>
             </w:pPr>
             <w:r>
               <w:rPr>
                 <w:rFonts w:ascii="Microsoft YaHei" w:hAnsi="Microsoft YaHei" w:eastAsia="Microsoft YaHei"/>
+                <w:b w:val="0"/>
                 <w:sz w:val="18"/>
               </w:rPr>
               <w:t>生产环境</w:t>
@@ -2012,14 +2146,16 @@
         <w:tc>
           <w:tcPr>
             <w:tcW w:type="dxa" w:w="1083"/>
+            <w:vAlign w:val="center"/>
           </w:tcPr>
           <w:p>
             <w:pPr>
-              <w:spacing w:line="269" w:lineRule="auto" w:after="40"/>
+              <w:spacing w:line="259" w:lineRule="auto" w:after="20"/>
             </w:pPr>
             <w:r>
               <w:rPr>
                 <w:rFonts w:ascii="Microsoft YaHei" w:hAnsi="Microsoft YaHei" w:eastAsia="Microsoft YaHei"/>
+                <w:b w:val="0"/>
                 <w:sz w:val="18"/>
               </w:rPr>
               <w:t>拒绝越权并写入审计日志</w:t>
@@ -2029,14 +2165,16 @@
         <w:tc>
           <w:tcPr>
             <w:tcW w:type="dxa" w:w="1083"/>
+            <w:vAlign w:val="center"/>
           </w:tcPr>
           <w:p>
             <w:pPr>
-              <w:spacing w:line="269" w:lineRule="auto" w:after="40"/>
+              <w:spacing w:line="259" w:lineRule="auto" w:after="20"/>
             </w:pPr>
             <w:r>
               <w:rPr>
                 <w:rFonts w:ascii="Microsoft YaHei" w:hAnsi="Microsoft YaHei" w:eastAsia="Microsoft YaHei"/>
+                <w:b w:val="0"/>
                 <w:sz w:val="18"/>
               </w:rPr>
               <w:t>越权成功=0，审计覆盖=100%</w:t>
@@ -2048,14 +2186,16 @@
         <w:tc>
           <w:tcPr>
             <w:tcW w:type="dxa" w:w="1083"/>
+            <w:vAlign w:val="center"/>
           </w:tcPr>
           <w:p>
             <w:pPr>
-              <w:spacing w:line="269" w:lineRule="auto" w:after="40"/>
+              <w:spacing w:line="259" w:lineRule="auto" w:after="20"/>
             </w:pPr>
             <w:r>
               <w:rPr>
                 <w:rFonts w:ascii="Microsoft YaHei" w:hAnsi="Microsoft YaHei" w:eastAsia="Microsoft YaHei"/>
+                <w:b w:val="0"/>
                 <w:sz w:val="18"/>
               </w:rPr>
               <w:t>QAS-06</w:t>
@@ -2065,14 +2205,16 @@
         <w:tc>
           <w:tcPr>
             <w:tcW w:type="dxa" w:w="1083"/>
+            <w:vAlign w:val="center"/>
           </w:tcPr>
           <w:p>
             <w:pPr>
-              <w:spacing w:line="269" w:lineRule="auto" w:after="40"/>
+              <w:spacing w:line="259" w:lineRule="auto" w:after="20"/>
             </w:pPr>
             <w:r>
               <w:rPr>
                 <w:rFonts w:ascii="Microsoft YaHei" w:hAnsi="Microsoft YaHei" w:eastAsia="Microsoft YaHei"/>
+                <w:b w:val="0"/>
                 <w:sz w:val="18"/>
               </w:rPr>
               <w:t>隐私合规</w:t>
@@ -2082,14 +2224,16 @@
         <w:tc>
           <w:tcPr>
             <w:tcW w:type="dxa" w:w="1083"/>
+            <w:vAlign w:val="center"/>
           </w:tcPr>
           <w:p>
             <w:pPr>
-              <w:spacing w:line="269" w:lineRule="auto" w:after="40"/>
+              <w:spacing w:line="259" w:lineRule="auto" w:after="20"/>
             </w:pPr>
             <w:r>
               <w:rPr>
                 <w:rFonts w:ascii="Microsoft YaHei" w:hAnsi="Microsoft YaHei" w:eastAsia="Microsoft YaHei"/>
+                <w:b w:val="0"/>
                 <w:sz w:val="18"/>
               </w:rPr>
               <w:t>会员撤回营销授权</w:t>
@@ -2099,14 +2243,16 @@
         <w:tc>
           <w:tcPr>
             <w:tcW w:type="dxa" w:w="1083"/>
+            <w:vAlign w:val="center"/>
           </w:tcPr>
           <w:p>
             <w:pPr>
-              <w:spacing w:line="269" w:lineRule="auto" w:after="40"/>
+              <w:spacing w:line="259" w:lineRule="auto" w:after="20"/>
             </w:pPr>
             <w:r>
               <w:rPr>
                 <w:rFonts w:ascii="Microsoft YaHei" w:hAnsi="Microsoft YaHei" w:eastAsia="Microsoft YaHei"/>
+                <w:b w:val="0"/>
                 <w:sz w:val="18"/>
               </w:rPr>
               <w:t>会员</w:t>
@@ -2116,14 +2262,16 @@
         <w:tc>
           <w:tcPr>
             <w:tcW w:type="dxa" w:w="1083"/>
+            <w:vAlign w:val="center"/>
           </w:tcPr>
           <w:p>
             <w:pPr>
-              <w:spacing w:line="269" w:lineRule="auto" w:after="40"/>
+              <w:spacing w:line="259" w:lineRule="auto" w:after="20"/>
             </w:pPr>
             <w:r>
               <w:rPr>
                 <w:rFonts w:ascii="Microsoft YaHei" w:hAnsi="Microsoft YaHei" w:eastAsia="Microsoft YaHei"/>
+                <w:b w:val="0"/>
                 <w:sz w:val="18"/>
               </w:rPr>
               <w:t>关闭营销或推荐授权</w:t>
@@ -2133,14 +2281,16 @@
         <w:tc>
           <w:tcPr>
             <w:tcW w:type="dxa" w:w="1083"/>
+            <w:vAlign w:val="center"/>
           </w:tcPr>
           <w:p>
             <w:pPr>
-              <w:spacing w:line="269" w:lineRule="auto" w:after="40"/>
+              <w:spacing w:line="259" w:lineRule="auto" w:after="20"/>
             </w:pPr>
             <w:r>
               <w:rPr>
                 <w:rFonts w:ascii="Microsoft YaHei" w:hAnsi="Microsoft YaHei" w:eastAsia="Microsoft YaHei"/>
+                <w:b w:val="0"/>
                 <w:sz w:val="18"/>
               </w:rPr>
               <w:t>会员/通知/推荐服务</w:t>
@@ -2150,14 +2300,16 @@
         <w:tc>
           <w:tcPr>
             <w:tcW w:type="dxa" w:w="1083"/>
+            <w:vAlign w:val="center"/>
           </w:tcPr>
           <w:p>
             <w:pPr>
-              <w:spacing w:line="269" w:lineRule="auto" w:after="40"/>
+              <w:spacing w:line="259" w:lineRule="auto" w:after="20"/>
             </w:pPr>
             <w:r>
               <w:rPr>
                 <w:rFonts w:ascii="Microsoft YaHei" w:hAnsi="Microsoft YaHei" w:eastAsia="Microsoft YaHei"/>
+                <w:b w:val="0"/>
                 <w:sz w:val="18"/>
               </w:rPr>
               <w:t>任意客户端</w:t>
@@ -2167,14 +2319,16 @@
         <w:tc>
           <w:tcPr>
             <w:tcW w:type="dxa" w:w="1083"/>
+            <w:vAlign w:val="center"/>
           </w:tcPr>
           <w:p>
             <w:pPr>
-              <w:spacing w:line="269" w:lineRule="auto" w:after="40"/>
+              <w:spacing w:line="259" w:lineRule="auto" w:after="20"/>
             </w:pPr>
             <w:r>
               <w:rPr>
                 <w:rFonts w:ascii="Microsoft YaHei" w:hAnsi="Microsoft YaHei" w:eastAsia="Microsoft YaHei"/>
+                <w:b w:val="0"/>
                 <w:sz w:val="18"/>
               </w:rPr>
               <w:t>立即停止非必要推送并同步事件</w:t>
@@ -2184,14 +2338,16 @@
         <w:tc>
           <w:tcPr>
             <w:tcW w:type="dxa" w:w="1083"/>
+            <w:vAlign w:val="center"/>
           </w:tcPr>
           <w:p>
             <w:pPr>
-              <w:spacing w:line="269" w:lineRule="auto" w:after="40"/>
+              <w:spacing w:line="259" w:lineRule="auto" w:after="20"/>
             </w:pPr>
             <w:r>
               <w:rPr>
                 <w:rFonts w:ascii="Microsoft YaHei" w:hAnsi="Microsoft YaHei" w:eastAsia="Microsoft YaHei"/>
+                <w:b w:val="0"/>
                 <w:sz w:val="18"/>
               </w:rPr>
               <w:t>1min 内生效，保留撤回记录</w:t>
@@ -2203,14 +2359,16 @@
         <w:tc>
           <w:tcPr>
             <w:tcW w:type="dxa" w:w="1083"/>
+            <w:vAlign w:val="center"/>
           </w:tcPr>
           <w:p>
             <w:pPr>
-              <w:spacing w:line="269" w:lineRule="auto" w:after="40"/>
+              <w:spacing w:line="259" w:lineRule="auto" w:after="20"/>
             </w:pPr>
             <w:r>
               <w:rPr>
                 <w:rFonts w:ascii="Microsoft YaHei" w:hAnsi="Microsoft YaHei" w:eastAsia="Microsoft YaHei"/>
+                <w:b w:val="0"/>
                 <w:sz w:val="18"/>
               </w:rPr>
               <w:t>QAS-07</w:t>
@@ -2220,14 +2378,16 @@
         <w:tc>
           <w:tcPr>
             <w:tcW w:type="dxa" w:w="1083"/>
+            <w:vAlign w:val="center"/>
           </w:tcPr>
           <w:p>
             <w:pPr>
-              <w:spacing w:line="269" w:lineRule="auto" w:after="40"/>
+              <w:spacing w:line="259" w:lineRule="auto" w:after="20"/>
             </w:pPr>
             <w:r>
               <w:rPr>
                 <w:rFonts w:ascii="Microsoft YaHei" w:hAnsi="Microsoft YaHei" w:eastAsia="Microsoft YaHei"/>
+                <w:b w:val="0"/>
                 <w:sz w:val="18"/>
               </w:rPr>
               <w:t>可靠性</w:t>
@@ -2237,14 +2397,16 @@
         <w:tc>
           <w:tcPr>
             <w:tcW w:type="dxa" w:w="1083"/>
+            <w:vAlign w:val="center"/>
           </w:tcPr>
           <w:p>
             <w:pPr>
-              <w:spacing w:line="269" w:lineRule="auto" w:after="40"/>
+              <w:spacing w:line="259" w:lineRule="auto" w:after="20"/>
             </w:pPr>
             <w:r>
               <w:rPr>
                 <w:rFonts w:ascii="Microsoft YaHei" w:hAnsi="Microsoft YaHei" w:eastAsia="Microsoft YaHei"/>
+                <w:b w:val="0"/>
                 <w:sz w:val="18"/>
               </w:rPr>
               <w:t>通知服务短暂不可用</w:t>
@@ -2254,14 +2416,16 @@
         <w:tc>
           <w:tcPr>
             <w:tcW w:type="dxa" w:w="1083"/>
+            <w:vAlign w:val="center"/>
           </w:tcPr>
           <w:p>
             <w:pPr>
-              <w:spacing w:line="269" w:lineRule="auto" w:after="40"/>
+              <w:spacing w:line="259" w:lineRule="auto" w:after="20"/>
             </w:pPr>
             <w:r>
               <w:rPr>
                 <w:rFonts w:ascii="Microsoft YaHei" w:hAnsi="Microsoft YaHei" w:eastAsia="Microsoft YaHei"/>
+                <w:b w:val="0"/>
                 <w:sz w:val="18"/>
               </w:rPr>
               <w:t>短信/站内信通道</w:t>
@@ -2271,14 +2435,16 @@
         <w:tc>
           <w:tcPr>
             <w:tcW w:type="dxa" w:w="1083"/>
+            <w:vAlign w:val="center"/>
           </w:tcPr>
           <w:p>
             <w:pPr>
-              <w:spacing w:line="269" w:lineRule="auto" w:after="40"/>
+              <w:spacing w:line="259" w:lineRule="auto" w:after="20"/>
             </w:pPr>
             <w:r>
               <w:rPr>
                 <w:rFonts w:ascii="Microsoft YaHei" w:hAnsi="Microsoft YaHei" w:eastAsia="Microsoft YaHei"/>
+                <w:b w:val="0"/>
                 <w:sz w:val="18"/>
               </w:rPr>
               <w:t>发送失败或限流</w:t>
@@ -2288,14 +2454,16 @@
         <w:tc>
           <w:tcPr>
             <w:tcW w:type="dxa" w:w="1083"/>
+            <w:vAlign w:val="center"/>
           </w:tcPr>
           <w:p>
             <w:pPr>
-              <w:spacing w:line="269" w:lineRule="auto" w:after="40"/>
+              <w:spacing w:line="259" w:lineRule="auto" w:after="20"/>
             </w:pPr>
             <w:r>
               <w:rPr>
                 <w:rFonts w:ascii="Microsoft YaHei" w:hAnsi="Microsoft YaHei" w:eastAsia="Microsoft YaHei"/>
+                <w:b w:val="0"/>
                 <w:sz w:val="18"/>
               </w:rPr>
               <w:t>通知服务/消息队列</w:t>
@@ -2305,14 +2473,16 @@
         <w:tc>
           <w:tcPr>
             <w:tcW w:type="dxa" w:w="1083"/>
+            <w:vAlign w:val="center"/>
           </w:tcPr>
           <w:p>
             <w:pPr>
-              <w:spacing w:line="269" w:lineRule="auto" w:after="40"/>
+              <w:spacing w:line="259" w:lineRule="auto" w:after="20"/>
             </w:pPr>
             <w:r>
               <w:rPr>
                 <w:rFonts w:ascii="Microsoft YaHei" w:hAnsi="Microsoft YaHei" w:eastAsia="Microsoft YaHei"/>
+                <w:b w:val="0"/>
                 <w:sz w:val="18"/>
               </w:rPr>
               <w:t>支付成功后</w:t>
@@ -2322,14 +2492,16 @@
         <w:tc>
           <w:tcPr>
             <w:tcW w:type="dxa" w:w="1083"/>
+            <w:vAlign w:val="center"/>
           </w:tcPr>
           <w:p>
             <w:pPr>
-              <w:spacing w:line="269" w:lineRule="auto" w:after="40"/>
+              <w:spacing w:line="259" w:lineRule="auto" w:after="20"/>
             </w:pPr>
             <w:r>
               <w:rPr>
                 <w:rFonts w:ascii="Microsoft YaHei" w:hAnsi="Microsoft YaHei" w:eastAsia="Microsoft YaHei"/>
+                <w:b w:val="0"/>
                 <w:sz w:val="18"/>
               </w:rPr>
               <w:t>进入重试队列并可人工补发</w:t>
@@ -2339,14 +2511,16 @@
         <w:tc>
           <w:tcPr>
             <w:tcW w:type="dxa" w:w="1083"/>
+            <w:vAlign w:val="center"/>
           </w:tcPr>
           <w:p>
             <w:pPr>
-              <w:spacing w:line="269" w:lineRule="auto" w:after="40"/>
+              <w:spacing w:line="259" w:lineRule="auto" w:after="20"/>
             </w:pPr>
             <w:r>
               <w:rPr>
                 <w:rFonts w:ascii="Microsoft YaHei" w:hAnsi="Microsoft YaHei" w:eastAsia="Microsoft YaHei"/>
+                <w:b w:val="0"/>
                 <w:sz w:val="18"/>
               </w:rPr>
               <w:t>重试成功率≥99%，死信可追踪</w:t>
@@ -2358,14 +2532,16 @@
         <w:tc>
           <w:tcPr>
             <w:tcW w:type="dxa" w:w="1083"/>
+            <w:vAlign w:val="center"/>
           </w:tcPr>
           <w:p>
             <w:pPr>
-              <w:spacing w:line="269" w:lineRule="auto" w:after="40"/>
+              <w:spacing w:line="259" w:lineRule="auto" w:after="20"/>
             </w:pPr>
             <w:r>
               <w:rPr>
                 <w:rFonts w:ascii="Microsoft YaHei" w:hAnsi="Microsoft YaHei" w:eastAsia="Microsoft YaHei"/>
+                <w:b w:val="0"/>
                 <w:sz w:val="18"/>
               </w:rPr>
               <w:t>QAS-08</w:t>
@@ -2375,14 +2551,16 @@
         <w:tc>
           <w:tcPr>
             <w:tcW w:type="dxa" w:w="1083"/>
+            <w:vAlign w:val="center"/>
           </w:tcPr>
           <w:p>
             <w:pPr>
-              <w:spacing w:line="269" w:lineRule="auto" w:after="40"/>
+              <w:spacing w:line="259" w:lineRule="auto" w:after="20"/>
             </w:pPr>
             <w:r>
               <w:rPr>
                 <w:rFonts w:ascii="Microsoft YaHei" w:hAnsi="Microsoft YaHei" w:eastAsia="Microsoft YaHei"/>
+                <w:b w:val="0"/>
                 <w:sz w:val="18"/>
               </w:rPr>
               <w:t>可维护性</w:t>
@@ -2392,14 +2570,16 @@
         <w:tc>
           <w:tcPr>
             <w:tcW w:type="dxa" w:w="1083"/>
+            <w:vAlign w:val="center"/>
           </w:tcPr>
           <w:p>
             <w:pPr>
-              <w:spacing w:line="269" w:lineRule="auto" w:after="40"/>
+              <w:spacing w:line="259" w:lineRule="auto" w:after="20"/>
             </w:pPr>
             <w:r>
               <w:rPr>
                 <w:rFonts w:ascii="Microsoft YaHei" w:hAnsi="Microsoft YaHei" w:eastAsia="Microsoft YaHei"/>
+                <w:b w:val="0"/>
                 <w:sz w:val="18"/>
               </w:rPr>
               <w:t>修改预约取消规则</w:t>
@@ -2409,14 +2589,16 @@
         <w:tc>
           <w:tcPr>
             <w:tcW w:type="dxa" w:w="1083"/>
+            <w:vAlign w:val="center"/>
           </w:tcPr>
           <w:p>
             <w:pPr>
-              <w:spacing w:line="269" w:lineRule="auto" w:after="40"/>
+              <w:spacing w:line="259" w:lineRule="auto" w:after="20"/>
             </w:pPr>
             <w:r>
               <w:rPr>
                 <w:rFonts w:ascii="Microsoft YaHei" w:hAnsi="Microsoft YaHei" w:eastAsia="Microsoft YaHei"/>
+                <w:b w:val="0"/>
                 <w:sz w:val="18"/>
               </w:rPr>
               <w:t>开发者</w:t>
@@ -2426,14 +2608,16 @@
         <w:tc>
           <w:tcPr>
             <w:tcW w:type="dxa" w:w="1083"/>
+            <w:vAlign w:val="center"/>
           </w:tcPr>
           <w:p>
             <w:pPr>
-              <w:spacing w:line="269" w:lineRule="auto" w:after="40"/>
+              <w:spacing w:line="259" w:lineRule="auto" w:after="20"/>
             </w:pPr>
             <w:r>
               <w:rPr>
                 <w:rFonts w:ascii="Microsoft YaHei" w:hAnsi="Microsoft YaHei" w:eastAsia="Microsoft YaHei"/>
+                <w:b w:val="0"/>
                 <w:sz w:val="18"/>
               </w:rPr>
               <w:t>规则变更上线</w:t>
@@ -2443,14 +2627,16 @@
         <w:tc>
           <w:tcPr>
             <w:tcW w:type="dxa" w:w="1083"/>
+            <w:vAlign w:val="center"/>
           </w:tcPr>
           <w:p>
             <w:pPr>
-              <w:spacing w:line="269" w:lineRule="auto" w:after="40"/>
+              <w:spacing w:line="259" w:lineRule="auto" w:after="20"/>
             </w:pPr>
             <w:r>
               <w:rPr>
                 <w:rFonts w:ascii="Microsoft YaHei" w:hAnsi="Microsoft YaHei" w:eastAsia="Microsoft YaHei"/>
+                <w:b w:val="0"/>
                 <w:sz w:val="18"/>
               </w:rPr>
               <w:t>预约策略组件</w:t>
@@ -2460,14 +2646,16 @@
         <w:tc>
           <w:tcPr>
             <w:tcW w:type="dxa" w:w="1083"/>
+            <w:vAlign w:val="center"/>
           </w:tcPr>
           <w:p>
             <w:pPr>
-              <w:spacing w:line="269" w:lineRule="auto" w:after="40"/>
+              <w:spacing w:line="259" w:lineRule="auto" w:after="20"/>
             </w:pPr>
             <w:r>
               <w:rPr>
                 <w:rFonts w:ascii="Microsoft YaHei" w:hAnsi="Microsoft YaHei" w:eastAsia="Microsoft YaHei"/>
+                <w:b w:val="0"/>
                 <w:sz w:val="18"/>
               </w:rPr>
               <w:t>迭代发布</w:t>
@@ -2477,14 +2665,16 @@
         <w:tc>
           <w:tcPr>
             <w:tcW w:type="dxa" w:w="1083"/>
+            <w:vAlign w:val="center"/>
           </w:tcPr>
           <w:p>
             <w:pPr>
-              <w:spacing w:line="269" w:lineRule="auto" w:after="40"/>
+              <w:spacing w:line="259" w:lineRule="auto" w:after="20"/>
             </w:pPr>
             <w:r>
               <w:rPr>
                 <w:rFonts w:ascii="Microsoft YaHei" w:hAnsi="Microsoft YaHei" w:eastAsia="Microsoft YaHei"/>
+                <w:b w:val="0"/>
                 <w:sz w:val="18"/>
               </w:rPr>
               <w:t>仅修改策略模块和契约测试</w:t>
@@ -2494,14 +2684,16 @@
         <w:tc>
           <w:tcPr>
             <w:tcW w:type="dxa" w:w="1083"/>
+            <w:vAlign w:val="center"/>
           </w:tcPr>
           <w:p>
             <w:pPr>
-              <w:spacing w:line="269" w:lineRule="auto" w:after="40"/>
+              <w:spacing w:line="259" w:lineRule="auto" w:after="20"/>
             </w:pPr>
             <w:r>
               <w:rPr>
                 <w:rFonts w:ascii="Microsoft YaHei" w:hAnsi="Microsoft YaHei" w:eastAsia="Microsoft YaHei"/>
+                <w:b w:val="0"/>
                 <w:sz w:val="18"/>
               </w:rPr>
               <w:t>影响模块≤2 个，回归用例全通过</w:t>
@@ -2513,14 +2705,16 @@
         <w:tc>
           <w:tcPr>
             <w:tcW w:type="dxa" w:w="1083"/>
+            <w:vAlign w:val="center"/>
           </w:tcPr>
           <w:p>
             <w:pPr>
-              <w:spacing w:line="269" w:lineRule="auto" w:after="40"/>
+              <w:spacing w:line="259" w:lineRule="auto" w:after="20"/>
             </w:pPr>
             <w:r>
               <w:rPr>
                 <w:rFonts w:ascii="Microsoft YaHei" w:hAnsi="Microsoft YaHei" w:eastAsia="Microsoft YaHei"/>
+                <w:b w:val="0"/>
                 <w:sz w:val="18"/>
               </w:rPr>
               <w:t>QAS-09</w:t>
@@ -2530,14 +2724,16 @@
         <w:tc>
           <w:tcPr>
             <w:tcW w:type="dxa" w:w="1083"/>
+            <w:vAlign w:val="center"/>
           </w:tcPr>
           <w:p>
             <w:pPr>
-              <w:spacing w:line="269" w:lineRule="auto" w:after="40"/>
+              <w:spacing w:line="259" w:lineRule="auto" w:after="20"/>
             </w:pPr>
             <w:r>
               <w:rPr>
                 <w:rFonts w:ascii="Microsoft YaHei" w:hAnsi="Microsoft YaHei" w:eastAsia="Microsoft YaHei"/>
+                <w:b w:val="0"/>
                 <w:sz w:val="18"/>
               </w:rPr>
               <w:t>可观测性</w:t>
@@ -2547,14 +2743,16 @@
         <w:tc>
           <w:tcPr>
             <w:tcW w:type="dxa" w:w="1083"/>
+            <w:vAlign w:val="center"/>
           </w:tcPr>
           <w:p>
             <w:pPr>
-              <w:spacing w:line="269" w:lineRule="auto" w:after="40"/>
+              <w:spacing w:line="259" w:lineRule="auto" w:after="20"/>
             </w:pPr>
             <w:r>
               <w:rPr>
                 <w:rFonts w:ascii="Microsoft YaHei" w:hAnsi="Microsoft YaHei" w:eastAsia="Microsoft YaHei"/>
+                <w:b w:val="0"/>
                 <w:sz w:val="18"/>
               </w:rPr>
               <w:t>预约失败率异常升高</w:t>
@@ -2564,14 +2762,16 @@
         <w:tc>
           <w:tcPr>
             <w:tcW w:type="dxa" w:w="1083"/>
+            <w:vAlign w:val="center"/>
           </w:tcPr>
           <w:p>
             <w:pPr>
-              <w:spacing w:line="269" w:lineRule="auto" w:after="40"/>
+              <w:spacing w:line="259" w:lineRule="auto" w:after="20"/>
             </w:pPr>
             <w:r>
               <w:rPr>
                 <w:rFonts w:ascii="Microsoft YaHei" w:hAnsi="Microsoft YaHei" w:eastAsia="Microsoft YaHei"/>
+                <w:b w:val="0"/>
                 <w:sz w:val="18"/>
               </w:rPr>
               <w:t>监控系统</w:t>
@@ -2581,14 +2781,16 @@
         <w:tc>
           <w:tcPr>
             <w:tcW w:type="dxa" w:w="1083"/>
+            <w:vAlign w:val="center"/>
           </w:tcPr>
           <w:p>
             <w:pPr>
-              <w:spacing w:line="269" w:lineRule="auto" w:after="40"/>
+              <w:spacing w:line="259" w:lineRule="auto" w:after="20"/>
             </w:pPr>
             <w:r>
               <w:rPr>
                 <w:rFonts w:ascii="Microsoft YaHei" w:hAnsi="Microsoft YaHei" w:eastAsia="Microsoft YaHei"/>
+                <w:b w:val="0"/>
                 <w:sz w:val="18"/>
               </w:rPr>
               <w:t>失败率超过阈值</w:t>
@@ -2598,14 +2800,16 @@
         <w:tc>
           <w:tcPr>
             <w:tcW w:type="dxa" w:w="1083"/>
+            <w:vAlign w:val="center"/>
           </w:tcPr>
           <w:p>
             <w:pPr>
-              <w:spacing w:line="269" w:lineRule="auto" w:after="40"/>
+              <w:spacing w:line="259" w:lineRule="auto" w:after="20"/>
             </w:pPr>
             <w:r>
               <w:rPr>
                 <w:rFonts w:ascii="Microsoft YaHei" w:hAnsi="Microsoft YaHei" w:eastAsia="Microsoft YaHei"/>
+                <w:b w:val="0"/>
                 <w:sz w:val="18"/>
               </w:rPr>
               <w:t>网关/预约/支付/通知链路</w:t>
@@ -2615,14 +2819,16 @@
         <w:tc>
           <w:tcPr>
             <w:tcW w:type="dxa" w:w="1083"/>
+            <w:vAlign w:val="center"/>
           </w:tcPr>
           <w:p>
             <w:pPr>
-              <w:spacing w:line="269" w:lineRule="auto" w:after="40"/>
+              <w:spacing w:line="259" w:lineRule="auto" w:after="20"/>
             </w:pPr>
             <w:r>
               <w:rPr>
                 <w:rFonts w:ascii="Microsoft YaHei" w:hAnsi="Microsoft YaHei" w:eastAsia="Microsoft YaHei"/>
+                <w:b w:val="0"/>
                 <w:sz w:val="18"/>
               </w:rPr>
               <w:t>生产高峰</w:t>
@@ -2632,14 +2838,16 @@
         <w:tc>
           <w:tcPr>
             <w:tcW w:type="dxa" w:w="1083"/>
+            <w:vAlign w:val="center"/>
           </w:tcPr>
           <w:p>
             <w:pPr>
-              <w:spacing w:line="269" w:lineRule="auto" w:after="40"/>
+              <w:spacing w:line="259" w:lineRule="auto" w:after="20"/>
             </w:pPr>
             <w:r>
               <w:rPr>
                 <w:rFonts w:ascii="Microsoft YaHei" w:hAnsi="Microsoft YaHei" w:eastAsia="Microsoft YaHei"/>
+                <w:b w:val="0"/>
                 <w:sz w:val="18"/>
               </w:rPr>
               <w:t>触发告警并定位 traceId</w:t>
@@ -2649,14 +2857,16 @@
         <w:tc>
           <w:tcPr>
             <w:tcW w:type="dxa" w:w="1083"/>
+            <w:vAlign w:val="center"/>
           </w:tcPr>
           <w:p>
             <w:pPr>
-              <w:spacing w:line="269" w:lineRule="auto" w:after="40"/>
+              <w:spacing w:line="259" w:lineRule="auto" w:after="20"/>
             </w:pPr>
             <w:r>
               <w:rPr>
                 <w:rFonts w:ascii="Microsoft YaHei" w:hAnsi="Microsoft YaHei" w:eastAsia="Microsoft YaHei"/>
+                <w:b w:val="0"/>
                 <w:sz w:val="18"/>
               </w:rPr>
               <w:t>5min 内告警，链路完整率≥95%</w:t>
@@ -2668,14 +2878,16 @@
         <w:tc>
           <w:tcPr>
             <w:tcW w:type="dxa" w:w="1083"/>
+            <w:vAlign w:val="center"/>
           </w:tcPr>
           <w:p>
             <w:pPr>
-              <w:spacing w:line="269" w:lineRule="auto" w:after="40"/>
+              <w:spacing w:line="259" w:lineRule="auto" w:after="20"/>
             </w:pPr>
             <w:r>
               <w:rPr>
                 <w:rFonts w:ascii="Microsoft YaHei" w:hAnsi="Microsoft YaHei" w:eastAsia="Microsoft YaHei"/>
+                <w:b w:val="0"/>
                 <w:sz w:val="18"/>
               </w:rPr>
               <w:t>QAS-10</w:t>
@@ -2685,14 +2897,16 @@
         <w:tc>
           <w:tcPr>
             <w:tcW w:type="dxa" w:w="1083"/>
+            <w:vAlign w:val="center"/>
           </w:tcPr>
           <w:p>
             <w:pPr>
-              <w:spacing w:line="269" w:lineRule="auto" w:after="40"/>
+              <w:spacing w:line="259" w:lineRule="auto" w:after="20"/>
             </w:pPr>
             <w:r>
               <w:rPr>
                 <w:rFonts w:ascii="Microsoft YaHei" w:hAnsi="Microsoft YaHei" w:eastAsia="Microsoft YaHei"/>
+                <w:b w:val="0"/>
                 <w:sz w:val="18"/>
               </w:rPr>
               <w:t>容量弹性</w:t>
@@ -2702,14 +2916,16 @@
         <w:tc>
           <w:tcPr>
             <w:tcW w:type="dxa" w:w="1083"/>
+            <w:vAlign w:val="center"/>
           </w:tcPr>
           <w:p>
             <w:pPr>
-              <w:spacing w:line="269" w:lineRule="auto" w:after="40"/>
+              <w:spacing w:line="259" w:lineRule="auto" w:after="20"/>
             </w:pPr>
             <w:r>
               <w:rPr>
                 <w:rFonts w:ascii="Microsoft YaHei" w:hAnsi="Microsoft YaHei" w:eastAsia="Microsoft YaHei"/>
+                <w:b w:val="0"/>
                 <w:sz w:val="18"/>
               </w:rPr>
               <w:t>运营活动带来流量突增</w:t>
@@ -2719,14 +2935,16 @@
         <w:tc>
           <w:tcPr>
             <w:tcW w:type="dxa" w:w="1083"/>
+            <w:vAlign w:val="center"/>
           </w:tcPr>
           <w:p>
             <w:pPr>
-              <w:spacing w:line="269" w:lineRule="auto" w:after="40"/>
+              <w:spacing w:line="259" w:lineRule="auto" w:after="20"/>
             </w:pPr>
             <w:r>
               <w:rPr>
                 <w:rFonts w:ascii="Microsoft YaHei" w:hAnsi="Microsoft YaHei" w:eastAsia="Microsoft YaHei"/>
+                <w:b w:val="0"/>
                 <w:sz w:val="18"/>
               </w:rPr>
               <w:t>市场活动</w:t>
@@ -2736,14 +2954,16 @@
         <w:tc>
           <w:tcPr>
             <w:tcW w:type="dxa" w:w="1083"/>
+            <w:vAlign w:val="center"/>
           </w:tcPr>
           <w:p>
             <w:pPr>
-              <w:spacing w:line="269" w:lineRule="auto" w:after="40"/>
+              <w:spacing w:line="259" w:lineRule="auto" w:after="20"/>
             </w:pPr>
             <w:r>
               <w:rPr>
                 <w:rFonts w:ascii="Microsoft YaHei" w:hAnsi="Microsoft YaHei" w:eastAsia="Microsoft YaHei"/>
+                <w:b w:val="0"/>
                 <w:sz w:val="18"/>
               </w:rPr>
               <w:t>流量升至平时 3 倍</w:t>
@@ -2753,14 +2973,16 @@
         <w:tc>
           <w:tcPr>
             <w:tcW w:type="dxa" w:w="1083"/>
+            <w:vAlign w:val="center"/>
           </w:tcPr>
           <w:p>
             <w:pPr>
-              <w:spacing w:line="269" w:lineRule="auto" w:after="40"/>
+              <w:spacing w:line="259" w:lineRule="auto" w:after="20"/>
             </w:pPr>
             <w:r>
               <w:rPr>
                 <w:rFonts w:ascii="Microsoft YaHei" w:hAnsi="Microsoft YaHei" w:eastAsia="Microsoft YaHei"/>
+                <w:b w:val="0"/>
                 <w:sz w:val="18"/>
               </w:rPr>
               <w:t>网关/预约/缓存</w:t>
@@ -2770,14 +2992,16 @@
         <w:tc>
           <w:tcPr>
             <w:tcW w:type="dxa" w:w="1083"/>
+            <w:vAlign w:val="center"/>
           </w:tcPr>
           <w:p>
             <w:pPr>
-              <w:spacing w:line="269" w:lineRule="auto" w:after="40"/>
+              <w:spacing w:line="259" w:lineRule="auto" w:after="20"/>
             </w:pPr>
             <w:r>
               <w:rPr>
                 <w:rFonts w:ascii="Microsoft YaHei" w:hAnsi="Microsoft YaHei" w:eastAsia="Microsoft YaHei"/>
+                <w:b w:val="0"/>
                 <w:sz w:val="18"/>
               </w:rPr>
               <w:t>活动期间</w:t>
@@ -2787,14 +3011,16 @@
         <w:tc>
           <w:tcPr>
             <w:tcW w:type="dxa" w:w="1083"/>
+            <w:vAlign w:val="center"/>
           </w:tcPr>
           <w:p>
             <w:pPr>
-              <w:spacing w:line="269" w:lineRule="auto" w:after="40"/>
+              <w:spacing w:line="259" w:lineRule="auto" w:after="20"/>
             </w:pPr>
             <w:r>
               <w:rPr>
                 <w:rFonts w:ascii="Microsoft YaHei" w:hAnsi="Microsoft YaHei" w:eastAsia="Microsoft YaHei"/>
+                <w:b w:val="0"/>
                 <w:sz w:val="18"/>
               </w:rPr>
               <w:t>限流、缓存和扩容保护核心链路</w:t>
@@ -2804,14 +3030,16 @@
         <w:tc>
           <w:tcPr>
             <w:tcW w:type="dxa" w:w="1083"/>
+            <w:vAlign w:val="center"/>
           </w:tcPr>
           <w:p>
             <w:pPr>
-              <w:spacing w:line="269" w:lineRule="auto" w:after="40"/>
+              <w:spacing w:line="259" w:lineRule="auto" w:after="20"/>
             </w:pPr>
             <w:r>
               <w:rPr>
                 <w:rFonts w:ascii="Microsoft YaHei" w:hAnsi="Microsoft YaHei" w:eastAsia="Microsoft YaHei"/>
+                <w:b w:val="0"/>
                 <w:sz w:val="18"/>
               </w:rPr>
               <w:t>核心链路可用，非核心可降级</w:t>
@@ -2822,7 +3050,7 @@
     </w:tbl>
     <w:p>
       <w:pPr>
-        <w:spacing w:after="80" w:line="276" w:lineRule="auto"/>
+        <w:spacing w:after="60" w:line="269" w:lineRule="auto"/>
       </w:pPr>
     </w:p>
     <w:tbl>
@@ -2835,6 +3063,9 @@
         <w:gridCol w:w="9746"/>
       </w:tblGrid>
       <w:tr>
+        <w:trPr>
+          <w:tblHeader w:val="true"/>
+        </w:trPr>
         <w:tc>
           <w:tcPr>
             <w:tcW w:type="dxa" w:w="9746"/>
@@ -2845,15 +3076,16 @@
               <w:bottom w:val="single" w:sz="4" w:space="0" w:color="B8D8C2"/>
               <w:right w:val="single" w:sz="4" w:space="0" w:color="B8D8C2"/>
             </w:tcBorders>
-            <w:vAlign w:val="top"/>
+            <w:vAlign w:val="center"/>
           </w:tcPr>
           <w:p>
             <w:pPr>
-              <w:spacing w:line="269" w:lineRule="auto" w:after="40"/>
+              <w:spacing w:line="259" w:lineRule="auto" w:after="20"/>
             </w:pPr>
             <w:r>
               <w:rPr>
                 <w:rFonts w:ascii="Microsoft YaHei" w:hAnsi="Microsoft YaHei" w:eastAsia="Microsoft YaHei"/>
+                <w:b w:val="0"/>
                 <w:sz w:val="18"/>
               </w:rPr>
               <w:t>架构关注点清单：</w:t>
@@ -2874,13 +3106,13 @@
     </w:tbl>
     <w:p>
       <w:pPr>
-        <w:spacing w:after="80" w:line="276" w:lineRule="auto"/>
+        <w:spacing w:after="60" w:line="269" w:lineRule="auto"/>
       </w:pPr>
     </w:p>
     <w:p>
       <w:pPr>
         <w:keepNext/>
-        <w:spacing w:before="280" w:after="80" w:line="276" w:lineRule="auto"/>
+        <w:spacing w:before="280" w:after="60" w:line="269" w:lineRule="auto"/>
         <w:pBdr>
           <w:bottom w:val="single" w:sz="8" w:space="4" w:color="1A7A3D"/>
         </w:pBdr>
@@ -2904,6 +3136,9 @@
         <w:gridCol w:w="9746"/>
       </w:tblGrid>
       <w:tr>
+        <w:trPr>
+          <w:tblHeader w:val="true"/>
+        </w:trPr>
         <w:tc>
           <w:tcPr>
             <w:tcW w:type="dxa" w:w="9746"/>
@@ -2914,15 +3149,16 @@
               <w:bottom w:val="single" w:sz="4" w:space="0" w:color="B8D8C2"/>
               <w:right w:val="single" w:sz="4" w:space="0" w:color="B8D8C2"/>
             </w:tcBorders>
-            <w:vAlign w:val="top"/>
+            <w:vAlign w:val="center"/>
           </w:tcPr>
           <w:p>
             <w:pPr>
-              <w:spacing w:line="269" w:lineRule="auto" w:after="40"/>
+              <w:spacing w:line="259" w:lineRule="auto" w:after="20"/>
             </w:pPr>
             <w:r>
               <w:rPr>
                 <w:rFonts w:ascii="Microsoft YaHei" w:hAnsi="Microsoft YaHei" w:eastAsia="Microsoft YaHei"/>
+                <w:b w:val="0"/>
                 <w:sz w:val="18"/>
               </w:rPr>
               <w:t>优先级裁决：本次架构设计优先满足 QAS-01、QAS-02、QAS-04、QAS-05、QAS-09。低优先级场景允许通过运营流程或人工补偿短期兜底，但必须在 ADR 中记录取舍理由。</w:t>
@@ -2938,7 +3174,595 @@
     </w:tbl>
     <w:p>
       <w:pPr>
-        <w:spacing w:after="80" w:line="276" w:lineRule="auto"/>
+        <w:spacing w:after="60" w:line="269" w:lineRule="auto"/>
+      </w:pPr>
+    </w:p>
+    <w:p>
+      <w:pPr>
+        <w:spacing w:line="269" w:lineRule="auto" w:after="60" w:before="200"/>
+      </w:pPr>
+      <w:r>
+        <w:rPr>
+          <w:rFonts w:ascii="Microsoft YaHei" w:hAnsi="Microsoft YaHei" w:eastAsia="Microsoft YaHei"/>
+          <w:b w:val="0"/>
+          <w:sz w:val="21"/>
+        </w:rPr>
+      </w:r>
+      <w:r>
+        <w:rPr>
+          <w:rFonts w:ascii="Microsoft YaHei" w:hAnsi="Microsoft YaHei" w:eastAsia="Microsoft YaHei"/>
+          <w:b/>
+          <w:color w:val="007046"/>
+          <w:sz w:val="27"/>
+        </w:rPr>
+        <w:t>5  补充说明与评审依据</w:t>
+      </w:r>
+    </w:p>
+    <w:p>
+      <w:pPr>
+        <w:spacing w:line="269" w:lineRule="auto" w:after="60"/>
+      </w:pPr>
+      <w:r>
+        <w:rPr>
+          <w:rFonts w:ascii="Microsoft YaHei" w:hAnsi="Microsoft YaHei" w:eastAsia="Microsoft YaHei"/>
+          <w:b w:val="0"/>
+          <w:sz w:val="21"/>
+        </w:rPr>
+      </w:r>
+      <w:r>
+        <w:rPr>
+          <w:rFonts w:ascii="Microsoft YaHei" w:hAnsi="Microsoft YaHei" w:eastAsia="Microsoft YaHei"/>
+          <w:b w:val="0"/>
+          <w:sz w:val="21"/>
+        </w:rPr>
+        <w:t>质量属性不是独立于功能之外的口号，而是对核心预约链路的工程约束。本项目把“顾客能顺利完成预约并到店消费”作为根效用，因此性能、可用性、安全性、可维护性和可观测性都围绕预约创建、押金支付、通知送达、到店核销四个环节展开。</w:t>
+      </w:r>
+    </w:p>
+    <w:p>
+      <w:pPr>
+        <w:spacing w:line="269" w:lineRule="auto" w:after="60"/>
+      </w:pPr>
+      <w:r>
+        <w:rPr>
+          <w:rFonts w:ascii="Microsoft YaHei" w:hAnsi="Microsoft YaHei" w:eastAsia="Microsoft YaHei"/>
+          <w:b w:val="0"/>
+          <w:sz w:val="21"/>
+        </w:rPr>
+      </w:r>
+      <w:r>
+        <w:rPr>
+          <w:rFonts w:ascii="Microsoft YaHei" w:hAnsi="Microsoft YaHei" w:eastAsia="Microsoft YaHei"/>
+          <w:b w:val="0"/>
+          <w:sz w:val="21"/>
+        </w:rPr>
+        <w:t>效用树中的叶子节点均被转写为可测试场景：例如 P95 延迟、并发预约冲突、支付失败重试、手机号脱敏、traceId 链路追踪等。这样做的目的是把后续架构选择与可验收指标绑定，避免只凭主观偏好选择微服务、消息队列或数据库。</w:t>
+      </w:r>
+    </w:p>
+    <w:p>
+      <w:pPr>
+        <w:spacing w:line="269" w:lineRule="auto" w:after="60"/>
+      </w:pPr>
+      <w:r>
+        <w:rPr>
+          <w:rFonts w:ascii="Microsoft YaHei" w:hAnsi="Microsoft YaHei" w:eastAsia="Microsoft YaHei"/>
+          <w:b w:val="0"/>
+          <w:sz w:val="21"/>
+        </w:rPr>
+      </w:r>
+      <w:r>
+        <w:rPr>
+          <w:rFonts w:ascii="Microsoft YaHei" w:hAnsi="Microsoft YaHei" w:eastAsia="Microsoft YaHei"/>
+          <w:b w:val="0"/>
+          <w:sz w:val="21"/>
+        </w:rPr>
+        <w:t>Top-10 QAS 的排序依据为业务影响、发生频率、实现风险和课程验收价值。高优先级条目会直接影响 D2-3 的 ATAM 权衡、D2-5 的 OpenAPI 错误模型、D2-6 的数据约束以及 D2-8 的阶段路线图。</w:t>
+      </w:r>
+    </w:p>
+    <w:tbl>
+      <w:tblPr>
+        <w:tblStyle w:val="TableGrid"/>
+        <w:tblW w:type="auto" w:w="0"/>
+        <w:jc w:val="center"/>
+        <w:tblLook w:firstColumn="1" w:firstRow="1" w:lastColumn="0" w:lastRow="0" w:noHBand="0" w:noVBand="1" w:val="04A0"/>
+      </w:tblPr>
+      <w:tblGrid>
+        <w:gridCol w:w="3249"/>
+        <w:gridCol w:w="3249"/>
+        <w:gridCol w:w="3249"/>
+      </w:tblGrid>
+      <w:tr>
+        <w:trPr>
+          <w:tblHeader w:val="true"/>
+        </w:trPr>
+        <w:tc>
+          <w:tcPr>
+            <w:tcW w:type="dxa" w:w="3249"/>
+            <w:vAlign w:val="center"/>
+            <w:shd w:fill="EAF6EF"/>
+          </w:tcPr>
+          <w:p>
+            <w:pPr>
+              <w:spacing w:line="259" w:lineRule="auto" w:after="20"/>
+            </w:pPr>
+            <w:r>
+              <w:rPr>
+                <w:rFonts w:ascii="Microsoft YaHei" w:hAnsi="Microsoft YaHei" w:eastAsia="Microsoft YaHei"/>
+                <w:b w:val="0"/>
+                <w:sz w:val="19"/>
+              </w:rPr>
+            </w:r>
+            <w:r>
+              <w:rPr>
+                <w:rFonts w:ascii="Microsoft YaHei" w:hAnsi="Microsoft YaHei" w:eastAsia="Microsoft YaHei"/>
+                <w:b/>
+                <w:color w:val="007046"/>
+                <w:sz w:val="19"/>
+              </w:rPr>
+              <w:t>质量属性</w:t>
+            </w:r>
+          </w:p>
+        </w:tc>
+        <w:tc>
+          <w:tcPr>
+            <w:tcW w:type="dxa" w:w="3249"/>
+            <w:vAlign w:val="center"/>
+            <w:shd w:fill="EAF6EF"/>
+          </w:tcPr>
+          <w:p>
+            <w:pPr>
+              <w:spacing w:line="259" w:lineRule="auto" w:after="20"/>
+            </w:pPr>
+            <w:r>
+              <w:rPr>
+                <w:rFonts w:ascii="Microsoft YaHei" w:hAnsi="Microsoft YaHei" w:eastAsia="Microsoft YaHei"/>
+                <w:b w:val="0"/>
+                <w:sz w:val="19"/>
+              </w:rPr>
+            </w:r>
+            <w:r>
+              <w:rPr>
+                <w:rFonts w:ascii="Microsoft YaHei" w:hAnsi="Microsoft YaHei" w:eastAsia="Microsoft YaHei"/>
+                <w:b/>
+                <w:color w:val="007046"/>
+                <w:sz w:val="19"/>
+              </w:rPr>
+              <w:t>架构响应</w:t>
+            </w:r>
+          </w:p>
+        </w:tc>
+        <w:tc>
+          <w:tcPr>
+            <w:tcW w:type="dxa" w:w="3249"/>
+            <w:vAlign w:val="center"/>
+            <w:shd w:fill="EAF6EF"/>
+          </w:tcPr>
+          <w:p>
+            <w:pPr>
+              <w:spacing w:line="259" w:lineRule="auto" w:after="20"/>
+            </w:pPr>
+            <w:r>
+              <w:rPr>
+                <w:rFonts w:ascii="Microsoft YaHei" w:hAnsi="Microsoft YaHei" w:eastAsia="Microsoft YaHei"/>
+                <w:b w:val="0"/>
+                <w:sz w:val="19"/>
+              </w:rPr>
+            </w:r>
+            <w:r>
+              <w:rPr>
+                <w:rFonts w:ascii="Microsoft YaHei" w:hAnsi="Microsoft YaHei" w:eastAsia="Microsoft YaHei"/>
+                <w:b/>
+                <w:color w:val="007046"/>
+                <w:sz w:val="19"/>
+              </w:rPr>
+              <w:t>验收证据</w:t>
+            </w:r>
+          </w:p>
+        </w:tc>
+      </w:tr>
+      <w:tr>
+        <w:tc>
+          <w:tcPr>
+            <w:tcW w:type="dxa" w:w="3249"/>
+            <w:vAlign w:val="center"/>
+          </w:tcPr>
+          <w:p>
+            <w:pPr>
+              <w:spacing w:line="259" w:lineRule="auto" w:after="20"/>
+            </w:pPr>
+            <w:r>
+              <w:rPr>
+                <w:rFonts w:ascii="Microsoft YaHei" w:hAnsi="Microsoft YaHei" w:eastAsia="Microsoft YaHei"/>
+                <w:b w:val="0"/>
+                <w:sz w:val="19"/>
+              </w:rPr>
+            </w:r>
+            <w:r>
+              <w:rPr>
+                <w:rFonts w:ascii="Microsoft YaHei" w:hAnsi="Microsoft YaHei" w:eastAsia="Microsoft YaHei"/>
+                <w:b w:val="0"/>
+                <w:sz w:val="18"/>
+              </w:rPr>
+              <w:t>性能</w:t>
+            </w:r>
+          </w:p>
+        </w:tc>
+        <w:tc>
+          <w:tcPr>
+            <w:tcW w:type="dxa" w:w="3249"/>
+            <w:vAlign w:val="center"/>
+          </w:tcPr>
+          <w:p>
+            <w:pPr>
+              <w:spacing w:line="259" w:lineRule="auto" w:after="20"/>
+            </w:pPr>
+            <w:r>
+              <w:rPr>
+                <w:rFonts w:ascii="Microsoft YaHei" w:hAnsi="Microsoft YaHei" w:eastAsia="Microsoft YaHei"/>
+                <w:b w:val="0"/>
+                <w:sz w:val="19"/>
+              </w:rPr>
+            </w:r>
+            <w:r>
+              <w:rPr>
+                <w:rFonts w:ascii="Microsoft YaHei" w:hAnsi="Microsoft YaHei" w:eastAsia="Microsoft YaHei"/>
+                <w:b w:val="0"/>
+                <w:sz w:val="18"/>
+              </w:rPr>
+              <w:t>预约服务单独建模，容量锁和幂等键前置，避免支付、通知、报表拖慢提交链路。</w:t>
+            </w:r>
+          </w:p>
+        </w:tc>
+        <w:tc>
+          <w:tcPr>
+            <w:tcW w:type="dxa" w:w="3249"/>
+            <w:vAlign w:val="center"/>
+          </w:tcPr>
+          <w:p>
+            <w:pPr>
+              <w:spacing w:line="259" w:lineRule="auto" w:after="20"/>
+            </w:pPr>
+            <w:r>
+              <w:rPr>
+                <w:rFonts w:ascii="Microsoft YaHei" w:hAnsi="Microsoft YaHei" w:eastAsia="Microsoft YaHei"/>
+                <w:b w:val="0"/>
+                <w:sz w:val="19"/>
+              </w:rPr>
+            </w:r>
+            <w:r>
+              <w:rPr>
+                <w:rFonts w:ascii="Microsoft YaHei" w:hAnsi="Microsoft YaHei" w:eastAsia="Microsoft YaHei"/>
+                <w:b w:val="0"/>
+                <w:sz w:val="18"/>
+              </w:rPr>
+              <w:t>压测记录、P95/P99 指标、409 冲突响应样例。</w:t>
+            </w:r>
+          </w:p>
+        </w:tc>
+      </w:tr>
+      <w:tr>
+        <w:tc>
+          <w:tcPr>
+            <w:tcW w:type="dxa" w:w="3249"/>
+            <w:vAlign w:val="center"/>
+          </w:tcPr>
+          <w:p>
+            <w:pPr>
+              <w:spacing w:line="259" w:lineRule="auto" w:after="20"/>
+            </w:pPr>
+            <w:r>
+              <w:rPr>
+                <w:rFonts w:ascii="Microsoft YaHei" w:hAnsi="Microsoft YaHei" w:eastAsia="Microsoft YaHei"/>
+                <w:b w:val="0"/>
+                <w:sz w:val="19"/>
+              </w:rPr>
+            </w:r>
+            <w:r>
+              <w:rPr>
+                <w:rFonts w:ascii="Microsoft YaHei" w:hAnsi="Microsoft YaHei" w:eastAsia="Microsoft YaHei"/>
+                <w:b w:val="0"/>
+                <w:sz w:val="18"/>
+              </w:rPr>
+              <w:t>可用性</w:t>
+            </w:r>
+          </w:p>
+        </w:tc>
+        <w:tc>
+          <w:tcPr>
+            <w:tcW w:type="dxa" w:w="3249"/>
+            <w:vAlign w:val="center"/>
+          </w:tcPr>
+          <w:p>
+            <w:pPr>
+              <w:spacing w:line="259" w:lineRule="auto" w:after="20"/>
+            </w:pPr>
+            <w:r>
+              <w:rPr>
+                <w:rFonts w:ascii="Microsoft YaHei" w:hAnsi="Microsoft YaHei" w:eastAsia="Microsoft YaHei"/>
+                <w:b w:val="0"/>
+                <w:sz w:val="19"/>
+              </w:rPr>
+            </w:r>
+            <w:r>
+              <w:rPr>
+                <w:rFonts w:ascii="Microsoft YaHei" w:hAnsi="Microsoft YaHei" w:eastAsia="Microsoft YaHei"/>
+                <w:b w:val="0"/>
+                <w:sz w:val="18"/>
+              </w:rPr>
+              <w:t>支付失败可重试，通知异步发送，预约状态机允许补偿和回滚。</w:t>
+            </w:r>
+          </w:p>
+        </w:tc>
+        <w:tc>
+          <w:tcPr>
+            <w:tcW w:type="dxa" w:w="3249"/>
+            <w:vAlign w:val="center"/>
+          </w:tcPr>
+          <w:p>
+            <w:pPr>
+              <w:spacing w:line="259" w:lineRule="auto" w:after="20"/>
+            </w:pPr>
+            <w:r>
+              <w:rPr>
+                <w:rFonts w:ascii="Microsoft YaHei" w:hAnsi="Microsoft YaHei" w:eastAsia="Microsoft YaHei"/>
+                <w:b w:val="0"/>
+                <w:sz w:val="19"/>
+              </w:rPr>
+            </w:r>
+            <w:r>
+              <w:rPr>
+                <w:rFonts w:ascii="Microsoft YaHei" w:hAnsi="Microsoft YaHei" w:eastAsia="Microsoft YaHei"/>
+                <w:b w:val="0"/>
+                <w:sz w:val="18"/>
+              </w:rPr>
+              <w:t>失败重试测试、Outbox 事件记录、异常流程用例。</w:t>
+            </w:r>
+          </w:p>
+        </w:tc>
+      </w:tr>
+      <w:tr>
+        <w:tc>
+          <w:tcPr>
+            <w:tcW w:type="dxa" w:w="3249"/>
+            <w:vAlign w:val="center"/>
+          </w:tcPr>
+          <w:p>
+            <w:pPr>
+              <w:spacing w:line="259" w:lineRule="auto" w:after="20"/>
+            </w:pPr>
+            <w:r>
+              <w:rPr>
+                <w:rFonts w:ascii="Microsoft YaHei" w:hAnsi="Microsoft YaHei" w:eastAsia="Microsoft YaHei"/>
+                <w:b w:val="0"/>
+                <w:sz w:val="19"/>
+              </w:rPr>
+            </w:r>
+            <w:r>
+              <w:rPr>
+                <w:rFonts w:ascii="Microsoft YaHei" w:hAnsi="Microsoft YaHei" w:eastAsia="Microsoft YaHei"/>
+                <w:b w:val="0"/>
+                <w:sz w:val="18"/>
+              </w:rPr>
+              <w:t>安全性</w:t>
+            </w:r>
+          </w:p>
+        </w:tc>
+        <w:tc>
+          <w:tcPr>
+            <w:tcW w:type="dxa" w:w="3249"/>
+            <w:vAlign w:val="center"/>
+          </w:tcPr>
+          <w:p>
+            <w:pPr>
+              <w:spacing w:line="259" w:lineRule="auto" w:after="20"/>
+            </w:pPr>
+            <w:r>
+              <w:rPr>
+                <w:rFonts w:ascii="Microsoft YaHei" w:hAnsi="Microsoft YaHei" w:eastAsia="Microsoft YaHei"/>
+                <w:b w:val="0"/>
+                <w:sz w:val="19"/>
+              </w:rPr>
+            </w:r>
+            <w:r>
+              <w:rPr>
+                <w:rFonts w:ascii="Microsoft YaHei" w:hAnsi="Microsoft YaHei" w:eastAsia="Microsoft YaHei"/>
+                <w:b w:val="0"/>
+                <w:sz w:val="18"/>
+              </w:rPr>
+              <w:t>会员手机号、授权状态和跨境字段默认脱敏；接口调用使用 JWT 与角色权限。</w:t>
+            </w:r>
+          </w:p>
+        </w:tc>
+        <w:tc>
+          <w:tcPr>
+            <w:tcW w:type="dxa" w:w="3249"/>
+            <w:vAlign w:val="center"/>
+          </w:tcPr>
+          <w:p>
+            <w:pPr>
+              <w:spacing w:line="259" w:lineRule="auto" w:after="20"/>
+            </w:pPr>
+            <w:r>
+              <w:rPr>
+                <w:rFonts w:ascii="Microsoft YaHei" w:hAnsi="Microsoft YaHei" w:eastAsia="Microsoft YaHei"/>
+                <w:b w:val="0"/>
+                <w:sz w:val="19"/>
+              </w:rPr>
+            </w:r>
+            <w:r>
+              <w:rPr>
+                <w:rFonts w:ascii="Microsoft YaHei" w:hAnsi="Microsoft YaHei" w:eastAsia="Microsoft YaHei"/>
+                <w:b w:val="0"/>
+                <w:sz w:val="18"/>
+              </w:rPr>
+              <w:t>脱敏字段清单、鉴权失败响应、数据字典 [PII]/[GDPR] 标注。</w:t>
+            </w:r>
+          </w:p>
+        </w:tc>
+      </w:tr>
+      <w:tr>
+        <w:tc>
+          <w:tcPr>
+            <w:tcW w:type="dxa" w:w="3249"/>
+            <w:vAlign w:val="center"/>
+          </w:tcPr>
+          <w:p>
+            <w:pPr>
+              <w:spacing w:line="259" w:lineRule="auto" w:after="20"/>
+            </w:pPr>
+            <w:r>
+              <w:rPr>
+                <w:rFonts w:ascii="Microsoft YaHei" w:hAnsi="Microsoft YaHei" w:eastAsia="Microsoft YaHei"/>
+                <w:b w:val="0"/>
+                <w:sz w:val="19"/>
+              </w:rPr>
+            </w:r>
+            <w:r>
+              <w:rPr>
+                <w:rFonts w:ascii="Microsoft YaHei" w:hAnsi="Microsoft YaHei" w:eastAsia="Microsoft YaHei"/>
+                <w:b w:val="0"/>
+                <w:sz w:val="18"/>
+              </w:rPr>
+              <w:t>可维护性</w:t>
+            </w:r>
+          </w:p>
+        </w:tc>
+        <w:tc>
+          <w:tcPr>
+            <w:tcW w:type="dxa" w:w="3249"/>
+            <w:vAlign w:val="center"/>
+          </w:tcPr>
+          <w:p>
+            <w:pPr>
+              <w:spacing w:line="259" w:lineRule="auto" w:after="20"/>
+            </w:pPr>
+            <w:r>
+              <w:rPr>
+                <w:rFonts w:ascii="Microsoft YaHei" w:hAnsi="Microsoft YaHei" w:eastAsia="Microsoft YaHei"/>
+                <w:b w:val="0"/>
+                <w:sz w:val="19"/>
+              </w:rPr>
+            </w:r>
+            <w:r>
+              <w:rPr>
+                <w:rFonts w:ascii="Microsoft YaHei" w:hAnsi="Microsoft YaHei" w:eastAsia="Microsoft YaHei"/>
+                <w:b w:val="0"/>
+                <w:sz w:val="18"/>
+              </w:rPr>
+              <w:t>按限界上下文拆分服务和接口契约，核心规则沉入聚合而不是散落在页面逻辑中。</w:t>
+            </w:r>
+          </w:p>
+        </w:tc>
+        <w:tc>
+          <w:tcPr>
+            <w:tcW w:type="dxa" w:w="3249"/>
+            <w:vAlign w:val="center"/>
+          </w:tcPr>
+          <w:p>
+            <w:pPr>
+              <w:spacing w:line="259" w:lineRule="auto" w:after="20"/>
+            </w:pPr>
+            <w:r>
+              <w:rPr>
+                <w:rFonts w:ascii="Microsoft YaHei" w:hAnsi="Microsoft YaHei" w:eastAsia="Microsoft YaHei"/>
+                <w:b w:val="0"/>
+                <w:sz w:val="19"/>
+              </w:rPr>
+            </w:r>
+            <w:r>
+              <w:rPr>
+                <w:rFonts w:ascii="Microsoft YaHei" w:hAnsi="Microsoft YaHei" w:eastAsia="Microsoft YaHei"/>
+                <w:b w:val="0"/>
+                <w:sz w:val="18"/>
+              </w:rPr>
+              <w:t>C4 L2/L3 图、OpenAPI 契约、ADR-0002。</w:t>
+            </w:r>
+          </w:p>
+        </w:tc>
+      </w:tr>
+      <w:tr>
+        <w:tc>
+          <w:tcPr>
+            <w:tcW w:type="dxa" w:w="3249"/>
+            <w:vAlign w:val="center"/>
+          </w:tcPr>
+          <w:p>
+            <w:pPr>
+              <w:spacing w:line="259" w:lineRule="auto" w:after="20"/>
+            </w:pPr>
+            <w:r>
+              <w:rPr>
+                <w:rFonts w:ascii="Microsoft YaHei" w:hAnsi="Microsoft YaHei" w:eastAsia="Microsoft YaHei"/>
+                <w:b w:val="0"/>
+                <w:sz w:val="19"/>
+              </w:rPr>
+            </w:r>
+            <w:r>
+              <w:rPr>
+                <w:rFonts w:ascii="Microsoft YaHei" w:hAnsi="Microsoft YaHei" w:eastAsia="Microsoft YaHei"/>
+                <w:b w:val="0"/>
+                <w:sz w:val="18"/>
+              </w:rPr>
+              <w:t>可观测性</w:t>
+            </w:r>
+          </w:p>
+        </w:tc>
+        <w:tc>
+          <w:tcPr>
+            <w:tcW w:type="dxa" w:w="3249"/>
+            <w:vAlign w:val="center"/>
+          </w:tcPr>
+          <w:p>
+            <w:pPr>
+              <w:spacing w:line="259" w:lineRule="auto" w:after="20"/>
+            </w:pPr>
+            <w:r>
+              <w:rPr>
+                <w:rFonts w:ascii="Microsoft YaHei" w:hAnsi="Microsoft YaHei" w:eastAsia="Microsoft YaHei"/>
+                <w:b w:val="0"/>
+                <w:sz w:val="19"/>
+              </w:rPr>
+            </w:r>
+            <w:r>
+              <w:rPr>
+                <w:rFonts w:ascii="Microsoft YaHei" w:hAnsi="Microsoft YaHei" w:eastAsia="Microsoft YaHei"/>
+                <w:b w:val="0"/>
+                <w:sz w:val="18"/>
+              </w:rPr>
+              <w:t>所有关键接口携带 traceId，支付、通知、审计日志可串联一次预约全链路。</w:t>
+            </w:r>
+          </w:p>
+        </w:tc>
+        <w:tc>
+          <w:tcPr>
+            <w:tcW w:type="dxa" w:w="3249"/>
+            <w:vAlign w:val="center"/>
+          </w:tcPr>
+          <w:p>
+            <w:pPr>
+              <w:spacing w:line="259" w:lineRule="auto" w:after="20"/>
+            </w:pPr>
+            <w:r>
+              <w:rPr>
+                <w:rFonts w:ascii="Microsoft YaHei" w:hAnsi="Microsoft YaHei" w:eastAsia="Microsoft YaHei"/>
+                <w:b w:val="0"/>
+                <w:sz w:val="19"/>
+              </w:rPr>
+            </w:r>
+            <w:r>
+              <w:rPr>
+                <w:rFonts w:ascii="Microsoft YaHei" w:hAnsi="Microsoft YaHei" w:eastAsia="Microsoft YaHei"/>
+                <w:b w:val="0"/>
+                <w:sz w:val="18"/>
+              </w:rPr>
+              <w:t>日志样例、告警规则、链路追踪字段。</w:t>
+            </w:r>
+          </w:p>
+        </w:tc>
+      </w:tr>
+    </w:tbl>
+    <w:p>
+      <w:pPr>
+        <w:spacing w:line="269" w:lineRule="auto" w:after="60"/>
       </w:pPr>
     </w:p>
     <w:sectPr>

</xml_diff>